<commit_message>
fix: replace consent form with correct study's v5 (red-line revised)
Previous file was a different study's consent form entirely.

Co-Authored-By: Claude Fable 5 <noreply@anthropic.com>
</commit_message>
<xml_diff>
--- a/experiments/subtitle_experiment/docs/consent_form.docx
+++ b/experiments/subtitle_experiment/docs/consent_form.docx
@@ -1,6 +1,6 @@
 
 <file path=word/document.xml><?xml version="1.0" encoding="utf-8"?>
-<w:document xmlns:wpc="http://schemas.microsoft.com/office/word/2010/wordprocessingCanvas" xmlns:cx="http://schemas.microsoft.com/office/drawing/2014/chartex" xmlns:cx1="http://schemas.microsoft.com/office/drawing/2015/9/8/chartex" xmlns:cx2="http://schemas.microsoft.com/office/drawing/2015/10/21/chartex" xmlns:cx3="http://schemas.microsoft.com/office/drawing/2016/5/9/chartex" xmlns:cx4="http://schemas.microsoft.com/office/drawing/2016/5/10/chartex" xmlns:cx5="http://schemas.microsoft.com/office/drawing/2016/5/11/chartex" xmlns:cx6="http://schemas.microsoft.com/office/drawing/2016/5/12/chartex" xmlns:cx7="http://schemas.microsoft.com/office/drawing/2016/5/13/chartex" xmlns:cx8="http://schemas.microsoft.com/office/drawing/2016/5/14/chartex" xmlns:mc="http://schemas.openxmlformats.org/markup-compatibility/2006" xmlns:aink="http://schemas.microsoft.com/office/drawing/2016/ink" xmlns:am3d="http://schemas.microsoft.com/office/drawing/2017/model3d" xmlns:o="urn:schemas-microsoft-com:office:office" xmlns:oel="http://schemas.microsoft.com/office/2019/extlst" xmlns:r="http://schemas.openxmlformats.org/officeDocument/2006/relationships" xmlns:m="http://schemas.openxmlformats.org/officeDocument/2006/math" xmlns:v="urn:schemas-microsoft-com:vml" xmlns:wp14="http://schemas.microsoft.com/office/word/2010/wordprocessingDrawing" xmlns:wp="http://schemas.openxmlformats.org/drawingml/2006/wordprocessingDrawing" xmlns:w10="urn:schemas-microsoft-com:office:word" xmlns:w="http://schemas.openxmlformats.org/wordprocessingml/2006/main" xmlns:w14="http://schemas.microsoft.com/office/word/2010/wordml" xmlns:w15="http://schemas.microsoft.com/office/word/2012/wordml" xmlns:w16cex="http://schemas.microsoft.com/office/word/2018/wordml/cex" xmlns:w16cid="http://schemas.microsoft.com/office/word/2016/wordml/cid" xmlns:w16="http://schemas.microsoft.com/office/word/2018/wordml" xmlns:w16du="http://schemas.microsoft.com/office/word/2023/wordml/word16du" xmlns:w16sdtdh="http://schemas.microsoft.com/office/word/2020/wordml/sdtdatahash" xmlns:w16sdtfl="http://schemas.microsoft.com/office/word/2024/wordml/sdtformatlock" xmlns:w16se="http://schemas.microsoft.com/office/word/2015/wordml/symex" xmlns:wpg="http://schemas.microsoft.com/office/word/2010/wordprocessingGroup" xmlns:wpi="http://schemas.microsoft.com/office/word/2010/wordprocessingInk" xmlns:wne="http://schemas.microsoft.com/office/word/2006/wordml" xmlns:wps="http://schemas.microsoft.com/office/word/2010/wordprocessingShape" mc:Ignorable="w14 w15 w16se w16cid w16 w16cex w16sdtdh w16sdtfl w16du wp14">
+<w:document xmlns:wpc="http://schemas.microsoft.com/office/word/2010/wordprocessingCanvas" xmlns:cx="http://schemas.microsoft.com/office/drawing/2014/chartex" xmlns:cx1="http://schemas.microsoft.com/office/drawing/2015/9/8/chartex" xmlns:cx2="http://schemas.microsoft.com/office/drawing/2015/10/21/chartex" xmlns:cx3="http://schemas.microsoft.com/office/drawing/2016/5/9/chartex" xmlns:cx4="http://schemas.microsoft.com/office/drawing/2016/5/10/chartex" xmlns:cx5="http://schemas.microsoft.com/office/drawing/2016/5/11/chartex" xmlns:cx6="http://schemas.microsoft.com/office/drawing/2016/5/12/chartex" xmlns:cx7="http://schemas.microsoft.com/office/drawing/2016/5/13/chartex" xmlns:cx8="http://schemas.microsoft.com/office/drawing/2016/5/14/chartex" xmlns:mc="http://schemas.openxmlformats.org/markup-compatibility/2006" xmlns:aink="http://schemas.microsoft.com/office/drawing/2016/ink" xmlns:am3d="http://schemas.microsoft.com/office/drawing/2017/model3d" xmlns:o="urn:schemas-microsoft-com:office:office" xmlns:oel="http://schemas.microsoft.com/office/2019/extlst" xmlns:r="http://schemas.openxmlformats.org/officeDocument/2006/relationships" xmlns:m="http://schemas.openxmlformats.org/officeDocument/2006/math" xmlns:v="urn:schemas-microsoft-com:vml" xmlns:wp14="http://schemas.microsoft.com/office/word/2010/wordprocessingDrawing" xmlns:wp="http://schemas.openxmlformats.org/drawingml/2006/wordprocessingDrawing" xmlns:w10="urn:schemas-microsoft-com:office:word" xmlns:w="http://schemas.openxmlformats.org/wordprocessingml/2006/main" xmlns:w14="http://schemas.microsoft.com/office/word/2010/wordml" xmlns:w15="http://schemas.microsoft.com/office/word/2012/wordml" xmlns:w16cei="http://schemas.microsoft.com/office/word/2026/wordml/cei" xmlns:w16cex="http://schemas.microsoft.com/office/word/2018/wordml/cex" xmlns:w16cid="http://schemas.microsoft.com/office/word/2016/wordml/cid" xmlns:w16="http://schemas.microsoft.com/office/word/2018/wordml" xmlns:w16du="http://schemas.microsoft.com/office/word/2023/wordml/word16du" xmlns:w16sdtdh="http://schemas.microsoft.com/office/word/2020/wordml/sdtdatahash" xmlns:w16sdtfl="http://schemas.microsoft.com/office/word/2024/wordml/sdtformatlock" xmlns:w16se="http://schemas.microsoft.com/office/word/2015/wordml/symex" xmlns:wpg="http://schemas.microsoft.com/office/word/2010/wordprocessingGroup" xmlns:wpi="http://schemas.microsoft.com/office/word/2010/wordprocessingInk" xmlns:wne="http://schemas.microsoft.com/office/word/2006/wordml" xmlns:wps="http://schemas.microsoft.com/office/word/2010/wordprocessingShape" mc:Ignorable="w14 w15 w16se w16cid w16 w16cex w16sdtdh w16sdtfl w16du wp14">
   <w:body>
     <w:tbl>
       <w:tblPr>
@@ -74,6 +74,7 @@
                 <w:rFonts w:ascii="ＭＳ 明朝" w:hAnsi="ＭＳ 明朝"/>
                 <w:sz w:val="22"/>
                 <w:szCs w:val="22"/>
+                <w:u w:val="single"/>
               </w:rPr>
             </w:pPr>
           </w:p>
@@ -91,7 +92,7 @@
                 <w:sz w:val="22"/>
                 <w:szCs w:val="22"/>
               </w:rPr>
-              <w:t xml:space="preserve">　　筑波大学システム情報系長　殿</w:t>
+              <w:t>システム情報系長　殿</w:t>
             </w:r>
           </w:p>
           <w:p>
@@ -100,12 +101,13 @@
                 <w:rFonts w:ascii="ＭＳ 明朝" w:hAnsi="ＭＳ 明朝"/>
                 <w:sz w:val="22"/>
                 <w:szCs w:val="22"/>
+                <w:u w:val="single"/>
               </w:rPr>
             </w:pPr>
           </w:p>
           <w:p>
             <w:pPr>
-              <w:ind w:leftChars="105" w:left="220" w:firstLineChars="100" w:firstLine="220"/>
+              <w:ind w:left="220" w:hangingChars="100" w:hanging="220"/>
               <w:rPr>
                 <w:rFonts w:ascii="ＭＳ 明朝" w:hAnsi="ＭＳ 明朝"/>
                 <w:sz w:val="22"/>
@@ -118,7 +120,23 @@
                 <w:sz w:val="22"/>
                 <w:szCs w:val="22"/>
               </w:rPr>
-              <w:t>私は、「課題名：粒状ジャミングバッグの剛性勾配による擬似傾斜知覚の基礎検討」について、研究の目的、方法、研究対象者の必要性、参加に伴うリスクと安全性、危険回避の方法、個人情報の保護およびデータ管理について十分な説明を受け、理解しました。</w:t>
+              <w:t>私は，「課題名：音声韻律に基づく字幕可視化が非母語聴衆の認知負荷および韻律情報伝達に与える効果の検証」について，研究概要，方法，研究対象者の必要性，研究対象者に対するリスクと安全性，研究に参加する上で想定される危険の回避，</w:t>
+            </w:r>
+            <w:r>
+              <w:rPr>
+                <w:rFonts w:ascii="ＭＳ 明朝" w:hAnsi="ＭＳ 明朝"/>
+                <w:sz w:val="22"/>
+                <w:szCs w:val="22"/>
+              </w:rPr>
+              <w:t>ビデオ録画の有無を含めた</w:t>
+            </w:r>
+            <w:r>
+              <w:rPr>
+                <w:rFonts w:ascii="ＭＳ 明朝" w:hAnsi="ＭＳ 明朝"/>
+                <w:sz w:val="22"/>
+                <w:szCs w:val="22"/>
+              </w:rPr>
+              <w:t>個人情報の保護およびデータ管理について充分な説明を受けました。</w:t>
             </w:r>
           </w:p>
           <w:p>
@@ -132,7 +150,7 @@
             </w:pPr>
             <w:r>
               <w:rPr>
-                <w:rFonts w:ascii="ＭＳ 明朝" w:hAnsi="ＭＳ 明朝"/>
+                <w:rFonts w:ascii="ＭＳ 明朝" w:hAnsi="ＭＳ 明朝" w:hint="eastAsia"/>
                 <w:sz w:val="22"/>
                 <w:szCs w:val="22"/>
               </w:rPr>
@@ -140,7 +158,7 @@
             </w:r>
             <w:r>
               <w:rPr>
-                <w:rFonts w:ascii="ＭＳ 明朝" w:hAnsi="ＭＳ 明朝"/>
+                <w:rFonts w:ascii="ＭＳ 明朝" w:hAnsi="ＭＳ 明朝" w:hint="eastAsia"/>
                 <w:sz w:val="22"/>
                 <w:szCs w:val="22"/>
               </w:rPr>
@@ -148,7 +166,7 @@
             </w:r>
             <w:r>
               <w:rPr>
-                <w:rFonts w:ascii="ＭＳ 明朝" w:hAnsi="ＭＳ 明朝"/>
+                <w:rFonts w:ascii="ＭＳ 明朝" w:hAnsi="ＭＳ 明朝" w:hint="eastAsia"/>
                 <w:sz w:val="22"/>
                 <w:szCs w:val="22"/>
               </w:rPr>
@@ -156,7 +174,7 @@
             </w:r>
             <w:r>
               <w:rPr>
-                <w:rFonts w:ascii="ＭＳ 明朝" w:hAnsi="ＭＳ 明朝"/>
+                <w:rFonts w:ascii="ＭＳ 明朝" w:hAnsi="ＭＳ 明朝" w:hint="eastAsia"/>
                 <w:sz w:val="22"/>
                 <w:szCs w:val="22"/>
               </w:rPr>
@@ -164,7 +182,7 @@
             </w:r>
             <w:r>
               <w:rPr>
-                <w:rFonts w:ascii="ＭＳ 明朝" w:hAnsi="ＭＳ 明朝"/>
+                <w:rFonts w:ascii="ＭＳ 明朝" w:hAnsi="ＭＳ 明朝" w:hint="eastAsia"/>
                 <w:sz w:val="22"/>
                 <w:szCs w:val="22"/>
               </w:rPr>
@@ -172,7 +190,7 @@
             </w:r>
             <w:r>
               <w:rPr>
-                <w:rFonts w:ascii="ＭＳ 明朝" w:hAnsi="ＭＳ 明朝"/>
+                <w:rFonts w:ascii="ＭＳ 明朝" w:hAnsi="ＭＳ 明朝" w:hint="eastAsia"/>
                 <w:sz w:val="22"/>
                 <w:szCs w:val="22"/>
               </w:rPr>
@@ -180,7 +198,7 @@
             </w:r>
             <w:r>
               <w:rPr>
-                <w:rFonts w:ascii="ＭＳ 明朝" w:hAnsi="ＭＳ 明朝"/>
+                <w:rFonts w:ascii="ＭＳ 明朝" w:hAnsi="ＭＳ 明朝" w:hint="eastAsia"/>
                 <w:sz w:val="22"/>
                 <w:szCs w:val="22"/>
               </w:rPr>
@@ -188,7 +206,7 @@
             </w:r>
             <w:r>
               <w:rPr>
-                <w:rFonts w:ascii="ＭＳ 明朝" w:hAnsi="ＭＳ 明朝"/>
+                <w:rFonts w:ascii="ＭＳ 明朝" w:hAnsi="ＭＳ 明朝" w:hint="eastAsia"/>
                 <w:sz w:val="22"/>
                 <w:szCs w:val="22"/>
               </w:rPr>
@@ -196,7 +214,7 @@
             </w:r>
             <w:r>
               <w:rPr>
-                <w:rFonts w:ascii="ＭＳ 明朝" w:hAnsi="ＭＳ 明朝"/>
+                <w:rFonts w:ascii="ＭＳ 明朝" w:hAnsi="ＭＳ 明朝" w:hint="eastAsia"/>
                 <w:sz w:val="22"/>
                 <w:szCs w:val="22"/>
               </w:rPr>
@@ -204,7 +222,7 @@
             </w:r>
             <w:r>
               <w:rPr>
-                <w:rFonts w:ascii="ＭＳ 明朝" w:hAnsi="ＭＳ 明朝"/>
+                <w:rFonts w:ascii="ＭＳ 明朝" w:hAnsi="ＭＳ 明朝" w:hint="eastAsia"/>
                 <w:sz w:val="22"/>
                 <w:szCs w:val="22"/>
               </w:rPr>
@@ -212,7 +230,7 @@
             </w:r>
             <w:r>
               <w:rPr>
-                <w:rFonts w:ascii="ＭＳ 明朝" w:hAnsi="ＭＳ 明朝"/>
+                <w:rFonts w:ascii="ＭＳ 明朝" w:hAnsi="ＭＳ 明朝" w:hint="eastAsia"/>
                 <w:sz w:val="22"/>
                 <w:szCs w:val="22"/>
               </w:rPr>
@@ -220,7 +238,7 @@
             </w:r>
             <w:r>
               <w:rPr>
-                <w:rFonts w:ascii="ＭＳ 明朝" w:hAnsi="ＭＳ 明朝"/>
+                <w:rFonts w:ascii="ＭＳ 明朝" w:hAnsi="ＭＳ 明朝" w:hint="eastAsia"/>
                 <w:sz w:val="22"/>
                 <w:szCs w:val="22"/>
               </w:rPr>
@@ -228,7 +246,7 @@
             </w:r>
             <w:r>
               <w:rPr>
-                <w:rFonts w:ascii="ＭＳ 明朝" w:hAnsi="ＭＳ 明朝"/>
+                <w:rFonts w:ascii="ＭＳ 明朝" w:hAnsi="ＭＳ 明朝" w:hint="eastAsia"/>
                 <w:sz w:val="22"/>
                 <w:szCs w:val="22"/>
               </w:rPr>
@@ -236,7 +254,7 @@
             </w:r>
             <w:r>
               <w:rPr>
-                <w:rFonts w:ascii="ＭＳ 明朝" w:hAnsi="ＭＳ 明朝"/>
+                <w:rFonts w:ascii="ＭＳ 明朝" w:hAnsi="ＭＳ 明朝" w:hint="eastAsia"/>
                 <w:sz w:val="22"/>
                 <w:szCs w:val="22"/>
               </w:rPr>
@@ -244,7 +262,7 @@
             </w:r>
             <w:r>
               <w:rPr>
-                <w:rFonts w:ascii="ＭＳ 明朝" w:hAnsi="ＭＳ 明朝"/>
+                <w:rFonts w:ascii="ＭＳ 明朝" w:hAnsi="ＭＳ 明朝" w:hint="eastAsia"/>
                 <w:sz w:val="22"/>
                 <w:szCs w:val="22"/>
               </w:rPr>
@@ -252,7 +270,7 @@
             </w:r>
             <w:r>
               <w:rPr>
-                <w:rFonts w:ascii="ＭＳ 明朝" w:hAnsi="ＭＳ 明朝"/>
+                <w:rFonts w:ascii="ＭＳ 明朝" w:hAnsi="ＭＳ 明朝" w:hint="eastAsia"/>
                 <w:sz w:val="22"/>
                 <w:szCs w:val="22"/>
               </w:rPr>
@@ -260,7 +278,7 @@
             </w:r>
             <w:r>
               <w:rPr>
-                <w:rFonts w:ascii="ＭＳ 明朝" w:hAnsi="ＭＳ 明朝"/>
+                <w:rFonts w:ascii="ＭＳ 明朝" w:hAnsi="ＭＳ 明朝" w:hint="eastAsia"/>
                 <w:sz w:val="22"/>
                 <w:szCs w:val="22"/>
               </w:rPr>
@@ -268,7 +286,7 @@
             </w:r>
             <w:r>
               <w:rPr>
-                <w:rFonts w:ascii="ＭＳ 明朝" w:hAnsi="ＭＳ 明朝"/>
+                <w:rFonts w:ascii="ＭＳ 明朝" w:hAnsi="ＭＳ 明朝" w:hint="eastAsia"/>
                 <w:sz w:val="22"/>
                 <w:szCs w:val="22"/>
               </w:rPr>
@@ -276,7 +294,7 @@
             </w:r>
             <w:r>
               <w:rPr>
-                <w:rFonts w:ascii="ＭＳ 明朝" w:hAnsi="ＭＳ 明朝"/>
+                <w:rFonts w:ascii="ＭＳ 明朝" w:hAnsi="ＭＳ 明朝" w:hint="eastAsia"/>
                 <w:sz w:val="22"/>
                 <w:szCs w:val="22"/>
               </w:rPr>
@@ -284,7 +302,7 @@
             </w:r>
             <w:r>
               <w:rPr>
-                <w:rFonts w:ascii="ＭＳ 明朝" w:hAnsi="ＭＳ 明朝"/>
+                <w:rFonts w:ascii="ＭＳ 明朝" w:hAnsi="ＭＳ 明朝" w:hint="eastAsia"/>
                 <w:sz w:val="22"/>
                 <w:szCs w:val="22"/>
               </w:rPr>
@@ -292,7 +310,7 @@
             </w:r>
             <w:r>
               <w:rPr>
-                <w:rFonts w:ascii="ＭＳ 明朝" w:hAnsi="ＭＳ 明朝"/>
+                <w:rFonts w:ascii="ＭＳ 明朝" w:hAnsi="ＭＳ 明朝" w:hint="eastAsia"/>
                 <w:sz w:val="22"/>
                 <w:szCs w:val="22"/>
               </w:rPr>
@@ -300,7 +318,7 @@
             </w:r>
             <w:r>
               <w:rPr>
-                <w:rFonts w:ascii="ＭＳ 明朝" w:hAnsi="ＭＳ 明朝"/>
+                <w:rFonts w:ascii="ＭＳ 明朝" w:hAnsi="ＭＳ 明朝" w:hint="eastAsia"/>
                 <w:sz w:val="22"/>
                 <w:szCs w:val="22"/>
               </w:rPr>
@@ -308,7 +326,7 @@
             </w:r>
             <w:r>
               <w:rPr>
-                <w:rFonts w:ascii="ＭＳ 明朝" w:hAnsi="ＭＳ 明朝"/>
+                <w:rFonts w:ascii="ＭＳ 明朝" w:hAnsi="ＭＳ 明朝" w:hint="eastAsia"/>
                 <w:sz w:val="22"/>
                 <w:szCs w:val="22"/>
               </w:rPr>
@@ -316,7 +334,7 @@
             </w:r>
             <w:r>
               <w:rPr>
-                <w:rFonts w:ascii="ＭＳ 明朝" w:hAnsi="ＭＳ 明朝"/>
+                <w:rFonts w:ascii="ＭＳ 明朝" w:hAnsi="ＭＳ 明朝" w:hint="eastAsia"/>
                 <w:sz w:val="22"/>
                 <w:szCs w:val="22"/>
               </w:rPr>
@@ -324,7 +342,7 @@
             </w:r>
             <w:r>
               <w:rPr>
-                <w:rFonts w:ascii="ＭＳ 明朝" w:hAnsi="ＭＳ 明朝"/>
+                <w:rFonts w:ascii="ＭＳ 明朝" w:hAnsi="ＭＳ 明朝" w:hint="eastAsia"/>
                 <w:sz w:val="22"/>
                 <w:szCs w:val="22"/>
               </w:rPr>
@@ -348,6 +366,7 @@
                 <w:rFonts w:ascii="ＭＳ 明朝" w:hAnsi="ＭＳ 明朝"/>
                 <w:sz w:val="22"/>
                 <w:szCs w:val="22"/>
+                <w:u w:val="single"/>
               </w:rPr>
             </w:pPr>
             <w:r>
@@ -355,6 +374,7 @@
                 <w:rFonts w:ascii="ＭＳ 明朝" w:hAnsi="ＭＳ 明朝" w:hint="eastAsia"/>
                 <w:sz w:val="22"/>
                 <w:szCs w:val="22"/>
+                <w:u w:val="single"/>
               </w:rPr>
               <w:t>令和</w:t>
             </w:r>
@@ -363,6 +383,7 @@
                 <w:rFonts w:ascii="ＭＳ 明朝" w:hAnsi="ＭＳ 明朝" w:hint="eastAsia"/>
                 <w:sz w:val="22"/>
                 <w:szCs w:val="22"/>
+                <w:u w:val="single"/>
               </w:rPr>
               <w:t xml:space="preserve">　　年　　月　　日</w:t>
             </w:r>
@@ -372,6 +393,7 @@
               <w:ind w:firstLineChars="100" w:firstLine="220"/>
               <w:rPr>
                 <w:rFonts w:ascii="ＭＳ 明朝" w:hAnsi="ＭＳ 明朝"/>
+                <w:color w:val="000000" w:themeColor="text1"/>
                 <w:sz w:val="22"/>
                 <w:szCs w:val="22"/>
               </w:rPr>
@@ -382,13 +404,23 @@
                 <w:sz w:val="22"/>
                 <w:szCs w:val="22"/>
               </w:rPr>
-              <w:t xml:space="preserve">　　　　　　　　　　　　　　　　　　　 　　氏　名    　      </w:t>
+              <w:t xml:space="preserve">　　　　　　　　　　　　　　　　　　　 　　</w:t>
             </w:r>
             <w:r>
               <w:rPr>
                 <w:rFonts w:ascii="ＭＳ 明朝" w:hAnsi="ＭＳ 明朝" w:hint="eastAsia"/>
                 <w:sz w:val="22"/>
                 <w:szCs w:val="22"/>
+                <w:u w:val="single"/>
+              </w:rPr>
+              <w:t xml:space="preserve">氏　名    　      </w:t>
+            </w:r>
+            <w:r>
+              <w:rPr>
+                <w:rFonts w:ascii="ＭＳ 明朝" w:hAnsi="ＭＳ 明朝" w:hint="eastAsia"/>
+                <w:sz w:val="22"/>
+                <w:szCs w:val="22"/>
+                <w:u w:val="single"/>
               </w:rPr>
               <w:t xml:space="preserve">　　　</w:t>
             </w:r>
@@ -397,6 +429,7 @@
                 <w:rFonts w:ascii="ＭＳ 明朝" w:hAnsi="ＭＳ 明朝" w:hint="eastAsia"/>
                 <w:sz w:val="22"/>
                 <w:szCs w:val="22"/>
+                <w:u w:val="single"/>
               </w:rPr>
               <w:t xml:space="preserve">  </w:t>
             </w:r>
@@ -405,6 +438,7 @@
                 <w:rFonts w:ascii="ＭＳ 明朝" w:hAnsi="ＭＳ 明朝" w:hint="eastAsia"/>
                 <w:sz w:val="22"/>
                 <w:szCs w:val="22"/>
+                <w:u w:val="single"/>
               </w:rPr>
               <w:t xml:space="preserve">　</w:t>
             </w:r>
@@ -413,12 +447,14 @@
                 <w:rFonts w:ascii="ＭＳ 明朝" w:hAnsi="ＭＳ 明朝" w:hint="eastAsia"/>
                 <w:sz w:val="22"/>
                 <w:szCs w:val="22"/>
+                <w:u w:val="single"/>
               </w:rPr>
               <w:t>（署名）</w:t>
             </w:r>
             <w:r>
               <w:rPr>
                 <w:rFonts w:ascii="ＭＳ 明朝" w:hAnsi="ＭＳ 明朝" w:hint="eastAsia"/>
+                <w:color w:val="000000" w:themeColor="text1"/>
                 <w:sz w:val="22"/>
                 <w:szCs w:val="22"/>
               </w:rPr>
@@ -427,6 +463,7 @@
             <w:r>
               <w:rPr>
                 <w:rFonts w:ascii="ＭＳ 明朝" w:hAnsi="ＭＳ 明朝"/>
+                <w:color w:val="000000" w:themeColor="text1"/>
                 <w:sz w:val="22"/>
                 <w:szCs w:val="22"/>
               </w:rPr>
@@ -437,6 +474,7 @@
             <w:pPr>
               <w:rPr>
                 <w:rFonts w:ascii="ＭＳ 明朝" w:hAnsi="ＭＳ 明朝"/>
+                <w:color w:val="000000" w:themeColor="text1"/>
                 <w:sz w:val="18"/>
                 <w:szCs w:val="18"/>
               </w:rPr>
@@ -446,6 +484,7 @@
             <w:pPr>
               <w:rPr>
                 <w:rFonts w:ascii="ＭＳ 明朝" w:hAnsi="ＭＳ 明朝"/>
+                <w:color w:val="000000" w:themeColor="text1"/>
                 <w:sz w:val="18"/>
                 <w:szCs w:val="18"/>
               </w:rPr>
@@ -455,6 +494,7 @@
             <w:pPr>
               <w:rPr>
                 <w:rFonts w:ascii="ＭＳ 明朝" w:hAnsi="ＭＳ 明朝"/>
+                <w:color w:val="000000" w:themeColor="text1"/>
                 <w:sz w:val="18"/>
                 <w:szCs w:val="18"/>
               </w:rPr>
@@ -488,122 +528,12 @@
             </w:pPr>
             <w:r>
               <w:rPr>
-                <w:rFonts w:ascii="ＭＳ 明朝" w:hAnsi="ＭＳ 明朝"/>
+                <w:rFonts w:ascii="ＭＳ 明朝" w:hAnsi="ＭＳ 明朝" w:hint="eastAsia"/>
+                <w:color w:val="000000" w:themeColor="text1"/>
                 <w:sz w:val="22"/>
                 <w:szCs w:val="22"/>
               </w:rPr>
-              <w:t>「課題名：粒状ジャミングバッグの剛性勾配による擬似傾斜知覚の基礎検討」</w:t>
-            </w:r>
-            <w:r>
-              <w:rPr>
-                <w:sz w:val="22"/>
-                <w:szCs w:val="22"/>
-              </w:rPr>
-              <w:t>の研究に</w:t>
-            </w:r>
-            <w:r>
-              <w:rPr>
-                <w:rFonts w:ascii="ＭＳ 明朝" w:hAnsi="ＭＳ 明朝"/>
-                <w:sz w:val="22"/>
-                <w:szCs w:val="22"/>
-              </w:rPr>
-              <w:t>ついて</w:t>
-            </w:r>
-            <w:r>
-              <w:rPr>
-                <w:rFonts w:ascii="ＭＳ 明朝" w:hAnsi="ＭＳ 明朝"/>
-                <w:sz w:val="22"/>
-                <w:szCs w:val="22"/>
-              </w:rPr>
-              <w:t>，</w:t>
-            </w:r>
-            <w:r>
-              <w:rPr>
-                <w:rFonts w:ascii="ＭＳ 明朝" w:hAnsi="ＭＳ 明朝"/>
-                <w:sz w:val="22"/>
-                <w:szCs w:val="22"/>
-              </w:rPr>
-              <w:t>次の内容について</w:t>
-            </w:r>
-            <w:r>
-              <w:rPr>
-                <w:rFonts w:ascii="ＭＳ 明朝" w:hAnsi="ＭＳ 明朝"/>
-                <w:sz w:val="22"/>
-                <w:szCs w:val="22"/>
-              </w:rPr>
-              <w:t>令和</w:t>
-            </w:r>
-            <w:r>
-              <w:rPr>
-                <w:rFonts w:ascii="ＭＳ 明朝" w:hAnsi="ＭＳ 明朝"/>
-                <w:sz w:val="22"/>
-                <w:szCs w:val="22"/>
-              </w:rPr>
-              <w:t xml:space="preserve">　</w:t>
-            </w:r>
-            <w:r>
-              <w:rPr>
-                <w:rFonts w:ascii="ＭＳ 明朝" w:hAnsi="ＭＳ 明朝"/>
-                <w:sz w:val="22"/>
-                <w:szCs w:val="22"/>
-              </w:rPr>
-              <w:t xml:space="preserve">　</w:t>
-            </w:r>
-            <w:r>
-              <w:rPr>
-                <w:rFonts w:ascii="ＭＳ 明朝" w:hAnsi="ＭＳ 明朝"/>
-                <w:sz w:val="22"/>
-                <w:szCs w:val="22"/>
-              </w:rPr>
-              <w:t xml:space="preserve">年　</w:t>
-            </w:r>
-            <w:r>
-              <w:rPr>
-                <w:rFonts w:ascii="ＭＳ 明朝" w:hAnsi="ＭＳ 明朝"/>
-                <w:sz w:val="22"/>
-                <w:szCs w:val="22"/>
-              </w:rPr>
-              <w:t xml:space="preserve">　</w:t>
-            </w:r>
-            <w:r>
-              <w:rPr>
-                <w:rFonts w:ascii="ＭＳ 明朝" w:hAnsi="ＭＳ 明朝"/>
-                <w:sz w:val="22"/>
-                <w:szCs w:val="22"/>
-              </w:rPr>
-              <w:t xml:space="preserve">月　</w:t>
-            </w:r>
-            <w:r>
-              <w:rPr>
-                <w:rFonts w:ascii="ＭＳ 明朝" w:hAnsi="ＭＳ 明朝"/>
-                <w:sz w:val="22"/>
-                <w:szCs w:val="22"/>
-              </w:rPr>
-              <w:t xml:space="preserve">　</w:t>
-            </w:r>
-            <w:r>
-              <w:rPr>
-                <w:rFonts w:ascii="ＭＳ 明朝" w:hAnsi="ＭＳ 明朝"/>
-                <w:sz w:val="22"/>
-                <w:szCs w:val="22"/>
-              </w:rPr>
-              <w:t>日に説明を行い</w:t>
-            </w:r>
-            <w:r>
-              <w:rPr>
-                <w:rFonts w:ascii="ＭＳ 明朝" w:hAnsi="ＭＳ 明朝"/>
-                <w:sz w:val="22"/>
-                <w:szCs w:val="22"/>
-              </w:rPr>
-              <w:t>，</w:t>
-            </w:r>
-            <w:r>
-              <w:rPr>
-                <w:rFonts w:ascii="ＭＳ 明朝" w:hAnsi="ＭＳ 明朝"/>
-                <w:sz w:val="22"/>
-                <w:szCs w:val="22"/>
-              </w:rPr>
-              <w:t>上記のとおり同意を得ました。</w:t>
+              <w:t>「課題名：音声韻律に基づく字幕可視化が非母語聴衆の認知負荷および韻律情報伝達に与える効果の検証」の研究について，次の内容について令和　　年　　月　　日に説明を行い，上記のとおり同意を得ました。</w:t>
             </w:r>
           </w:p>
           <w:p>
@@ -623,6 +553,7 @@
                 <w:rFonts w:ascii="ＭＳ 明朝" w:hAnsi="ＭＳ 明朝"/>
                 <w:sz w:val="22"/>
                 <w:szCs w:val="22"/>
+                <w:u w:val="single"/>
               </w:rPr>
             </w:pPr>
             <w:r>
@@ -631,55 +562,7 @@
                 <w:sz w:val="22"/>
                 <w:szCs w:val="22"/>
               </w:rPr>
-              <w:t xml:space="preserve">　　　　　　　　　　　　　　　　　</w:t>
-            </w:r>
-            <w:r>
-              <w:rPr>
-                <w:rFonts w:ascii="ＭＳ 明朝" w:hAnsi="ＭＳ 明朝" w:hint="eastAsia"/>
-                <w:sz w:val="22"/>
-                <w:szCs w:val="22"/>
-              </w:rPr>
-              <w:t>実施責任者</w:t>
-            </w:r>
-            <w:r>
-              <w:rPr>
-                <w:rFonts w:ascii="ＭＳ 明朝" w:hAnsi="ＭＳ 明朝" w:hint="eastAsia"/>
-                <w:sz w:val="22"/>
-                <w:szCs w:val="22"/>
-              </w:rPr>
-              <w:t xml:space="preserve">　所　属  </w:t>
-            </w:r>
-            <w:r>
-              <w:rPr>
-                <w:rFonts w:hint="eastAsia"/>
-                <w:sz w:val="22"/>
-                <w:szCs w:val="22"/>
-              </w:rPr>
-              <w:t>筑波大学</w:t>
-            </w:r>
-            <w:r>
-              <w:rPr>
-                <w:rFonts w:ascii="ＭＳ 明朝" w:hAnsi="ＭＳ 明朝" w:hint="eastAsia"/>
-                <w:sz w:val="22"/>
-                <w:szCs w:val="22"/>
-              </w:rPr>
-              <w:t xml:space="preserve">   </w:t>
-            </w:r>
-            <w:r>
-              <w:rPr>
-                <w:rFonts w:ascii="ＭＳ 明朝" w:hAnsi="ＭＳ 明朝" w:hint="eastAsia"/>
-                <w:sz w:val="22"/>
-                <w:szCs w:val="22"/>
-              </w:rPr>
-              <w:t>システム情報系</w:t>
-            </w:r>
-            <w:r>
-              <w:rPr>
-                <w:rFonts w:ascii="ＭＳ 明朝" w:hAnsi="ＭＳ 明朝" w:hint="eastAsia"/>
-                <w:sz w:val="22"/>
-                <w:szCs w:val="22"/>
-              </w:rPr>
-              <w:t xml:space="preserve">   </w:t>
+              <w:t>実施責任者　所　属  筑波大学 システム情報系</w:t>
             </w:r>
           </w:p>
           <w:p>
@@ -689,6 +572,7 @@
                 <w:rFonts w:ascii="ＭＳ 明朝" w:hAnsi="ＭＳ 明朝"/>
                 <w:sz w:val="22"/>
                 <w:szCs w:val="22"/>
+                <w:u w:val="single"/>
               </w:rPr>
             </w:pPr>
           </w:p>
@@ -699,6 +583,7 @@
                 <w:rFonts w:ascii="ＭＳ 明朝" w:hAnsi="ＭＳ 明朝"/>
                 <w:sz w:val="22"/>
                 <w:szCs w:val="22"/>
+                <w:u w:val="single"/>
               </w:rPr>
             </w:pPr>
           </w:p>
@@ -707,7 +592,8 @@
               <w:ind w:leftChars="300" w:left="630" w:firstLineChars="394" w:firstLine="867"/>
               <w:rPr>
                 <w:rFonts w:ascii="ＭＳ 明朝" w:hAnsi="ＭＳ 明朝"/>
-                <w:szCs w:val="21"/>
+                <w:sz w:val="22"/>
+                <w:szCs w:val="22"/>
               </w:rPr>
             </w:pPr>
             <w:r>
@@ -716,88 +602,18 @@
                 <w:sz w:val="22"/>
                 <w:szCs w:val="22"/>
               </w:rPr>
-              <w:t xml:space="preserve">　　　　　　　　　　　　　　　　　</w:t>
+              <w:t>氏　名   善甫 啓一  （署名又は記名押印）</w:t>
             </w:r>
-            <w:r>
-              <w:rPr>
-                <w:rFonts w:ascii="ＭＳ 明朝" w:hAnsi="ＭＳ 明朝" w:hint="eastAsia"/>
-                <w:sz w:val="22"/>
-                <w:szCs w:val="22"/>
-              </w:rPr>
-              <w:t xml:space="preserve">氏　名   </w:t>
-            </w:r>
-            <w:r>
-              <w:rPr>
-                <w:rFonts w:ascii="ＭＳ 明朝" w:hAnsi="ＭＳ 明朝" w:hint="eastAsia"/>
-                <w:sz w:val="22"/>
-                <w:szCs w:val="22"/>
-              </w:rPr>
-              <w:t>善甫</w:t>
-            </w:r>
-            <w:r>
+          </w:p>
+          <w:p>
+            <w:pPr>
+              <w:ind w:leftChars="300" w:left="630" w:firstLineChars="394" w:firstLine="827"/>
               <w:rPr>
                 <w:rFonts w:ascii="ＭＳ 明朝" w:hAnsi="ＭＳ 明朝"/>
-                <w:sz w:val="22"/>
-                <w:szCs w:val="22"/>
-              </w:rPr>
-              <w:t xml:space="preserve"> </w:t>
-            </w:r>
-            <w:r>
-              <w:rPr>
-                <w:rFonts w:ascii="ＭＳ 明朝" w:hAnsi="ＭＳ 明朝" w:hint="eastAsia"/>
-                <w:sz w:val="22"/>
-                <w:szCs w:val="22"/>
-              </w:rPr>
-              <w:t>啓一</w:t>
-            </w:r>
-            <w:r>
-              <w:rPr>
-                <w:rFonts w:ascii="ＭＳ 明朝" w:hAnsi="ＭＳ 明朝" w:hint="eastAsia"/>
-                <w:sz w:val="22"/>
-                <w:szCs w:val="22"/>
-              </w:rPr>
-              <w:t xml:space="preserve">  </w:t>
-            </w:r>
-            <w:r>
-              <w:rPr>
-                <w:rFonts w:ascii="ＭＳ 明朝" w:hAnsi="ＭＳ 明朝" w:hint="eastAsia"/>
-                <w:sz w:val="22"/>
-                <w:szCs w:val="22"/>
-              </w:rPr>
-              <w:t>（</w:t>
-            </w:r>
-            <w:r>
-              <w:rPr>
-                <w:rFonts w:ascii="ＭＳ 明朝" w:hAnsi="ＭＳ 明朝" w:hint="eastAsia"/>
-                <w:sz w:val="22"/>
-                <w:szCs w:val="22"/>
-              </w:rPr>
-              <w:t>署名又</w:t>
-            </w:r>
-            <w:r>
-              <w:rPr>
-                <w:rFonts w:ascii="ＭＳ 明朝" w:hAnsi="ＭＳ 明朝" w:hint="eastAsia"/>
-                <w:sz w:val="22"/>
-                <w:szCs w:val="22"/>
-              </w:rPr>
-              <w:t>は</w:t>
-            </w:r>
-            <w:r>
-              <w:rPr>
-                <w:rFonts w:ascii="ＭＳ 明朝" w:hAnsi="ＭＳ 明朝" w:hint="eastAsia"/>
-                <w:sz w:val="22"/>
-                <w:szCs w:val="22"/>
-              </w:rPr>
-              <w:t>記名押印</w:t>
-            </w:r>
-            <w:r>
-              <w:rPr>
-                <w:rFonts w:ascii="ＭＳ 明朝" w:hAnsi="ＭＳ 明朝" w:hint="eastAsia"/>
-                <w:sz w:val="22"/>
-                <w:szCs w:val="22"/>
-              </w:rPr>
-              <w:t>）</w:t>
-            </w:r>
+                <w:color w:val="0070C0"/>
+                <w:szCs w:val="21"/>
+              </w:rPr>
+            </w:pPr>
           </w:p>
         </w:tc>
       </w:tr>
@@ -825,201 +641,130 @@
           <w:sz w:val="22"/>
           <w:szCs w:val="22"/>
         </w:rPr>
-        <w:t>データ提供の</w:t>
-      </w:r>
+        <w:t>データ提供の同意撤回の期限は同意書署名の日から90日後までとさせて頂きます。</w:t>
+      </w:r>
+    </w:p>
+    <w:p>
+      <w:pPr>
+        <w:ind w:leftChars="-127" w:left="-2" w:hangingChars="126" w:hanging="265"/>
+        <w:rPr>
+          <w:rFonts w:ascii="ＭＳ 明朝" w:hAnsi="ＭＳ 明朝"/>
+          <w:color w:val="FF0000"/>
+          <w:szCs w:val="21"/>
+        </w:rPr>
+      </w:pPr>
+    </w:p>
+    <w:p>
+      <w:pPr>
+        <w:ind w:leftChars="-127" w:left="-2" w:hangingChars="126" w:hanging="265"/>
+        <w:rPr>
+          <w:rFonts w:ascii="ＭＳ 明朝" w:hAnsi="ＭＳ 明朝"/>
+          <w:szCs w:val="21"/>
+        </w:rPr>
+      </w:pPr>
       <w:r>
         <w:rPr>
           <w:rFonts w:ascii="ＭＳ 明朝" w:hAnsi="ＭＳ 明朝" w:hint="eastAsia"/>
           <w:szCs w:val="21"/>
         </w:rPr>
-        <w:t>同意撤回</w:t>
+        <w:t>研究や実験に協力した結果</w:t>
       </w:r>
       <w:r>
         <w:rPr>
           <w:rFonts w:ascii="ＭＳ 明朝" w:hAnsi="ＭＳ 明朝" w:hint="eastAsia"/>
           <w:szCs w:val="21"/>
         </w:rPr>
-        <w:t>の期限は同意書署名の日から</w:t>
-      </w:r>
-      <w:r>
-        <w:rPr>
-          <w:rFonts w:ascii="ＭＳ 明朝" w:hAnsi="ＭＳ 明朝"/>
-          <w:szCs w:val="21"/>
-        </w:rPr>
-        <w:t>90</w:t>
+        <w:t>，</w:t>
       </w:r>
       <w:r>
         <w:rPr>
           <w:rFonts w:ascii="ＭＳ 明朝" w:hAnsi="ＭＳ 明朝" w:hint="eastAsia"/>
           <w:szCs w:val="21"/>
         </w:rPr>
-        <w:t>日</w:t>
-      </w:r>
-      <w:r>
-        <w:rPr>
-          <w:rFonts w:ascii="ＭＳ 明朝" w:hAnsi="ＭＳ 明朝" w:hint="eastAsia"/>
-          <w:szCs w:val="21"/>
-        </w:rPr>
-        <w:t>後まで</w:t>
-      </w:r>
-      <w:r>
-        <w:rPr>
-          <w:rFonts w:ascii="ＭＳ 明朝" w:hAnsi="ＭＳ 明朝" w:hint="eastAsia"/>
-          <w:szCs w:val="21"/>
-        </w:rPr>
-        <w:t>とさせて</w:t>
-      </w:r>
-      <w:r>
-        <w:rPr>
-          <w:rFonts w:ascii="ＭＳ 明朝" w:hAnsi="ＭＳ 明朝" w:hint="eastAsia"/>
-          <w:szCs w:val="21"/>
-        </w:rPr>
-        <w:t>頂きます</w:t>
-      </w:r>
-      <w:r>
-        <w:rPr>
-          <w:rFonts w:ascii="ＭＳ 明朝" w:hAnsi="ＭＳ 明朝" w:hint="eastAsia"/>
-          <w:szCs w:val="21"/>
-        </w:rPr>
-        <w:t>。</w:t>
-      </w:r>
-    </w:p>
-    <w:p>
-      <w:pPr>
-        <w:ind w:leftChars="-127" w:left="-2" w:hangingChars="126" w:hanging="265"/>
-        <w:rPr>
-          <w:rFonts w:ascii="ＭＳ 明朝" w:hAnsi="ＭＳ 明朝"/>
-          <w:szCs w:val="21"/>
-        </w:rPr>
-      </w:pPr>
-    </w:p>
-    <w:p>
-      <w:pPr>
-        <w:ind w:leftChars="-127" w:left="-2" w:hangingChars="126" w:hanging="265"/>
-        <w:rPr>
-          <w:rFonts w:ascii="ＭＳ 明朝" w:hAnsi="ＭＳ 明朝"/>
-          <w:szCs w:val="21"/>
-        </w:rPr>
-      </w:pPr>
-      <w:r>
-        <w:rPr>
-          <w:rFonts w:ascii="ＭＳ 明朝" w:hAnsi="ＭＳ 明朝" w:hint="eastAsia"/>
-          <w:szCs w:val="21"/>
-        </w:rPr>
-        <w:t>研究や実験に協力した結果</w:t>
-      </w:r>
-      <w:r>
-        <w:rPr>
-          <w:rFonts w:ascii="ＭＳ 明朝" w:hAnsi="ＭＳ 明朝" w:hint="eastAsia"/>
-          <w:szCs w:val="21"/>
-        </w:rPr>
-        <w:t>，</w:t>
-      </w:r>
-      <w:r>
-        <w:rPr>
-          <w:rFonts w:ascii="ＭＳ 明朝" w:hAnsi="ＭＳ 明朝" w:hint="eastAsia"/>
-          <w:szCs w:val="21"/>
-        </w:rPr>
         <w:t>不都合があった場合の連絡先</w:t>
       </w:r>
     </w:p>
     <w:p>
       <w:pPr>
         <w:ind w:leftChars="-14" w:left="-29" w:firstLineChars="20" w:firstLine="42"/>
-      </w:pPr>
-      <w:r>
-        <w:t>実施分担者　（所属：</w:t>
-      </w:r>
-      <w:r>
-        <w:t>筑波大学情報学群情報メディア創成学類</w:t>
-      </w:r>
-      <w:r>
-        <w:rPr>
-          <w:rFonts w:hint="eastAsia"/>
-        </w:rPr>
-        <w:t>2</w:t>
-      </w:r>
-      <w:r>
-        <w:t>年）</w:t>
-      </w:r>
-      <w:r>
+        <w:rPr>
+          <w:szCs w:val="21"/>
+        </w:rPr>
+      </w:pPr>
+      <w:r>
+        <w:rPr>
+          <w:szCs w:val="21"/>
+        </w:rPr>
+        <w:t>実施分担者　（所属：筑波大学</w:t>
+      </w:r>
+      <w:r>
+        <w:rPr>
+          <w:rFonts w:hint="eastAsia"/>
+          <w:szCs w:val="21"/>
+        </w:rPr>
+        <w:t>情報学群情報メディア創成学類</w:t>
+      </w:r>
+      <w:r>
+        <w:rPr>
+          <w:szCs w:val="21"/>
+        </w:rPr>
         <w:br/>
       </w:r>
       <w:r>
-        <w:t xml:space="preserve">　　　　　　　</w:t>
-      </w:r>
-      <w:r>
-        <w:t>氏名：</w:t>
-      </w:r>
-      <w:r>
+        <w:rPr>
+          <w:szCs w:val="21"/>
+        </w:rPr>
+        <w:t xml:space="preserve">　　　　　　　氏名：</w:t>
+      </w:r>
+      <w:r>
+        <w:rPr>
+          <w:rFonts w:hint="eastAsia"/>
+          <w:szCs w:val="21"/>
+        </w:rPr>
         <w:t>清水紘輔</w:t>
       </w:r>
       <w:r>
+        <w:rPr>
+          <w:szCs w:val="21"/>
+        </w:rPr>
         <w:t xml:space="preserve">　</w:t>
       </w:r>
       <w:r>
+        <w:rPr>
+          <w:szCs w:val="21"/>
+        </w:rPr>
         <w:t>TEL</w:t>
       </w:r>
       <w:r>
+        <w:rPr>
+          <w:szCs w:val="21"/>
+        </w:rPr>
         <w:t>：</w:t>
       </w:r>
-      <w:ins w:id="0" w:author="清水　紘輔" w:date="2026-01-16T06:08:00Z">
-        <w:r>
-          <w:rPr>
-            <w:rFonts w:eastAsia="Century" w:cs="Century"/>
-            <w:color w:val="000000" w:themeColor="text1"/>
-            <w:szCs w:val="21"/>
-          </w:rPr>
-          <w:t>029-853-6185</w:t>
-        </w:r>
-      </w:ins>
-      <w:r>
+      <w:r>
+        <w:rPr>
+          <w:szCs w:val="21"/>
+        </w:rPr>
+        <w:t>029-853-6185</w:t>
+      </w:r>
+      <w:r>
+        <w:rPr>
+          <w:szCs w:val="21"/>
+        </w:rPr>
         <w:t>）</w:t>
       </w:r>
     </w:p>
     <w:p>
       <w:pPr>
-        <w:ind w:leftChars="-14" w:left="-29"/>
-      </w:pPr>
-    </w:p>
-    <w:p>
-      <w:pPr>
-        <w:rPr>
-          <w:szCs w:val="21"/>
-        </w:rPr>
-      </w:pPr>
-      <w:r>
-        <w:rPr>
-          <w:szCs w:val="21"/>
-        </w:rPr>
-        <w:t>実施責任者　（所属：</w:t>
-      </w:r>
-      <w:r>
-        <w:rPr>
-          <w:rFonts w:hint="eastAsia"/>
-          <w:szCs w:val="21"/>
-        </w:rPr>
-        <w:t>筑波大学</w:t>
-      </w:r>
-      <w:r>
-        <w:rPr>
-          <w:rFonts w:hint="eastAsia"/>
-          <w:szCs w:val="21"/>
-        </w:rPr>
-        <w:t xml:space="preserve">システム情報系　</w:t>
-      </w:r>
-      <w:r>
-        <w:rPr>
-          <w:szCs w:val="21"/>
-        </w:rPr>
-        <w:t>氏名：</w:t>
-      </w:r>
-      <w:r>
-        <w:rPr>
-          <w:rFonts w:hint="eastAsia"/>
-          <w:szCs w:val="21"/>
-        </w:rPr>
-        <w:t>善甫</w:t>
+        <w:rPr>
+          <w:szCs w:val="21"/>
+        </w:rPr>
+      </w:pPr>
+      <w:r>
+        <w:rPr>
+          <w:szCs w:val="21"/>
+        </w:rPr>
+        <w:t>実施責任者　（所属：筑波大学</w:t>
       </w:r>
       <w:r>
         <w:rPr>
@@ -1029,7 +774,18 @@
       </w:r>
       <w:r>
         <w:rPr>
-          <w:rFonts w:hint="eastAsia"/>
+          <w:szCs w:val="21"/>
+        </w:rPr>
+        <w:t>システム情報系　氏名：善甫</w:t>
+      </w:r>
+      <w:r>
+        <w:rPr>
+          <w:szCs w:val="21"/>
+        </w:rPr>
+        <w:t xml:space="preserve"> </w:t>
+      </w:r>
+      <w:r>
+        <w:rPr>
           <w:szCs w:val="21"/>
         </w:rPr>
         <w:t xml:space="preserve">啓一　</w:t>
@@ -1048,36 +804,9 @@
       </w:r>
       <w:r>
         <w:rPr>
-          <w:rFonts w:hint="eastAsia"/>
-          <w:szCs w:val="21"/>
-        </w:rPr>
-        <w:t>0</w:t>
-      </w:r>
-      <w:r>
-        <w:rPr>
-          <w:szCs w:val="21"/>
-        </w:rPr>
-        <w:t>29-853</w:t>
-      </w:r>
-      <w:r>
-        <w:rPr>
-          <w:rFonts w:hint="eastAsia"/>
-          <w:szCs w:val="21"/>
-        </w:rPr>
-        <w:t>-</w:t>
-      </w:r>
-      <w:r>
-        <w:rPr>
-          <w:szCs w:val="21"/>
-        </w:rPr>
-        <w:t>5</w:t>
-      </w:r>
-      <w:r>
-        <w:rPr>
-          <w:rFonts w:hint="eastAsia"/>
-          <w:szCs w:val="21"/>
-        </w:rPr>
-        <w:t>338</w:t>
+          <w:szCs w:val="21"/>
+        </w:rPr>
+        <w:t>029-853-5338</w:t>
       </w:r>
       <w:r>
         <w:rPr>
@@ -1100,852 +829,25 @@
           <w:spacing w:val="-10"/>
           <w:szCs w:val="21"/>
         </w:rPr>
-        <w:t>筑波大学</w:t>
-      </w:r>
-      <w:r>
-        <w:rPr>
-          <w:rFonts w:ascii="ＭＳ 明朝" w:hAnsi="ＭＳ 明朝"/>
-          <w:spacing w:val="-10"/>
-          <w:szCs w:val="21"/>
-        </w:rPr>
-        <w:t xml:space="preserve"> </w:t>
-      </w:r>
+        <w:t>筑波大学 システム情報系 研究倫理委員会 事務局</w:t>
+      </w:r>
+    </w:p>
+    <w:p>
+      <w:pPr>
+        <w:ind w:firstLineChars="700" w:firstLine="1330"/>
+        <w:rPr>
+          <w:rFonts w:ascii="ＭＳ 明朝" w:hAnsi="ＭＳ 明朝"/>
+          <w:szCs w:val="21"/>
+        </w:rPr>
+      </w:pPr>
       <w:r>
         <w:rPr>
           <w:rFonts w:ascii="ＭＳ 明朝" w:hAnsi="ＭＳ 明朝" w:hint="eastAsia"/>
           <w:spacing w:val="-10"/>
           <w:szCs w:val="21"/>
         </w:rPr>
-        <w:t>システム情報系</w:t>
-      </w:r>
-      <w:r>
-        <w:rPr>
-          <w:rFonts w:ascii="ＭＳ 明朝" w:hAnsi="ＭＳ 明朝"/>
-          <w:spacing w:val="-10"/>
-          <w:szCs w:val="21"/>
-        </w:rPr>
-        <w:t xml:space="preserve"> </w:t>
-      </w:r>
-      <w:r>
-        <w:rPr>
-          <w:rFonts w:ascii="ＭＳ 明朝" w:hAnsi="ＭＳ 明朝" w:hint="eastAsia"/>
-          <w:spacing w:val="-10"/>
-          <w:szCs w:val="21"/>
-        </w:rPr>
-        <w:t>研究倫理委員会</w:t>
-      </w:r>
-      <w:r>
-        <w:rPr>
-          <w:rFonts w:ascii="ＭＳ 明朝" w:hAnsi="ＭＳ 明朝"/>
-          <w:spacing w:val="-10"/>
-          <w:szCs w:val="21"/>
-        </w:rPr>
-        <w:t xml:space="preserve"> </w:t>
-      </w:r>
-      <w:r>
-        <w:rPr>
-          <w:rFonts w:ascii="ＭＳ 明朝" w:hAnsi="ＭＳ 明朝" w:hint="eastAsia"/>
-          <w:spacing w:val="-10"/>
-          <w:szCs w:val="21"/>
-        </w:rPr>
-        <w:t>事務局</w:t>
-      </w:r>
-    </w:p>
-    <w:p>
-      <w:pPr>
-        <w:ind w:firstLineChars="700" w:firstLine="1330"/>
-        <w:rPr>
-          <w:rFonts w:ascii="ＭＳ 明朝" w:hAnsi="ＭＳ 明朝"/>
-          <w:szCs w:val="21"/>
-        </w:rPr>
-      </w:pPr>
-      <w:r>
-        <w:rPr>
-          <w:rFonts w:ascii="ＭＳ 明朝" w:hAnsi="ＭＳ 明朝" w:hint="eastAsia"/>
-          <w:spacing w:val="-10"/>
-          <w:szCs w:val="21"/>
-        </w:rPr>
-        <w:t>（</w:t>
-      </w:r>
-      <w:r>
-        <w:rPr>
-          <w:rFonts w:ascii="ＭＳ 明朝" w:hAnsi="ＭＳ 明朝" w:hint="eastAsia"/>
-          <w:spacing w:val="-10"/>
-          <w:szCs w:val="21"/>
-        </w:rPr>
-        <w:t>システム情報</w:t>
-      </w:r>
-      <w:r>
-        <w:rPr>
-          <w:rFonts w:ascii="ＭＳ 明朝" w:hAnsi="ＭＳ 明朝" w:hint="eastAsia"/>
-          <w:spacing w:val="-10"/>
-          <w:szCs w:val="21"/>
-        </w:rPr>
-        <w:t>エリア</w:t>
-      </w:r>
-      <w:r>
-        <w:rPr>
-          <w:rFonts w:ascii="ＭＳ 明朝" w:hAnsi="ＭＳ 明朝" w:hint="eastAsia"/>
-          <w:spacing w:val="-10"/>
-          <w:szCs w:val="21"/>
-        </w:rPr>
-        <w:t>支援室　 TEL：０２９－８５３－４９８９）</w:t>
-      </w:r>
-      <w:r>
-        <w:rPr>
-          <w:rFonts w:ascii="ＭＳ 明朝" w:hAnsi="ＭＳ 明朝"/>
-          <w:szCs w:val="21"/>
-        </w:rPr>
-        <w:br w:type="page"/>
-      </w:r>
-    </w:p>
-    <w:p>
-      <w:pPr>
-        <w:rPr>
-          <w:rFonts w:ascii="ＭＳ 明朝" w:hAnsi="ＭＳ 明朝"/>
-          <w:sz w:val="24"/>
-        </w:rPr>
-      </w:pPr>
-      <w:r>
-        <w:rPr>
-          <w:rFonts w:ascii="ＭＳ 明朝" w:hAnsi="ＭＳ 明朝"/>
-          <w:sz w:val="24"/>
-        </w:rPr>
-        <w:lastRenderedPageBreak/>
-        <w:t>（裏面）</w:t>
-      </w:r>
-      <w:r>
-        <w:rPr>
-          <w:rFonts w:ascii="ＭＳ 明朝" w:hAnsi="ＭＳ 明朝"/>
-          <w:sz w:val="24"/>
-        </w:rPr>
-        <w:t>研究の概要について</w:t>
-      </w:r>
-    </w:p>
-    <w:p>
-      <w:pPr>
-        <w:spacing w:before="240" w:after="240"/>
-      </w:pPr>
-      <w:r>
-        <w:rPr>
-          <w:rFonts w:ascii="ＭＳ 明朝" w:hAnsi="ＭＳ 明朝" w:cs="ＭＳ 明朝"/>
-          <w:sz w:val="24"/>
-        </w:rPr>
-        <w:t>[研究対象者条件]</w:t>
-      </w:r>
-      <w:r>
-        <w:br/>
-      </w:r>
-      <w:r>
-        <w:rPr>
-          <w:rFonts w:ascii="ＭＳ 明朝" w:hAnsi="ＭＳ 明朝" w:cs="ＭＳ 明朝"/>
-          <w:sz w:val="24"/>
-        </w:rPr>
-        <w:t xml:space="preserve"> 本研究では，聴覚・平衡感覚・皮膚感覚に重大な問題がなく，仰臥位が可能な満18歳以上の成人を対象として実施します。研究対象者は個人の自由意思を持つものとし，実施責任者および実施分担者は研究対象者の個人の自由意思を十分に尊重します。個人の自由意思による参加のため，実験に不参加の場合でも研究対象者には一切の不利益はありません。</w:t>
-      </w:r>
-      <w:r>
-        <w:br/>
-      </w:r>
-      <w:r>
-        <w:rPr>
-          <w:rFonts w:ascii="ＭＳ 明朝" w:hAnsi="ＭＳ 明朝" w:cs="ＭＳ 明朝"/>
-          <w:sz w:val="24"/>
-        </w:rPr>
-        <w:t xml:space="preserve"> また，除外基準として，めまい・乗り物酔いの既往が強い者，長時間の仰臥位で痛みが生じる者，腰痛・頸部痛が悪化する可能性のある者，皮膚疾患・褥瘡リスクの高い者，妊娠中の者は対象外とします。</w:t>
-      </w:r>
-    </w:p>
-    <w:p>
-      <w:pPr>
-        <w:spacing w:before="240" w:after="240"/>
-      </w:pPr>
-      <w:r>
-        <w:rPr>
-          <w:rFonts w:ascii="ＭＳ 明朝" w:hAnsi="ＭＳ 明朝" w:cs="ＭＳ 明朝"/>
-          <w:sz w:val="24"/>
-        </w:rPr>
-        <w:t>[目的]</w:t>
-      </w:r>
-      <w:r>
-        <w:br/>
-      </w:r>
-      <w:r>
-        <w:rPr>
-          <w:rFonts w:ascii="ＭＳ 明朝" w:hAnsi="ＭＳ 明朝" w:cs="ＭＳ 明朝"/>
-          <w:sz w:val="24"/>
-        </w:rPr>
-        <w:t xml:space="preserve"> 本研究は，四つの粒状ジャミングバッグの剛性（硬さ）分布を条件ごとに変化させることで，実際には水平に寝ているにもかかわらず，身体が傾いているように感じる擬似傾斜知覚が生じるかを検証し，剛性勾配と主観的傾斜角の対応関係を定量化することを目的とします。</w:t>
-      </w:r>
-    </w:p>
-    <w:p>
-      <w:pPr>
-        <w:spacing w:before="240" w:after="240"/>
-      </w:pPr>
-      <w:r>
-        <w:rPr>
-          <w:rFonts w:ascii="ＭＳ 明朝" w:hAnsi="ＭＳ 明朝" w:cs="ＭＳ 明朝"/>
-          <w:sz w:val="24"/>
-        </w:rPr>
-        <w:t>[意義]</w:t>
-      </w:r>
-      <w:r>
-        <w:br/>
-      </w:r>
-      <w:r>
-        <w:rPr>
-          <w:rFonts w:ascii="ＭＳ 明朝" w:hAnsi="ＭＳ 明朝" w:cs="ＭＳ 明朝"/>
-          <w:sz w:val="24"/>
-        </w:rPr>
-        <w:t xml:space="preserve"> 身体を動かさずに姿勢感覚を提示する手法は，VR・医療・設計工学等への応用が期待されます。本研究は，支持面の「空間的な剛性勾配」が姿勢知覚に与える影響を，基礎的に明らかにすることを意義とします。</w:t>
-      </w:r>
-    </w:p>
-    <w:p>
-      <w:pPr>
-        <w:spacing w:before="240" w:after="240"/>
-      </w:pPr>
-      <w:r>
-        <w:rPr>
-          <w:rFonts w:ascii="ＭＳ 明朝" w:hAnsi="ＭＳ 明朝" w:cs="ＭＳ 明朝"/>
-          <w:sz w:val="24"/>
-        </w:rPr>
-        <w:t>[方法]</w:t>
-      </w:r>
-      <w:r>
-        <w:br/>
-      </w:r>
-      <w:r>
-        <w:rPr>
-          <w:rFonts w:ascii="ＭＳ 明朝" w:hAnsi="ＭＳ 明朝" w:cs="ＭＳ 明朝"/>
-          <w:sz w:val="24"/>
-        </w:rPr>
-        <w:t xml:space="preserve"> 研究対象者には，四つの粒状ジャミングバッグが配置された支持面上に仰臥位で横になっていただきます。視覚的な手がかりを減らすためアイマスクを装着していただきます。各条件では，研究者が事前に設定した真空圧によりバッグの剛性を固定し，研究対象者が感じる傾斜方向と傾斜の大きさを，円が印刷された用紙に線で描いて回答していただきます。個人が特定できる音声・画像の記録は行いません。</w:t>
-      </w:r>
-    </w:p>
-    <w:p>
-      <w:pPr>
-        <w:spacing w:before="240" w:after="240"/>
-      </w:pPr>
-      <w:r>
-        <w:rPr>
-          <w:rFonts w:ascii="ＭＳ 明朝" w:hAnsi="ＭＳ 明朝" w:cs="ＭＳ 明朝"/>
-          <w:sz w:val="24"/>
-        </w:rPr>
-        <w:t>[実験内容]</w:t>
-      </w:r>
-      <w:r>
-        <w:br/>
-      </w:r>
-      <w:r>
-        <w:rPr>
-          <w:rFonts w:ascii="ＭＳ 明朝" w:hAnsi="ＭＳ 明朝" w:cs="ＭＳ 明朝"/>
-          <w:sz w:val="24"/>
-        </w:rPr>
-        <w:t xml:space="preserve"> 研究対象者には，以下の手順で実験に参加していただきます。</w:t>
-      </w:r>
-    </w:p>
-    <w:p>
-      <w:pPr>
-        <w:pStyle w:val="af1"/>
-        <w:numPr>
-          <w:ilvl w:val="0"/>
-          <w:numId w:val="1"/>
-        </w:numPr>
-        <w:spacing w:before="240" w:after="240"/>
-        <w:ind w:leftChars="0"/>
-        <w:rPr>
-          <w:rFonts w:ascii="ＭＳ 明朝" w:hAnsi="ＭＳ 明朝" w:cs="ＭＳ 明朝"/>
-          <w:sz w:val="24"/>
-        </w:rPr>
-      </w:pPr>
-      <w:r>
-        <w:rPr>
-          <w:rFonts w:ascii="ＭＳ 明朝" w:hAnsi="ＭＳ 明朝" w:cs="ＭＳ 明朝"/>
-          <w:sz w:val="24"/>
-        </w:rPr>
-        <w:t>研究の説明と同意取得を行います。</w:t>
-      </w:r>
-    </w:p>
-    <w:p>
-      <w:pPr>
-        <w:pStyle w:val="af1"/>
-        <w:numPr>
-          <w:ilvl w:val="0"/>
-          <w:numId w:val="1"/>
-        </w:numPr>
-        <w:spacing w:before="240" w:after="240"/>
-        <w:ind w:leftChars="0"/>
-        <w:rPr>
-          <w:rFonts w:ascii="ＭＳ 明朝" w:hAnsi="ＭＳ 明朝" w:cs="ＭＳ 明朝"/>
-          <w:sz w:val="24"/>
-        </w:rPr>
-      </w:pPr>
-      <w:r>
-        <w:rPr>
-          <w:rFonts w:ascii="ＭＳ 明朝" w:hAnsi="ＭＳ 明朝" w:cs="ＭＳ 明朝"/>
-          <w:sz w:val="24"/>
-        </w:rPr>
-        <w:t>靴や厚手の上着などを外し，装置上に仰臥位でゆっくり横になります。必要に応じて頭部・膝下にクッションを入れます。</w:t>
-      </w:r>
-    </w:p>
-    <w:p>
-      <w:pPr>
-        <w:pStyle w:val="af1"/>
-        <w:numPr>
-          <w:ilvl w:val="0"/>
-          <w:numId w:val="1"/>
-        </w:numPr>
-        <w:spacing w:before="240" w:after="240"/>
-        <w:ind w:leftChars="0"/>
-        <w:rPr>
-          <w:rFonts w:ascii="ＭＳ 明朝" w:hAnsi="ＭＳ 明朝" w:cs="ＭＳ 明朝"/>
-          <w:sz w:val="24"/>
-        </w:rPr>
-      </w:pPr>
-      <w:r>
-        <w:rPr>
-          <w:rFonts w:ascii="ＭＳ 明朝" w:hAnsi="ＭＳ 明朝" w:cs="ＭＳ 明朝"/>
-          <w:sz w:val="24"/>
-        </w:rPr>
-        <w:t>アイマスクを装着し，各条件で10〜15秒ほど安静にして接触面に順応する時間を取ります。</w:t>
-      </w:r>
-    </w:p>
-    <w:p>
-      <w:pPr>
-        <w:pStyle w:val="af1"/>
-        <w:numPr>
-          <w:ilvl w:val="0"/>
-          <w:numId w:val="1"/>
-        </w:numPr>
-        <w:spacing w:before="240" w:after="240"/>
-        <w:ind w:leftChars="0"/>
-        <w:rPr>
-          <w:rFonts w:ascii="ＭＳ 明朝" w:hAnsi="ＭＳ 明朝" w:cs="ＭＳ 明朝"/>
-          <w:sz w:val="24"/>
-        </w:rPr>
-      </w:pPr>
-      <w:r>
-        <w:rPr>
-          <w:rFonts w:ascii="ＭＳ 明朝" w:hAnsi="ＭＳ 明朝" w:cs="ＭＳ 明朝"/>
-          <w:sz w:val="24"/>
-        </w:rPr>
-        <w:t>その後，「現在どの方向にどれほど傾いていると感じるか」を，回答用紙（円の中心からの線）として一度だけ描いていただきます（描画時はアイマスクを外します）。</w:t>
-      </w:r>
-    </w:p>
-    <w:p>
-      <w:pPr>
-        <w:pStyle w:val="af1"/>
-        <w:numPr>
-          <w:ilvl w:val="0"/>
-          <w:numId w:val="1"/>
-        </w:numPr>
-        <w:spacing w:before="240" w:after="240"/>
-        <w:ind w:leftChars="0"/>
-        <w:rPr>
-          <w:rFonts w:ascii="ＭＳ 明朝" w:hAnsi="ＭＳ 明朝" w:cs="ＭＳ 明朝"/>
-          <w:sz w:val="24"/>
-        </w:rPr>
-      </w:pPr>
-      <w:r>
-        <w:rPr>
-          <w:rFonts w:ascii="ＭＳ 明朝" w:hAnsi="ＭＳ 明朝" w:cs="ＭＳ 明朝"/>
-          <w:sz w:val="24"/>
-        </w:rPr>
-        <w:t>条件間に1〜2分の休憩を挟み，合計6条件を目安に繰り返します。</w:t>
-      </w:r>
-    </w:p>
-    <w:p>
-      <w:pPr>
-        <w:spacing w:before="240" w:after="240"/>
-      </w:pPr>
-      <w:r>
-        <w:rPr>
-          <w:rFonts w:ascii="ＭＳ 明朝" w:hAnsi="ＭＳ 明朝" w:cs="ＭＳ 明朝"/>
-          <w:sz w:val="24"/>
-        </w:rPr>
-        <w:t>なお，真空圧の設定は研究対象者が横たわる前に行い，実験中に真空ポンプは動</w:t>
-      </w:r>
-      <w:r>
-        <w:rPr>
-          <w:rFonts w:ascii="ＭＳ 明朝" w:hAnsi="ＭＳ 明朝" w:cs="ＭＳ 明朝"/>
-          <w:sz w:val="24"/>
-        </w:rPr>
-        <w:lastRenderedPageBreak/>
-        <w:t>作させません（静的な支持面特性のみを提示します）。</w:t>
-      </w:r>
-    </w:p>
-    <w:p>
-      <w:pPr>
-        <w:spacing w:before="240" w:after="240"/>
-      </w:pPr>
-      <w:r>
-        <w:rPr>
-          <w:rFonts w:ascii="ＭＳ 明朝" w:hAnsi="ＭＳ 明朝" w:cs="ＭＳ 明朝"/>
-          <w:sz w:val="24"/>
-        </w:rPr>
-        <w:t>[所要時間]</w:t>
-      </w:r>
-      <w:r>
-        <w:br/>
-      </w:r>
-      <w:r>
-        <w:rPr>
-          <w:rFonts w:ascii="ＭＳ 明朝" w:hAnsi="ＭＳ 明朝" w:cs="ＭＳ 明朝"/>
-          <w:sz w:val="24"/>
-        </w:rPr>
-        <w:t xml:space="preserve"> 約</w:t>
-      </w:r>
-      <w:ins w:id="1" w:author="清水　紘輔" w:date="2026-01-06T01:31:00Z">
-        <w:r>
-          <w:rPr>
-            <w:rFonts w:ascii="ＭＳ 明朝" w:hAnsi="ＭＳ 明朝" w:cs="ＭＳ 明朝"/>
-            <w:sz w:val="24"/>
-          </w:rPr>
-          <w:t>50</w:t>
-        </w:r>
-      </w:ins>
-      <w:del w:id="2" w:author="清水　紘輔" w:date="2026-01-06T01:31:00Z">
-        <w:r>
-          <w:rPr>
-            <w:rFonts w:ascii="ＭＳ 明朝" w:hAnsi="ＭＳ 明朝" w:cs="ＭＳ 明朝"/>
-            <w:sz w:val="24"/>
-          </w:rPr>
-          <w:delText>45</w:delText>
-        </w:r>
-      </w:del>
-      <w:r>
-        <w:rPr>
-          <w:rFonts w:ascii="ＭＳ 明朝" w:hAnsi="ＭＳ 明朝" w:cs="ＭＳ 明朝"/>
-          <w:sz w:val="24"/>
-        </w:rPr>
-        <w:t>分（説明10分＋準備5分＋試行・休憩</w:t>
-      </w:r>
-      <w:ins w:id="3" w:author="清水　紘輔" w:date="2026-01-06T01:31:00Z">
-        <w:r>
-          <w:rPr>
-            <w:rFonts w:ascii="ＭＳ 明朝" w:hAnsi="ＭＳ 明朝" w:cs="ＭＳ 明朝"/>
-            <w:sz w:val="24"/>
-          </w:rPr>
-          <w:t>30</w:t>
-        </w:r>
-      </w:ins>
-      <w:del w:id="4" w:author="清水　紘輔" w:date="2026-01-06T01:31:00Z">
-        <w:r>
-          <w:rPr>
-            <w:rFonts w:ascii="ＭＳ 明朝" w:hAnsi="ＭＳ 明朝" w:cs="ＭＳ 明朝"/>
-            <w:sz w:val="24"/>
-          </w:rPr>
-          <w:delText>25</w:delText>
-        </w:r>
-      </w:del>
-      <w:r>
-        <w:rPr>
-          <w:rFonts w:ascii="ＭＳ 明朝" w:hAnsi="ＭＳ 明朝" w:cs="ＭＳ 明朝"/>
-          <w:sz w:val="24"/>
-        </w:rPr>
-        <w:t>分＋終了処理5分）</w:t>
-      </w:r>
-    </w:p>
-    <w:p>
-      <w:pPr>
-        <w:spacing w:before="240" w:after="240"/>
-      </w:pPr>
-      <w:r>
-        <w:rPr>
-          <w:rFonts w:ascii="ＭＳ 明朝" w:hAnsi="ＭＳ 明朝" w:cs="ＭＳ 明朝"/>
-          <w:sz w:val="24"/>
-        </w:rPr>
-        <w:t>[考えられるリスク]</w:t>
-      </w:r>
-      <w:r>
-        <w:br/>
-      </w:r>
-      <w:r>
-        <w:rPr>
-          <w:rFonts w:ascii="ＭＳ 明朝" w:hAnsi="ＭＳ 明朝" w:cs="ＭＳ 明朝"/>
-          <w:sz w:val="24"/>
-        </w:rPr>
-        <w:t xml:space="preserve"> 本実験で想定される肉体的・精神的苦痛は，以下の通りです。</w:t>
-      </w:r>
-      <w:r>
-        <w:br/>
-      </w:r>
-      <w:r>
-        <w:rPr>
-          <w:rFonts w:ascii="ＭＳ 明朝" w:hAnsi="ＭＳ 明朝" w:cs="ＭＳ 明朝"/>
-          <w:sz w:val="24"/>
-        </w:rPr>
-        <w:t xml:space="preserve"> ・実際には水平であるにもかかわらず傾いているように感じることによる軽度の不安，違和感，混乱</w:t>
-      </w:r>
-      <w:r>
-        <w:br/>
-      </w:r>
-      <w:r>
-        <w:rPr>
-          <w:rFonts w:ascii="ＭＳ 明朝" w:hAnsi="ＭＳ 明朝" w:cs="ＭＳ 明朝"/>
-          <w:sz w:val="24"/>
-        </w:rPr>
-        <w:t xml:space="preserve"> ・アイマスク装着による不安感</w:t>
-      </w:r>
-      <w:r>
-        <w:br/>
-      </w:r>
-      <w:r>
-        <w:rPr>
-          <w:rFonts w:ascii="ＭＳ 明朝" w:hAnsi="ＭＳ 明朝" w:cs="ＭＳ 明朝"/>
-          <w:sz w:val="24"/>
-        </w:rPr>
-        <w:t xml:space="preserve"> ・肩甲骨・仙骨など荷重支持点での局所的な圧迫感や軽度の痛み，しびれ</w:t>
-      </w:r>
-      <w:r>
-        <w:br/>
-      </w:r>
-      <w:r>
-        <w:rPr>
-          <w:rFonts w:ascii="ＭＳ 明朝" w:hAnsi="ＭＳ 明朝" w:cs="ＭＳ 明朝"/>
-          <w:sz w:val="24"/>
-        </w:rPr>
-        <w:t xml:space="preserve"> ・仰臥位保持による筋緊張，疲労</w:t>
-      </w:r>
-      <w:r>
-        <w:br/>
-      </w:r>
-      <w:r>
-        <w:rPr>
-          <w:rFonts w:ascii="ＭＳ 明朝" w:hAnsi="ＭＳ 明朝" w:cs="ＭＳ 明朝"/>
-          <w:sz w:val="24"/>
-        </w:rPr>
-        <w:t xml:space="preserve"> ・実験終了後に立ち上がる際のふらつき</w:t>
-      </w:r>
-    </w:p>
-    <w:p>
-      <w:pPr>
-        <w:spacing w:before="240" w:after="240"/>
-      </w:pPr>
-      <w:r>
-        <w:rPr>
-          <w:rFonts w:ascii="ＭＳ 明朝" w:hAnsi="ＭＳ 明朝" w:cs="ＭＳ 明朝"/>
-          <w:sz w:val="24"/>
-        </w:rPr>
-        <w:t>どのリスクについても，各条件間で休憩を設け，逐次体調確認を行います。また，任意で実験を中断・中止することが可能であり，「ストップ」の声かけや手挙げ等の合図で直ちに実験を停止します。必要に応じて保健管理センター等の受診を案内します。</w:t>
-      </w:r>
-    </w:p>
-    <w:p>
-      <w:pPr>
-        <w:spacing w:before="240" w:after="240"/>
-      </w:pPr>
-      <w:r>
-        <w:rPr>
-          <w:rFonts w:ascii="ＭＳ 明朝" w:hAnsi="ＭＳ 明朝" w:cs="ＭＳ 明朝"/>
-          <w:sz w:val="24"/>
-        </w:rPr>
-        <w:t>[謝礼]</w:t>
-      </w:r>
-      <w:r>
-        <w:br/>
-      </w:r>
-      <w:r>
-        <w:rPr>
-          <w:rFonts w:ascii="ＭＳ 明朝" w:hAnsi="ＭＳ 明朝" w:cs="ＭＳ 明朝"/>
-          <w:sz w:val="24"/>
-        </w:rPr>
-        <w:t xml:space="preserve"> 実験終了時に謝金をAmazonギフトカード（Eメールタイプ）にて800円お支払いいたします。</w:t>
-      </w:r>
-    </w:p>
-    <w:p/>
-    <w:p>
-      <w:pPr>
-        <w:spacing w:before="240" w:after="240"/>
-      </w:pPr>
-      <w:ins w:id="5" w:author="清水　紘輔" w:date="2026-01-06T01:44:00Z">
-        <w:r>
-          <w:rPr>
-            <w:rFonts w:ascii="ＭＳ 明朝" w:hAnsi="ＭＳ 明朝" w:cs="ＭＳ 明朝"/>
-            <w:sz w:val="24"/>
-          </w:rPr>
-          <w:t>[</w:t>
-        </w:r>
-      </w:ins>
-      <w:r>
-        <w:rPr>
-          <w:rFonts w:ascii="ＭＳ 明朝" w:hAnsi="ＭＳ 明朝" w:cs="ＭＳ 明朝"/>
-          <w:sz w:val="24"/>
-        </w:rPr>
-        <w:t>研究対象者の必要性，研究への参加におけるリスクと安全性，危険回避の方法について</w:t>
-      </w:r>
-      <w:ins w:id="6" w:author="清水　紘輔" w:date="2026-01-06T01:44:00Z">
-        <w:r>
-          <w:rPr>
-            <w:rFonts w:ascii="ＭＳ 明朝" w:hAnsi="ＭＳ 明朝" w:cs="ＭＳ 明朝"/>
-            <w:sz w:val="24"/>
-          </w:rPr>
-          <w:t>]</w:t>
-        </w:r>
-      </w:ins>
-    </w:p>
-    <w:p>
-      <w:pPr>
-        <w:spacing w:before="240" w:after="240"/>
-        <w:rPr>
-          <w:ins w:id="7" w:author="清水　紘輔" w:date="2026-01-06T01:31:00Z" w16du:dateUtc="2026-01-06T01:31:54Z"/>
-        </w:rPr>
-      </w:pPr>
-      <w:r>
-        <w:rPr>
-          <w:rFonts w:ascii="ＭＳ 明朝" w:hAnsi="ＭＳ 明朝" w:cs="ＭＳ 明朝"/>
-          <w:sz w:val="24"/>
-        </w:rPr>
-        <w:t>本研究は，人が支持面上で感じる傾斜感覚（主観評価）を測定することが必須のため，研究対象者に参加していただくことが必要です。</w:t>
-      </w:r>
-      <w:r>
-        <w:br/>
-      </w:r>
-      <w:r>
-        <w:rPr>
-          <w:rFonts w:ascii="ＭＳ 明朝" w:hAnsi="ＭＳ 明朝" w:cs="ＭＳ 明朝"/>
-          <w:sz w:val="24"/>
-        </w:rPr>
-        <w:t xml:space="preserve"> また，万一健康被害が見られる場合は，保健管理センターもしくは近隣の医療機関で診察・治療を行い，国大協保険によりその補償を行います。</w:t>
-      </w:r>
-    </w:p>
-    <w:p>
-      <w:pPr>
-        <w:spacing w:before="240" w:after="240"/>
-        <w:rPr>
-          <w:ins w:id="8" w:author="清水　紘輔" w:date="2026-01-06T01:35:00Z" w16du:dateUtc="2026-01-06T01:35:55Z"/>
-          <w:rFonts w:ascii="ＭＳ 明朝" w:hAnsi="ＭＳ 明朝" w:cs="ＭＳ 明朝"/>
-          <w:sz w:val="24"/>
-        </w:rPr>
-      </w:pPr>
-      <w:ins w:id="9" w:author="清水　紘輔" w:date="2026-01-06T01:34:00Z">
-        <w:r>
-          <w:rPr>
-            <w:rFonts w:ascii="ＭＳ 明朝" w:hAnsi="ＭＳ 明朝" w:cs="ＭＳ 明朝"/>
-            <w:sz w:val="24"/>
-          </w:rPr>
-          <w:t>横たわっていただくバッグは，減圧（真空に近づける）を行います。減圧を行うバッグは</w:t>
-        </w:r>
-      </w:ins>
-      <w:ins w:id="10" w:author="清水　紘輔" w:date="2026-01-06T01:32:00Z">
-        <w:r>
-          <w:rPr>
-            <w:rFonts w:ascii="ＭＳ 明朝" w:hAnsi="ＭＳ 明朝" w:cs="ＭＳ 明朝"/>
-            <w:sz w:val="24"/>
-          </w:rPr>
-          <w:t>，独自の機器を用いた検証となるため，万が一破損が起こる可能性があります．</w:t>
-        </w:r>
-      </w:ins>
-      <w:ins w:id="11" w:author="清水　紘輔" w:date="2026-01-06T01:35:00Z">
-        <w:r>
-          <w:rPr>
-            <w:rFonts w:ascii="ＭＳ 明朝" w:hAnsi="ＭＳ 明朝" w:cs="ＭＳ 明朝"/>
-            <w:sz w:val="24"/>
-          </w:rPr>
-          <w:t>減圧を行うため，破裂などの問題が起こることはないと存じますが，</w:t>
-        </w:r>
-      </w:ins>
-      <w:ins w:id="12" w:author="清水　紘輔" w:date="2026-01-06T01:34:00Z">
-        <w:r>
-          <w:rPr>
-            <w:rFonts w:ascii="ＭＳ 明朝" w:hAnsi="ＭＳ 明朝" w:cs="ＭＳ 明朝"/>
-            <w:sz w:val="24"/>
-          </w:rPr>
-          <w:t>実験実施者は以下の</w:t>
-        </w:r>
-      </w:ins>
-      <w:ins w:id="13" w:author="清水　紘輔" w:date="2026-01-06T01:35:00Z">
-        <w:r>
-          <w:rPr>
-            <w:rFonts w:ascii="ＭＳ 明朝" w:hAnsi="ＭＳ 明朝" w:cs="ＭＳ 明朝"/>
-            <w:sz w:val="24"/>
-          </w:rPr>
-          <w:t>事項に気を配ります。</w:t>
-        </w:r>
-      </w:ins>
-    </w:p>
-    <w:p>
-      <w:pPr>
-        <w:spacing w:before="240" w:after="240"/>
-        <w:rPr>
-          <w:del w:id="14" w:author="清水　紘輔" w:date="2026-01-06T01:34:00Z" w16du:dateUtc="2026-01-06T01:34:45Z"/>
-          <w:rFonts w:ascii="ＭＳ 明朝" w:hAnsi="ＭＳ 明朝" w:cs="ＭＳ 明朝"/>
-          <w:sz w:val="24"/>
-        </w:rPr>
-      </w:pPr>
-      <w:ins w:id="15" w:author="清水　紘輔" w:date="2026-01-06T01:35:00Z">
-        <w:r>
-          <w:rPr>
-            <w:rFonts w:ascii="ＭＳ 明朝" w:hAnsi="ＭＳ 明朝" w:cs="ＭＳ 明朝"/>
-            <w:sz w:val="24"/>
-          </w:rPr>
-          <w:t xml:space="preserve">1. </w:t>
-        </w:r>
-      </w:ins>
-      <w:ins w:id="16" w:author="清水　紘輔" w:date="2026-01-06T01:36:00Z">
-        <w:r>
-          <w:rPr>
-            <w:rFonts w:ascii="ＭＳ 明朝" w:hAnsi="ＭＳ 明朝" w:cs="ＭＳ 明朝"/>
-            <w:sz w:val="24"/>
-          </w:rPr>
-          <w:t>第三者的な視点からバッグの様子を注視し、バッグに異変がある場合は速やかに参加者に知らせ、体を起こすように指示をいたします。</w:t>
-        </w:r>
-      </w:ins>
-      <w:r>
-        <w:br/>
-      </w:r>
-      <w:ins w:id="17" w:author="清水　紘輔" w:date="2026-01-06T01:36:00Z">
-        <w:r>
-          <w:rPr>
-            <w:rFonts w:ascii="ＭＳ 明朝" w:hAnsi="ＭＳ 明朝" w:cs="ＭＳ 明朝"/>
-            <w:sz w:val="24"/>
-          </w:rPr>
-          <w:t xml:space="preserve">2. </w:t>
-        </w:r>
-      </w:ins>
-      <w:ins w:id="18" w:author="清水　紘輔" w:date="2026-01-06T01:37:00Z">
-        <w:r>
-          <w:rPr>
-            <w:rFonts w:ascii="ＭＳ 明朝" w:hAnsi="ＭＳ 明朝" w:cs="ＭＳ 明朝"/>
-            <w:sz w:val="24"/>
-          </w:rPr>
-          <w:t>減圧を行うポンプは，</w:t>
-        </w:r>
-        <w:r>
-          <w:rPr>
-            <w:rFonts w:ascii="ＭＳ 明朝" w:hAnsi="ＭＳ 明朝" w:cs="ＭＳ 明朝"/>
-            <w:sz w:val="24"/>
-          </w:rPr>
-          <w:t>参加者</w:t>
-        </w:r>
-      </w:ins>
-      <w:ins w:id="19" w:author="清水　紘輔" w:date="2026-01-06T01:38:00Z">
-        <w:r>
-          <w:rPr>
-            <w:rFonts w:ascii="ＭＳ 明朝" w:hAnsi="ＭＳ 明朝" w:cs="ＭＳ 明朝"/>
-            <w:sz w:val="24"/>
-          </w:rPr>
-          <w:t>より2</w:t>
-        </w:r>
-        <w:r>
-          <w:rPr>
-            <w:rFonts w:ascii="ＭＳ 明朝" w:hAnsi="ＭＳ 明朝" w:cs="ＭＳ 明朝"/>
-            <w:sz w:val="24"/>
-          </w:rPr>
-          <w:t>m</w:t>
-        </w:r>
-        <w:r>
-          <w:rPr>
-            <w:rFonts w:ascii="ＭＳ 明朝" w:hAnsi="ＭＳ 明朝" w:cs="ＭＳ 明朝"/>
-            <w:sz w:val="24"/>
-          </w:rPr>
-          <w:t>以上離れた位置に設置します。</w:t>
-        </w:r>
-      </w:ins>
-    </w:p>
-    <w:p/>
-    <w:p>
-      <w:pPr>
-        <w:spacing w:before="240" w:after="240"/>
-      </w:pPr>
-      <w:r>
-        <w:rPr>
-          <w:rFonts w:ascii="ＭＳ 明朝" w:hAnsi="ＭＳ 明朝" w:cs="ＭＳ 明朝"/>
-          <w:sz w:val="24"/>
-        </w:rPr>
-        <w:t>③　個人情報の保護について</w:t>
-      </w:r>
-    </w:p>
-    <w:p>
-      <w:pPr>
-        <w:spacing w:before="240" w:after="240"/>
-      </w:pPr>
-      <w:r>
-        <w:rPr>
-          <w:rFonts w:ascii="ＭＳ 明朝" w:hAnsi="ＭＳ 明朝" w:cs="ＭＳ 明朝"/>
-          <w:sz w:val="24"/>
-        </w:rPr>
-        <w:t>(1) データの匿名化について</w:t>
-      </w:r>
-      <w:r>
-        <w:br/>
-      </w:r>
-      <w:r>
-        <w:rPr>
-          <w:rFonts w:ascii="ＭＳ 明朝" w:hAnsi="ＭＳ 明朝" w:cs="ＭＳ 明朝"/>
-          <w:sz w:val="24"/>
-        </w:rPr>
-        <w:t xml:space="preserve"> 連結可能匿名化によるデータの匿名化を行います。研究対象者の氏名・電子メールアドレスは謝礼送付および連絡のために取得し，研究データ（回答用紙の結</w:t>
-      </w:r>
-      <w:r>
-        <w:rPr>
-          <w:rFonts w:ascii="ＭＳ 明朝" w:hAnsi="ＭＳ 明朝" w:cs="ＭＳ 明朝"/>
-          <w:sz w:val="24"/>
-        </w:rPr>
-        <w:lastRenderedPageBreak/>
-        <w:t>果や条件情報）とは分離して管理します。研究発表の場では，個人を特定できる形ではなく，匿名化した形でのみ取り扱います。</w:t>
-      </w:r>
-    </w:p>
-    <w:p>
-      <w:pPr>
-        <w:spacing w:before="240" w:after="240"/>
-      </w:pPr>
-      <w:r>
-        <w:rPr>
-          <w:rFonts w:ascii="ＭＳ 明朝" w:hAnsi="ＭＳ 明朝" w:cs="ＭＳ 明朝"/>
-          <w:sz w:val="24"/>
-        </w:rPr>
-        <w:t>(2) データの管理方法</w:t>
-      </w:r>
-      <w:r>
-        <w:br/>
-      </w:r>
-      <w:r>
-        <w:rPr>
-          <w:rFonts w:ascii="ＭＳ 明朝" w:hAnsi="ＭＳ 明朝" w:cs="ＭＳ 明朝"/>
-          <w:sz w:val="24"/>
-        </w:rPr>
-        <w:t xml:space="preserve"> 研究データは研究室（3M211）にて管理されたノートパソコンで保管し，実施責任者および実施分担者のみが取り扱います。結果の解析はネットに接続されない状態で行い，暗号化およびパスワード保護によりデータを保護します。同意書など紙媒体は鍵付きの保管庫で厳重に管理します。データは成果公表後から10年間保管し，その後は復元できないようにして処分します。</w:t>
-      </w:r>
-    </w:p>
-    <w:p>
-      <w:pPr>
-        <w:spacing w:before="240" w:after="240"/>
-      </w:pPr>
-      <w:r>
-        <w:rPr>
-          <w:rFonts w:ascii="ＭＳ 明朝" w:hAnsi="ＭＳ 明朝" w:cs="ＭＳ 明朝"/>
-          <w:sz w:val="24"/>
-        </w:rPr>
-        <w:t>研究対象者は本人の自由意思によって，同意書署名の日から90日後までであれば任意の時期において実験の取りやめおよびデータの破棄を申し出ることができます。破棄の申し出があった際には，直ちに破棄を行います。</w:t>
-      </w:r>
-    </w:p>
-    <w:p>
-      <w:pPr>
-        <w:spacing w:before="240" w:after="240"/>
-      </w:pPr>
-      <w:r>
-        <w:rPr>
-          <w:rFonts w:ascii="ＭＳ 明朝" w:hAnsi="ＭＳ 明朝" w:cs="ＭＳ 明朝"/>
-          <w:sz w:val="24"/>
-        </w:rPr>
-        <w:t>(3) 研究参加の任意性</w:t>
-      </w:r>
-      <w:r>
-        <w:br/>
-      </w:r>
-      <w:r>
-        <w:rPr>
-          <w:rFonts w:ascii="ＭＳ 明朝" w:hAnsi="ＭＳ 明朝" w:cs="ＭＳ 明朝"/>
-          <w:sz w:val="24"/>
-        </w:rPr>
-        <w:t xml:space="preserve"> 研究への参加は任意であり，研究へ参加しないことで不利益が生じることはありません。実験の途中であっても不利益なく参加を取りやめることができます。また，同意書署名の日から90日後までであればデータ提供の同意撤回が可能です。</w:t>
-      </w:r>
-    </w:p>
-    <w:p>
-      <w:pPr>
-        <w:rPr>
-          <w:rFonts w:ascii="ＭＳ 明朝" w:hAnsi="ＭＳ 明朝"/>
-          <w:sz w:val="24"/>
-        </w:rPr>
-      </w:pPr>
+        <w:t>（システム情報エリア支援室　 TEL：029-853-4989）</w:t>
+      </w:r>
     </w:p>
     <w:p>
       <w:pPr>
@@ -1953,11 +855,1799 @@
         <w:jc w:val="left"/>
         <w:rPr>
           <w:rFonts w:ascii="ＭＳ 明朝" w:hAnsi="ＭＳ 明朝"/>
+          <w:szCs w:val="21"/>
+        </w:rPr>
+      </w:pPr>
+    </w:p>
+    <w:p>
+      <w:pPr>
+        <w:widowControl/>
+        <w:jc w:val="left"/>
+        <w:rPr>
+          <w:rFonts w:ascii="ＭＳ 明朝" w:hAnsi="ＭＳ 明朝"/>
+          <w:szCs w:val="21"/>
+        </w:rPr>
+      </w:pPr>
+    </w:p>
+    <w:p>
+      <w:pPr>
+        <w:widowControl/>
+        <w:jc w:val="left"/>
+        <w:rPr>
+          <w:rFonts w:ascii="ＭＳ 明朝" w:hAnsi="ＭＳ 明朝"/>
+          <w:szCs w:val="21"/>
+        </w:rPr>
+      </w:pPr>
+    </w:p>
+    <w:p>
+      <w:pPr>
+        <w:widowControl/>
+        <w:jc w:val="left"/>
+        <w:rPr>
+          <w:rFonts w:ascii="ＭＳ 明朝" w:hAnsi="ＭＳ 明朝"/>
+        </w:rPr>
+      </w:pPr>
+    </w:p>
+    <w:p>
+      <w:pPr>
+        <w:widowControl/>
+        <w:jc w:val="left"/>
+        <w:rPr>
+          <w:rFonts w:ascii="ＭＳ 明朝" w:hAnsi="ＭＳ 明朝"/>
+          <w:szCs w:val="21"/>
+        </w:rPr>
+      </w:pPr>
+      <w:r>
+        <w:rPr>
+          <w:rFonts w:ascii="ＭＳ 明朝" w:hAnsi="ＭＳ 明朝"/>
+          <w:szCs w:val="21"/>
+        </w:rPr>
+        <w:br w:type="page"/>
+      </w:r>
+    </w:p>
+    <w:p>
+      <w:pPr>
+        <w:rPr>
+          <w:rFonts w:ascii="ＭＳ 明朝" w:hAnsi="ＭＳ 明朝"/>
+          <w:sz w:val="24"/>
+        </w:rPr>
+      </w:pPr>
+      <w:r>
+        <w:rPr>
+          <w:rFonts w:ascii="ＭＳ 明朝" w:hAnsi="ＭＳ 明朝" w:hint="eastAsia"/>
+          <w:sz w:val="24"/>
+        </w:rPr>
+        <w:lastRenderedPageBreak/>
+        <w:t>（</w:t>
+      </w:r>
+      <w:r>
+        <w:rPr>
+          <w:rFonts w:ascii="ＭＳ 明朝" w:hAnsi="ＭＳ 明朝" w:hint="eastAsia"/>
+          <w:sz w:val="24"/>
+        </w:rPr>
+        <w:t>裏面）</w:t>
+      </w:r>
+    </w:p>
+    <w:p>
+      <w:pPr>
+        <w:ind w:left="210"/>
+        <w:rPr>
+          <w:rFonts w:ascii="ＭＳ 明朝" w:hAnsi="ＭＳ 明朝"/>
+        </w:rPr>
+      </w:pPr>
+      <w:r>
+        <w:rPr>
+          <w:rFonts w:ascii="ＭＳ 明朝" w:hAnsi="ＭＳ 明朝"/>
+        </w:rPr>
+        <w:t xml:space="preserve">① </w:t>
+      </w:r>
+      <w:r>
+        <w:rPr>
+          <w:rFonts w:ascii="ＭＳ 明朝" w:hAnsi="ＭＳ 明朝"/>
+        </w:rPr>
+        <w:t>研究の概要について</w:t>
+      </w:r>
+    </w:p>
+    <w:p>
+      <w:pPr>
+        <w:ind w:left="210"/>
+        <w:jc w:val="left"/>
+        <w:rPr>
+          <w:rFonts w:ascii="ＭＳ 明朝" w:hAnsi="ＭＳ 明朝"/>
+        </w:rPr>
+      </w:pPr>
+      <w:r>
+        <w:rPr>
+          <w:rFonts w:ascii="ＭＳ 明朝" w:hAnsi="ＭＳ 明朝" w:hint="eastAsia"/>
+          <w:u w:val="single"/>
+        </w:rPr>
+        <w:t>[参加者条件</w:t>
+      </w:r>
+      <w:r>
+        <w:rPr>
+          <w:rFonts w:ascii="ＭＳ 明朝" w:hAnsi="ＭＳ 明朝"/>
+          <w:u w:val="single"/>
+        </w:rPr>
+        <w:t>]</w:t>
+      </w:r>
+      <w:r>
+        <w:rPr>
+          <w:rFonts w:ascii="ＭＳ 明朝" w:hAnsi="ＭＳ 明朝"/>
+        </w:rPr>
+        <w:t xml:space="preserve"> </w:t>
+      </w:r>
+    </w:p>
+    <w:p>
+      <w:pPr>
+        <w:ind w:left="210"/>
+        <w:jc w:val="left"/>
+        <w:rPr>
+          <w:rFonts w:ascii="ＭＳ 明朝" w:hAnsi="ＭＳ 明朝"/>
+        </w:rPr>
+      </w:pPr>
+      <w:r>
+        <w:t>18</w:t>
+      </w:r>
+      <w:r>
+        <w:t>歳以上で実験手順を理解し同意できる成人を対象とする。主に英語を母語としない聴取者（非母語話者）</w:t>
+      </w:r>
+      <w:r>
+        <w:rPr>
+          <w:rFonts w:hint="eastAsia"/>
+        </w:rPr>
+        <w:t>で</w:t>
+      </w:r>
+      <w:r>
+        <w:t>あることを申告する参加者を対象とする。視覚的提示を理解する上で支障が無いこと（矯正視力含む）を参加条件とする。</w:t>
+      </w:r>
+    </w:p>
+    <w:p>
+      <w:pPr>
+        <w:ind w:left="210"/>
+        <w:jc w:val="left"/>
+      </w:pPr>
+      <w:r>
+        <w:t>選択基準：</w:t>
+      </w:r>
+      <w:r>
+        <w:br/>
+      </w:r>
+      <w:r>
+        <w:t>・</w:t>
+      </w:r>
+      <w:r>
+        <w:t>18</w:t>
+      </w:r>
+      <w:r>
+        <w:t>歳以上であること</w:t>
+      </w:r>
+      <w:r>
+        <w:br/>
+      </w:r>
+      <w:r>
+        <w:t>・実験用言語（英語）で提示される映像の理解を目標とする非母語話者群</w:t>
+      </w:r>
+      <w:r>
+        <w:br/>
+      </w:r>
+      <w:r>
+        <w:t>・視力</w:t>
+      </w:r>
+      <w:r>
+        <w:t>/</w:t>
+      </w:r>
+      <w:r>
+        <w:t>聴</w:t>
+      </w:r>
+      <w:r>
+        <w:rPr>
+          <w:rFonts w:hint="eastAsia"/>
+        </w:rPr>
+        <w:t>力</w:t>
+      </w:r>
+      <w:r>
+        <w:t>は実験遂行に支障がない（矯正視力</w:t>
+      </w:r>
+      <w:r>
+        <w:rPr>
+          <w:rFonts w:hint="eastAsia"/>
+        </w:rPr>
+        <w:t>・補聴器</w:t>
+      </w:r>
+      <w:r>
+        <w:t>含む）こと</w:t>
+      </w:r>
+      <w:r>
+        <w:br/>
+      </w:r>
+      <w:r>
+        <w:t>・実験に関する十分な説明を受け理解し同意できること</w:t>
+      </w:r>
+      <w:r>
+        <w:br/>
+      </w:r>
+      <w:r>
+        <w:t>・事前スクリーニングに同意すること</w:t>
+      </w:r>
+    </w:p>
+    <w:p>
+      <w:pPr>
+        <w:ind w:left="210"/>
+        <w:jc w:val="left"/>
+        <w:rPr>
+          <w:rFonts w:ascii="ＭＳ 明朝" w:hAnsi="ＭＳ 明朝"/>
+        </w:rPr>
+      </w:pPr>
+    </w:p>
+    <w:p>
+      <w:pPr>
+        <w:ind w:left="210"/>
+        <w:rPr>
+          <w:rFonts w:ascii="ＭＳ 明朝" w:hAnsi="ＭＳ 明朝"/>
+          <w:szCs w:val="21"/>
+        </w:rPr>
+      </w:pPr>
+      <w:r>
+        <w:rPr>
+          <w:rFonts w:ascii="ＭＳ 明朝" w:hAnsi="ＭＳ 明朝"/>
+          <w:szCs w:val="21"/>
+          <w:u w:val="single"/>
+        </w:rPr>
+        <w:t>[</w:t>
+      </w:r>
+      <w:r>
+        <w:rPr>
+          <w:rFonts w:ascii="ＭＳ 明朝" w:hAnsi="ＭＳ 明朝" w:hint="eastAsia"/>
+          <w:szCs w:val="21"/>
+          <w:u w:val="single"/>
+        </w:rPr>
+        <w:t>目的</w:t>
+      </w:r>
+      <w:r>
+        <w:rPr>
+          <w:rFonts w:ascii="ＭＳ 明朝" w:hAnsi="ＭＳ 明朝" w:hint="eastAsia"/>
+          <w:szCs w:val="21"/>
+          <w:u w:val="single"/>
+        </w:rPr>
+        <w:t>]</w:t>
+      </w:r>
+      <w:r>
+        <w:rPr>
+          <w:rFonts w:ascii="ＭＳ 明朝" w:hAnsi="ＭＳ 明朝"/>
+          <w:szCs w:val="21"/>
+        </w:rPr>
+        <w:t xml:space="preserve"> </w:t>
+      </w:r>
+    </w:p>
+    <w:p>
+      <w:pPr>
+        <w:ind w:left="210"/>
+      </w:pPr>
+      <w:r>
+        <w:t>本研究の目的は、音声から推定した</w:t>
+      </w:r>
+      <w:r>
+        <w:t>話し手の「声の抑揚」や「強調」に合わせて、字幕の見た目が変化する新しい字幕</w:t>
+      </w:r>
+      <w:r>
+        <w:t>を評価することである。具体的には、</w:t>
+      </w:r>
+      <w:r>
+        <w:t xml:space="preserve">(1) </w:t>
+      </w:r>
+      <w:r>
+        <w:t>英語を母語としない聴取者が講演・解説視聴時に経験する</w:t>
+      </w:r>
+      <w:r>
+        <w:t>「疲れ」や「頭への負担」</w:t>
+      </w:r>
+      <w:r>
+        <w:rPr>
+          <w:rFonts w:hint="eastAsia"/>
+        </w:rPr>
+        <w:t>を</w:t>
+      </w:r>
+      <w:r>
+        <w:t>、</w:t>
+      </w:r>
+      <w:r>
+        <w:rPr>
+          <w:color w:val="EE0000"/>
+        </w:rPr>
+        <w:t>既存の字幕提示手法（</w:t>
+      </w:r>
+      <w:r>
+        <w:rPr>
+          <w:color w:val="EE0000"/>
+        </w:rPr>
+        <w:t>Dynamik</w:t>
+      </w:r>
+      <w:r>
+        <w:rPr>
+          <w:color w:val="EE0000"/>
+        </w:rPr>
+        <w:t>）</w:t>
+      </w:r>
+      <w:r>
+        <w:rPr>
+          <w:strike/>
+        </w:rPr>
+        <w:t>既存の</w:t>
+      </w:r>
+      <w:r>
+        <w:rPr>
+          <w:rFonts w:hint="eastAsia"/>
+          <w:strike/>
+        </w:rPr>
+        <w:t>語彙的情報を活用した</w:t>
+      </w:r>
+      <w:r>
+        <w:rPr>
+          <w:strike/>
+        </w:rPr>
+        <w:t>字幕手法（</w:t>
+      </w:r>
+      <w:r>
+        <w:rPr>
+          <w:strike/>
+        </w:rPr>
+        <w:t>Dynamik</w:t>
+      </w:r>
+      <w:r>
+        <w:rPr>
+          <w:strike/>
+        </w:rPr>
+        <w:t>）</w:t>
+      </w:r>
+      <w:r>
+        <w:t>と同等以上に軽減できるかを検証する。さらに、</w:t>
+      </w:r>
+      <w:r>
+        <w:t>(2)</w:t>
+      </w:r>
+      <w:r>
+        <w:t>参加者に対して、従来の字幕では伝わりにくい韻律情報（強調・感情・修辞的意図）を視覚的に伝達できるかを実証することを目的とする。</w:t>
+      </w:r>
+    </w:p>
+    <w:p>
+      <w:pPr>
+        <w:ind w:left="210"/>
+        <w:rPr>
+          <w:rFonts w:ascii="ＭＳ 明朝" w:hAnsi="ＭＳ 明朝"/>
+          <w:szCs w:val="21"/>
+        </w:rPr>
+      </w:pPr>
+    </w:p>
+    <w:p>
+      <w:pPr>
+        <w:ind w:left="210"/>
+        <w:rPr>
+          <w:rFonts w:ascii="ＭＳ 明朝" w:hAnsi="ＭＳ 明朝"/>
+          <w:szCs w:val="21"/>
+        </w:rPr>
+      </w:pPr>
+      <w:r>
+        <w:rPr>
+          <w:rFonts w:ascii="ＭＳ 明朝" w:hAnsi="ＭＳ 明朝"/>
+          <w:szCs w:val="21"/>
+          <w:u w:val="single"/>
+        </w:rPr>
+        <w:t>[</w:t>
+      </w:r>
+      <w:r>
+        <w:rPr>
+          <w:rFonts w:ascii="ＭＳ 明朝" w:hAnsi="ＭＳ 明朝" w:hint="eastAsia"/>
+          <w:szCs w:val="21"/>
+          <w:u w:val="single"/>
+        </w:rPr>
+        <w:t>意義</w:t>
+      </w:r>
+      <w:r>
+        <w:rPr>
+          <w:rFonts w:ascii="ＭＳ 明朝" w:hAnsi="ＭＳ 明朝"/>
+          <w:szCs w:val="21"/>
+          <w:u w:val="single"/>
+        </w:rPr>
+        <w:t>]</w:t>
+      </w:r>
+      <w:r>
+        <w:rPr>
+          <w:rFonts w:ascii="ＭＳ 明朝" w:hAnsi="ＭＳ 明朝"/>
+          <w:szCs w:val="21"/>
+        </w:rPr>
+        <w:t xml:space="preserve"> </w:t>
+      </w:r>
+    </w:p>
+    <w:p>
+      <w:pPr>
+        <w:ind w:left="210"/>
+        <w:rPr>
+          <w:rFonts w:ascii="ＭＳ 明朝" w:hAnsi="ＭＳ 明朝"/>
+          <w:szCs w:val="21"/>
+        </w:rPr>
+      </w:pPr>
+      <w:r>
+        <w:rPr>
+          <w:rFonts w:ascii="ＭＳ 明朝" w:hAnsi="ＭＳ 明朝"/>
+          <w:szCs w:val="21"/>
+        </w:rPr>
+        <w:t>この研究が進むことで、外国語の講演やニュースを見る際の負担が減り、より多くの人が情報を得やすい社会（インクルーシブデザイン）への貢献が期待され</w:t>
+      </w:r>
+      <w:r>
+        <w:rPr>
+          <w:rFonts w:ascii="ＭＳ 明朝" w:hAnsi="ＭＳ 明朝" w:hint="eastAsia"/>
+          <w:szCs w:val="21"/>
+        </w:rPr>
+        <w:t>る</w:t>
+      </w:r>
+      <w:r>
+        <w:rPr>
+          <w:rFonts w:ascii="ＭＳ 明朝" w:hAnsi="ＭＳ 明朝"/>
+          <w:szCs w:val="21"/>
+        </w:rPr>
+        <w:t>。</w:t>
+      </w:r>
+    </w:p>
+    <w:p>
+      <w:pPr>
+        <w:ind w:left="210"/>
+        <w:rPr>
+          <w:rFonts w:ascii="ＭＳ 明朝" w:hAnsi="ＭＳ 明朝"/>
+          <w:szCs w:val="21"/>
+        </w:rPr>
+      </w:pPr>
+    </w:p>
+    <w:p>
+      <w:pPr>
+        <w:ind w:firstLineChars="100" w:firstLine="210"/>
+        <w:jc w:val="left"/>
+        <w:rPr>
+          <w:rFonts w:ascii="ＭＳ 明朝" w:hAnsi="ＭＳ 明朝"/>
+        </w:rPr>
+      </w:pPr>
+      <w:r>
+        <w:rPr>
+          <w:rFonts w:ascii="ＭＳ 明朝" w:hAnsi="ＭＳ 明朝" w:hint="eastAsia"/>
+          <w:szCs w:val="21"/>
+          <w:u w:val="single"/>
+        </w:rPr>
+        <w:t>[</w:t>
+      </w:r>
+      <w:r>
+        <w:rPr>
+          <w:rFonts w:ascii="ＭＳ 明朝" w:hAnsi="ＭＳ 明朝" w:hint="eastAsia"/>
+          <w:szCs w:val="21"/>
+          <w:u w:val="single"/>
+        </w:rPr>
+        <w:t>方法</w:t>
+      </w:r>
+      <w:r>
+        <w:rPr>
+          <w:rFonts w:ascii="ＭＳ 明朝" w:hAnsi="ＭＳ 明朝" w:hint="eastAsia"/>
+          <w:szCs w:val="21"/>
+          <w:u w:val="single"/>
+        </w:rPr>
+        <w:t>]</w:t>
+      </w:r>
+      <w:r>
+        <w:rPr>
+          <w:rFonts w:ascii="ＭＳ 明朝" w:hAnsi="ＭＳ 明朝"/>
+          <w:szCs w:val="21"/>
+        </w:rPr>
+        <w:t xml:space="preserve"> </w:t>
+      </w:r>
+    </w:p>
+    <w:p>
+      <w:pPr>
+        <w:ind w:left="210" w:firstLineChars="100" w:firstLine="210"/>
+        <w:jc w:val="left"/>
+      </w:pPr>
+      <w:r>
+        <w:t>本実験</w:t>
+      </w:r>
+      <w:r>
+        <w:rPr>
+          <w:rFonts w:hint="eastAsia"/>
+        </w:rPr>
+        <w:t>で</w:t>
+      </w:r>
+      <w:r>
+        <w:t>は</w:t>
+      </w:r>
+      <w:r>
+        <w:t>4</w:t>
+      </w:r>
+      <w:r>
+        <w:t>種類の字幕パターンすべてを見ていただ</w:t>
+      </w:r>
+      <w:r>
+        <w:rPr>
+          <w:rFonts w:hint="eastAsia"/>
+        </w:rPr>
+        <w:t>く</w:t>
+      </w:r>
+      <w:r>
+        <w:t>（見る順番はランダム）</w:t>
+      </w:r>
+      <w:r>
+        <w:rPr>
+          <w:rFonts w:hint="eastAsia"/>
+        </w:rPr>
+        <w:t>方法で評価をする。</w:t>
+      </w:r>
+      <w:r>
+        <w:t>提示条件は無字幕（</w:t>
+      </w:r>
+      <w:r>
+        <w:t>No caption</w:t>
+      </w:r>
+      <w:r>
+        <w:t>）、通常字幕（</w:t>
+      </w:r>
+      <w:r>
+        <w:t>Standard caption</w:t>
+      </w:r>
+      <w:r>
+        <w:t>）、</w:t>
+      </w:r>
+      <w:r>
+        <w:t>Dynamik</w:t>
+      </w:r>
+      <w:r>
+        <w:t>（競合手法）、提案手法（韻律ベース字幕）の</w:t>
+      </w:r>
+      <w:r>
+        <w:t>4</w:t>
+      </w:r>
+      <w:r>
+        <w:rPr>
+          <w:strike/>
+        </w:rPr>
+        <w:t>水準</w:t>
+      </w:r>
+      <w:r>
+        <w:rPr>
+          <w:rFonts w:hint="eastAsia"/>
+        </w:rPr>
+        <w:t>パターン</w:t>
+      </w:r>
+      <w:r>
+        <w:t>で比較する。主課題は内容理解の正誤判定および話者の強調</w:t>
+      </w:r>
+      <w:r>
+        <w:rPr>
+          <w:rFonts w:hint="eastAsia"/>
+        </w:rPr>
+        <w:t>した</w:t>
+      </w:r>
+      <w:r>
+        <w:t>語</w:t>
+      </w:r>
+      <w:r>
+        <w:rPr>
+          <w:rFonts w:hint="eastAsia"/>
+        </w:rPr>
+        <w:t>を当てるタスクの実施</w:t>
+      </w:r>
+      <w:r>
+        <w:t>であり、</w:t>
+      </w:r>
+      <w:r>
+        <w:rPr>
+          <w:rFonts w:hint="eastAsia"/>
+        </w:rPr>
+        <w:t>また</w:t>
+      </w:r>
+      <w:r>
+        <w:t>アンケートで「どのくらい疲れを感じたか」などに</w:t>
+      </w:r>
+      <w:r>
+        <w:rPr>
+          <w:rFonts w:hint="eastAsia"/>
+        </w:rPr>
+        <w:t>評価いただく。</w:t>
+      </w:r>
+    </w:p>
+    <w:p>
+      <w:pPr>
+        <w:ind w:left="210" w:firstLineChars="100" w:firstLine="210"/>
+        <w:jc w:val="left"/>
+        <w:rPr>
+          <w:rFonts w:ascii="ＭＳ 明朝" w:hAnsi="ＭＳ 明朝"/>
+        </w:rPr>
+      </w:pPr>
+    </w:p>
+    <w:p>
+      <w:pPr>
+        <w:ind w:firstLineChars="100" w:firstLine="210"/>
+        <w:jc w:val="left"/>
+        <w:rPr>
+          <w:rFonts w:ascii="ＭＳ 明朝" w:hAnsi="ＭＳ 明朝"/>
+        </w:rPr>
+      </w:pPr>
+      <w:r>
+        <w:t>【実験手順】</w:t>
+      </w:r>
+    </w:p>
+    <w:p>
+      <w:pPr>
+        <w:ind w:leftChars="100" w:left="210" w:firstLineChars="100" w:firstLine="210"/>
+        <w:jc w:val="left"/>
+        <w:rPr>
+          <w:rFonts w:ascii="ＭＳ 明朝" w:hAnsi="ＭＳ 明朝"/>
+        </w:rPr>
+      </w:pPr>
+      <w:r>
+        <w:t xml:space="preserve">1. </w:t>
+      </w:r>
+      <w:r>
+        <w:t>募集案内による応募の受付および事前スクリーニング（年齢確認、英語提示を目的とする非母語話者該当性自己申告）。</w:t>
+      </w:r>
+      <w:r>
+        <w:rPr>
+          <w:rFonts w:hint="eastAsia"/>
+        </w:rPr>
+        <w:t>- 2</w:t>
+      </w:r>
+      <w:r>
+        <w:rPr>
+          <w:rFonts w:hint="eastAsia"/>
+        </w:rPr>
+        <w:t>分</w:t>
+      </w:r>
+    </w:p>
+    <w:p>
+      <w:pPr>
+        <w:ind w:leftChars="100" w:left="210" w:firstLineChars="100" w:firstLine="210"/>
+        <w:jc w:val="left"/>
+        <w:rPr>
+          <w:rFonts w:ascii="ＭＳ 明朝" w:hAnsi="ＭＳ 明朝"/>
+        </w:rPr>
+      </w:pPr>
+      <w:r>
+        <w:t xml:space="preserve">2. </w:t>
+      </w:r>
+      <w:r>
+        <w:t>オンライン実験開始前にインフォームドコンセントを取得し、実験手順・想定所要時間・中止の可否等を説明する。</w:t>
+      </w:r>
+      <w:r>
+        <w:rPr>
+          <w:rFonts w:hint="eastAsia"/>
+        </w:rPr>
+        <w:t>- 3</w:t>
+      </w:r>
+      <w:r>
+        <w:rPr>
+          <w:rFonts w:hint="eastAsia"/>
+        </w:rPr>
+        <w:t>分</w:t>
+      </w:r>
+    </w:p>
+    <w:p>
+      <w:pPr>
+        <w:ind w:leftChars="100" w:left="210" w:firstLineChars="100" w:firstLine="210"/>
+        <w:jc w:val="left"/>
+        <w:rPr>
+          <w:rFonts w:ascii="ＭＳ 明朝" w:hAnsi="ＭＳ 明朝"/>
+        </w:rPr>
+      </w:pPr>
+      <w:r>
+        <w:t xml:space="preserve">3. </w:t>
+      </w:r>
+      <w:r>
+        <w:t>基本情報（年齢、性別、母語、聴覚状態の自己申告、</w:t>
+      </w:r>
+      <w:r>
+        <w:t>英語学習習熟度</w:t>
+      </w:r>
+      <w:r>
+        <w:t>等）を収集する。</w:t>
+      </w:r>
+      <w:r>
+        <w:t xml:space="preserve">- </w:t>
+      </w:r>
+      <w:r>
+        <w:t>10</w:t>
+      </w:r>
+      <w:r>
+        <w:t>分</w:t>
+      </w:r>
+    </w:p>
+    <w:p>
+      <w:pPr>
+        <w:ind w:leftChars="100" w:left="210" w:firstLineChars="100" w:firstLine="210"/>
+        <w:jc w:val="left"/>
+      </w:pPr>
+      <w:r>
+        <w:t xml:space="preserve">4. </w:t>
+      </w:r>
+      <w:r>
+        <w:t>提示条件の順序をラテン方格等で決定し、ウェブ実験プラットフォームを通じて短尺英語映像を順次提示する。各刺激後に理解確認問題（正誤判定）、韻律的理解確認（強調語同定）、主観的認知負荷尺度等の質問紙を実施し、反応時間と正誤を記録する。</w:t>
+      </w:r>
+      <w:r>
+        <w:t>-</w:t>
+      </w:r>
+      <w:r>
+        <w:t>各刺激</w:t>
+      </w:r>
+      <w:r>
+        <w:t>10</w:t>
+      </w:r>
+      <w:r>
+        <w:t>分</w:t>
+      </w:r>
+      <w:r>
+        <w:t>×</w:t>
+      </w:r>
+      <w:r>
+        <w:t>4</w:t>
+      </w:r>
+      <w:r>
+        <w:t>回</w:t>
+      </w:r>
+    </w:p>
+    <w:p>
+      <w:pPr>
+        <w:ind w:leftChars="200" w:left="420" w:firstLineChars="100" w:firstLine="210"/>
+        <w:jc w:val="left"/>
+      </w:pPr>
+      <w:r>
+        <w:rPr>
+          <w:rFonts w:hint="eastAsia"/>
+        </w:rPr>
+        <w:t>6</w:t>
+      </w:r>
+      <w:r>
+        <w:t xml:space="preserve">. </w:t>
+      </w:r>
+      <w:r>
+        <w:t>全試行終了後に簡易な終了アンケートと自由記述によるフィードバックを収集し、謝礼を支給して実験を終了する。</w:t>
+      </w:r>
+      <w:r>
+        <w:rPr>
+          <w:rFonts w:hint="eastAsia"/>
+        </w:rPr>
+        <w:t>-5</w:t>
+      </w:r>
+      <w:r>
+        <w:rPr>
+          <w:rFonts w:hint="eastAsia"/>
+        </w:rPr>
+        <w:t>分</w:t>
+      </w:r>
+    </w:p>
+    <w:p>
+      <w:pPr>
+        <w:ind w:leftChars="200" w:left="420" w:firstLineChars="100" w:firstLine="210"/>
+        <w:jc w:val="left"/>
+        <w:rPr>
+          <w:rFonts w:ascii="ＭＳ 明朝" w:hAnsi="ＭＳ 明朝"/>
+        </w:rPr>
+      </w:pPr>
+    </w:p>
+    <w:p>
+      <w:pPr>
+        <w:ind w:left="210"/>
+        <w:jc w:val="left"/>
+        <w:rPr>
+          <w:rFonts w:ascii="ＭＳ 明朝" w:hAnsi="ＭＳ 明朝"/>
+        </w:rPr>
+      </w:pPr>
+      <w:r>
+        <w:rPr>
+          <w:rFonts w:ascii="ＭＳ 明朝" w:hAnsi="ＭＳ 明朝"/>
+          <w:u w:val="single"/>
+        </w:rPr>
+        <w:lastRenderedPageBreak/>
+        <w:t>[</w:t>
+      </w:r>
+      <w:r>
+        <w:rPr>
+          <w:rFonts w:ascii="ＭＳ 明朝" w:hAnsi="ＭＳ 明朝" w:hint="eastAsia"/>
+          <w:u w:val="single"/>
+        </w:rPr>
+        <w:t>所要時間</w:t>
+      </w:r>
+      <w:r>
+        <w:rPr>
+          <w:rFonts w:ascii="ＭＳ 明朝" w:hAnsi="ＭＳ 明朝" w:hint="eastAsia"/>
+          <w:u w:val="single"/>
+        </w:rPr>
+        <w:t>]</w:t>
+      </w:r>
+    </w:p>
+    <w:p>
+      <w:pPr>
+        <w:ind w:left="210"/>
+        <w:jc w:val="left"/>
+      </w:pPr>
+      <w:r>
+        <w:t>約</w:t>
+      </w:r>
+      <w:r>
+        <w:t>60</w:t>
+      </w:r>
+      <w:r>
+        <w:t>分</w:t>
+      </w:r>
+    </w:p>
+    <w:p>
+      <w:pPr>
+        <w:ind w:left="210"/>
+        <w:jc w:val="left"/>
+      </w:pPr>
+    </w:p>
+    <w:p>
+      <w:pPr>
+        <w:ind w:left="210"/>
+        <w:jc w:val="left"/>
+        <w:rPr>
+          <w:rFonts w:ascii="ＭＳ 明朝" w:hAnsi="ＭＳ 明朝"/>
+          <w:color w:val="EE0000"/>
+          <w:u w:val="single"/>
+        </w:rPr>
+      </w:pPr>
+      <w:r>
+        <w:rPr>
+          <w:rFonts w:ascii="ＭＳ 明朝" w:hAnsi="ＭＳ 明朝" w:hint="eastAsia"/>
+          <w:color w:val="EE0000"/>
+          <w:u w:val="single"/>
+        </w:rPr>
+        <w:t>[研究期間</w:t>
+      </w:r>
+      <w:r>
+        <w:rPr>
+          <w:rFonts w:ascii="ＭＳ 明朝" w:hAnsi="ＭＳ 明朝"/>
+          <w:color w:val="EE0000"/>
+          <w:u w:val="single"/>
+        </w:rPr>
+        <w:t>]</w:t>
+      </w:r>
+      <w:r>
+        <w:rPr>
+          <w:rFonts w:ascii="ＭＳ 明朝" w:hAnsi="ＭＳ 明朝"/>
+          <w:color w:val="EE0000"/>
+        </w:rPr>
+        <w:t xml:space="preserve"> </w:t>
+      </w:r>
+    </w:p>
+    <w:p>
+      <w:pPr>
+        <w:ind w:left="210"/>
+        <w:jc w:val="left"/>
+        <w:rPr>
+          <w:color w:val="EE0000"/>
+        </w:rPr>
+      </w:pPr>
+      <w:r>
+        <w:rPr>
+          <w:rFonts w:hint="eastAsia"/>
+          <w:color w:val="EE0000"/>
+        </w:rPr>
+        <w:t>～</w:t>
+      </w:r>
+      <w:r>
+        <w:rPr>
+          <w:rFonts w:hint="eastAsia"/>
+          <w:color w:val="EE0000"/>
+        </w:rPr>
+        <w:t>202</w:t>
+      </w:r>
+      <w:r>
+        <w:rPr>
+          <w:rFonts w:hint="eastAsia"/>
+          <w:color w:val="EE0000"/>
+        </w:rPr>
+        <w:t>7</w:t>
+      </w:r>
+      <w:r>
+        <w:rPr>
+          <w:rFonts w:hint="eastAsia"/>
+          <w:color w:val="EE0000"/>
+        </w:rPr>
+        <w:t>年</w:t>
+      </w:r>
+      <w:r>
+        <w:rPr>
+          <w:rFonts w:hint="eastAsia"/>
+          <w:color w:val="EE0000"/>
+        </w:rPr>
+        <w:t>3</w:t>
+      </w:r>
+      <w:r>
+        <w:rPr>
+          <w:rFonts w:hint="eastAsia"/>
+          <w:color w:val="EE0000"/>
+        </w:rPr>
+        <w:t>月</w:t>
+      </w:r>
+      <w:r>
+        <w:rPr>
+          <w:rFonts w:hint="eastAsia"/>
+          <w:color w:val="EE0000"/>
+        </w:rPr>
+        <w:t>31</w:t>
+      </w:r>
+      <w:r>
+        <w:rPr>
+          <w:rFonts w:hint="eastAsia"/>
+          <w:color w:val="EE0000"/>
+        </w:rPr>
+        <w:t>日迄</w:t>
+      </w:r>
+    </w:p>
+    <w:p>
+      <w:pPr>
+        <w:ind w:left="210"/>
+        <w:jc w:val="left"/>
+        <w:rPr>
+          <w:rFonts w:ascii="ＭＳ 明朝" w:hAnsi="ＭＳ 明朝"/>
+        </w:rPr>
+      </w:pPr>
+    </w:p>
+    <w:p>
+      <w:pPr>
+        <w:ind w:left="210"/>
+        <w:jc w:val="left"/>
+        <w:rPr>
+          <w:rFonts w:ascii="ＭＳ 明朝" w:hAnsi="ＭＳ 明朝"/>
+        </w:rPr>
+      </w:pPr>
+      <w:r>
+        <w:rPr>
+          <w:rFonts w:ascii="ＭＳ 明朝" w:hAnsi="ＭＳ 明朝" w:hint="eastAsia"/>
+          <w:u w:val="single"/>
+        </w:rPr>
+        <w:t>[考えられるリスク</w:t>
+      </w:r>
+      <w:r>
+        <w:rPr>
+          <w:rFonts w:ascii="ＭＳ 明朝" w:hAnsi="ＭＳ 明朝"/>
+          <w:u w:val="single"/>
+        </w:rPr>
+        <w:t>]</w:t>
+      </w:r>
+      <w:r>
+        <w:rPr>
+          <w:rFonts w:ascii="ＭＳ 明朝" w:hAnsi="ＭＳ 明朝" w:hint="eastAsia"/>
+        </w:rPr>
+        <w:t xml:space="preserve"> </w:t>
+      </w:r>
+    </w:p>
+    <w:p>
+      <w:pPr>
+        <w:ind w:left="210"/>
+        <w:jc w:val="left"/>
+        <w:rPr>
+          <w:rFonts w:ascii="ＭＳ 明朝" w:hAnsi="ＭＳ 明朝"/>
+        </w:rPr>
+      </w:pPr>
+      <w:r>
+        <w:t>疲労および負担（長時間の視聴や反復課題による）、視聴刺激の内容に起因する心理的不快感（ニュースや講演の内容に感情的反応を引き起こす可能性）、個人情報性の高いデータ取得に伴うプライバシーリスク（回答ログ等）、</w:t>
+      </w:r>
+      <w:r>
+        <w:rPr>
+          <w:strike/>
+        </w:rPr>
+        <w:t>聴覚障害の有無など</w:t>
+      </w:r>
+      <w:r>
+        <w:t>健康情報に関連するセンシティブ情報の取り扱い</w:t>
+      </w:r>
+    </w:p>
+    <w:p>
+      <w:pPr>
+        <w:ind w:left="210"/>
+        <w:jc w:val="left"/>
+      </w:pPr>
+      <w:r>
+        <w:t>（対策）事前に想定所要時間を明示し、任意で休憩を挟める設計とする。疲労を訴えた場合は中断・辞退を容易に行える旨を説明する、使用する映像刺激は事前に確認し、過度に刺激的な素材を除外する。刺激に不快感を覚えた場合の中止手順と相談窓口を明示する、収集するデータは必要最小限に限定し、識別子は分離して安全に保管する。データアクセスは</w:t>
+      </w:r>
+      <w:r>
+        <w:t>実施責任者</w:t>
+      </w:r>
+      <w:r>
+        <w:rPr>
+          <w:rFonts w:hint="eastAsia"/>
+        </w:rPr>
+        <w:t>と実施分担者</w:t>
+      </w:r>
+      <w:r>
+        <w:t>に限定する、は同意書で取り扱い目的を明確にし、個別の医療情報は収集しないことを原則として匿名化のうえで集計する</w:t>
+      </w:r>
+      <w:r>
+        <w:rPr>
+          <w:rFonts w:hint="eastAsia"/>
+        </w:rPr>
+        <w:t>。</w:t>
+      </w:r>
+    </w:p>
+    <w:p>
+      <w:pPr>
+        <w:ind w:left="210"/>
+        <w:jc w:val="left"/>
+        <w:rPr>
+          <w:rFonts w:ascii="ＭＳ 明朝" w:hAnsi="ＭＳ 明朝"/>
+        </w:rPr>
+      </w:pPr>
+    </w:p>
+    <w:p>
+      <w:pPr>
+        <w:ind w:left="210"/>
+        <w:jc w:val="left"/>
+        <w:rPr>
+          <w:rFonts w:ascii="ＭＳ 明朝" w:hAnsi="ＭＳ 明朝"/>
+        </w:rPr>
+      </w:pPr>
+      <w:r>
+        <w:rPr>
+          <w:rFonts w:ascii="ＭＳ 明朝" w:hAnsi="ＭＳ 明朝" w:hint="eastAsia"/>
+          <w:u w:val="single"/>
+        </w:rPr>
+        <w:t>[謝礼</w:t>
+      </w:r>
+      <w:r>
+        <w:rPr>
+          <w:rFonts w:ascii="ＭＳ 明朝" w:hAnsi="ＭＳ 明朝"/>
+          <w:u w:val="single"/>
+        </w:rPr>
+        <w:t>]</w:t>
+      </w:r>
+    </w:p>
+    <w:p>
+      <w:pPr>
+        <w:ind w:left="210"/>
+        <w:jc w:val="left"/>
+        <w:rPr>
+          <w:rFonts w:ascii="ＭＳ 明朝" w:hAnsi="ＭＳ 明朝"/>
+        </w:rPr>
+      </w:pPr>
+      <w:r>
+        <w:t>謝礼として</w:t>
+      </w:r>
+      <w:r>
+        <w:t>Amazon</w:t>
+      </w:r>
+      <w:r>
+        <w:t>ギフトカード（</w:t>
+      </w:r>
+      <w:r>
+        <w:t>E</w:t>
+      </w:r>
+      <w:r>
+        <w:t>メールタイプ）にて</w:t>
+      </w:r>
+      <w:r>
+        <w:t>1,000</w:t>
+      </w:r>
+      <w:r>
+        <w:t>円をお支払いします。</w:t>
+      </w:r>
+    </w:p>
+    <w:p>
+      <w:pPr>
+        <w:ind w:left="210"/>
+        <w:jc w:val="left"/>
+        <w:rPr>
+          <w:rFonts w:ascii="ＭＳ 明朝" w:hAnsi="ＭＳ 明朝"/>
+        </w:rPr>
+      </w:pPr>
+    </w:p>
+    <w:p>
+      <w:pPr>
+        <w:ind w:firstLine="210"/>
+        <w:rPr>
+          <w:rFonts w:ascii="ＭＳ 明朝" w:hAnsi="ＭＳ 明朝"/>
+        </w:rPr>
+      </w:pPr>
+      <w:r>
+        <w:rPr>
+          <w:rFonts w:ascii="ＭＳ 明朝" w:hAnsi="ＭＳ 明朝"/>
+        </w:rPr>
+        <w:t>②</w:t>
+      </w:r>
+      <w:r>
+        <w:rPr>
+          <w:rFonts w:ascii="ＭＳ 明朝" w:hAnsi="ＭＳ 明朝"/>
+        </w:rPr>
+        <w:t>研究対象者の必要性</w:t>
+      </w:r>
+      <w:r>
+        <w:rPr>
+          <w:rFonts w:ascii="ＭＳ 明朝" w:hAnsi="ＭＳ 明朝"/>
+        </w:rPr>
+        <w:t>，</w:t>
+      </w:r>
+      <w:r>
+        <w:rPr>
+          <w:rFonts w:ascii="ＭＳ 明朝" w:hAnsi="ＭＳ 明朝"/>
+        </w:rPr>
+        <w:t>研究への</w:t>
+      </w:r>
+      <w:r>
+        <w:rPr>
+          <w:rFonts w:ascii="ＭＳ 明朝" w:hAnsi="ＭＳ 明朝"/>
+        </w:rPr>
+        <w:t>参加</w:t>
+      </w:r>
+      <w:r>
+        <w:rPr>
+          <w:rFonts w:ascii="ＭＳ 明朝" w:hAnsi="ＭＳ 明朝"/>
+        </w:rPr>
+        <w:t>におけるリスクと</w:t>
+      </w:r>
+      <w:r>
+        <w:rPr>
+          <w:rFonts w:ascii="ＭＳ 明朝" w:hAnsi="ＭＳ 明朝"/>
+        </w:rPr>
+        <w:t>安全性</w:t>
+      </w:r>
+      <w:r>
+        <w:rPr>
+          <w:rFonts w:ascii="ＭＳ 明朝" w:hAnsi="ＭＳ 明朝"/>
+        </w:rPr>
+        <w:t>，危険回避の方法</w:t>
+      </w:r>
+      <w:r>
+        <w:rPr>
+          <w:rFonts w:ascii="ＭＳ 明朝" w:hAnsi="ＭＳ 明朝"/>
+        </w:rPr>
+        <w:t>について</w:t>
+      </w:r>
+    </w:p>
+    <w:p>
+      <w:pPr>
+        <w:ind w:left="284" w:firstLine="210"/>
+      </w:pPr>
+      <w:r>
+        <w:t>本研究では、本研究の目的は、音声から推定した</w:t>
+      </w:r>
+      <w:r>
+        <w:rPr>
+          <w:rFonts w:hint="eastAsia"/>
+        </w:rPr>
+        <w:t>会話における強調成分（</w:t>
+      </w:r>
+      <w:r>
+        <w:t>韻律的プロミネンス構造</w:t>
+      </w:r>
+      <w:r>
+        <w:rPr>
+          <w:rFonts w:hint="eastAsia"/>
+        </w:rPr>
+        <w:t>）</w:t>
+      </w:r>
+      <w:r>
+        <w:t>を字幕の視覚的パラメータに変換する提示法を評価すること</w:t>
+      </w:r>
+      <w:r>
+        <w:rPr>
+          <w:rFonts w:hint="eastAsia"/>
+        </w:rPr>
+        <w:t>で</w:t>
+      </w:r>
+      <w:r>
+        <w:rPr>
+          <w:rFonts w:hint="eastAsia"/>
+        </w:rPr>
+        <w:t>ある</w:t>
+      </w:r>
+      <w:r>
+        <w:t>。具体的には、英語を母語としない聴取者が講演・解説視聴時に経験する認知負荷を、既存の統語ベース字幕手法（</w:t>
+      </w:r>
+      <w:r>
+        <w:t>Dynamik</w:t>
+      </w:r>
+      <w:r>
+        <w:t>）と同等以上に軽減できるかを検証</w:t>
+      </w:r>
+      <w:r>
+        <w:rPr>
+          <w:rFonts w:hint="eastAsia"/>
+        </w:rPr>
+        <w:t>する</w:t>
+      </w:r>
+      <w:r>
+        <w:t>。</w:t>
+      </w:r>
+      <w:r>
+        <w:rPr>
+          <w:rFonts w:hint="eastAsia"/>
+        </w:rPr>
+        <w:t>また</w:t>
+      </w:r>
+      <w:r>
+        <w:t>、従来の字幕では伝わりにくい韻律情報（強調・感情・修辞的意図）を視覚的に伝達できるかを実証すること</w:t>
+      </w:r>
+      <w:r>
+        <w:rPr>
+          <w:rFonts w:hint="eastAsia"/>
+        </w:rPr>
+        <w:t>も目的と</w:t>
+      </w:r>
+      <w:r>
+        <w:rPr>
+          <w:rFonts w:hint="eastAsia"/>
+        </w:rPr>
+        <w:t>する</w:t>
+      </w:r>
+      <w:r>
+        <w:t>。</w:t>
+      </w:r>
+    </w:p>
+    <w:p>
+      <w:pPr>
+        <w:ind w:left="284" w:firstLine="210"/>
+      </w:pPr>
+      <w:r>
+        <w:t>本研究の研究対象者は、</w:t>
+      </w:r>
+      <w:r>
+        <w:t>18</w:t>
+      </w:r>
+      <w:r>
+        <w:t>歳以上で実験手順を理解し同意できる成人を対象と</w:t>
+      </w:r>
+      <w:r>
+        <w:rPr>
+          <w:rFonts w:hint="eastAsia"/>
+        </w:rPr>
+        <w:t>する</w:t>
+      </w:r>
+      <w:r>
+        <w:rPr>
+          <w:rFonts w:hint="eastAsia"/>
+          <w:strike/>
+        </w:rPr>
+        <w:t>します</w:t>
+      </w:r>
+      <w:r>
+        <w:t>。主に英語を母語としない聴取者（非母語話者）であることを申告する参加者を対象とする。視覚的提示を理解する上で支障が無いこと（矯正視力含む）を参加条件</w:t>
+      </w:r>
+      <w:r>
+        <w:rPr>
+          <w:rFonts w:hint="eastAsia"/>
+        </w:rPr>
+        <w:t>と</w:t>
+      </w:r>
+      <w:r>
+        <w:rPr>
+          <w:rFonts w:hint="eastAsia"/>
+        </w:rPr>
+        <w:t>する</w:t>
+      </w:r>
+      <w:r>
+        <w:t>。これらの研究対象者にご参加いただき、その反応や回答を分析する必要があ</w:t>
+      </w:r>
+      <w:r>
+        <w:rPr>
+          <w:rFonts w:hint="eastAsia"/>
+        </w:rPr>
+        <w:t>る</w:t>
+      </w:r>
+      <w:r>
+        <w:t>。</w:t>
+      </w:r>
+    </w:p>
+    <w:p>
+      <w:pPr>
+        <w:ind w:left="284" w:firstLine="210"/>
+        <w:rPr>
+          <w:rFonts w:ascii="ＭＳ 明朝" w:hAnsi="ＭＳ 明朝"/>
+          <w:szCs w:val="21"/>
+        </w:rPr>
+      </w:pPr>
+      <w:r>
+        <w:t>研究への参加に伴い想定される負担・リスクとして、疲労および負担（長時間の視聴や反復課題による）、視聴刺激の内容に起因する心理的不快感（ニュースや講演の内容に感情的反応を引き起こす可能性）、個人情報性の</w:t>
+      </w:r>
+      <w:r>
+        <w:rPr>
+          <w:rFonts w:hint="eastAsia"/>
+        </w:rPr>
+        <w:t>ある</w:t>
+      </w:r>
+      <w:r>
+        <w:t>データ取得に伴うプライバシーリスク（回答ログ等）、</w:t>
+      </w:r>
+      <w:r>
+        <w:rPr>
+          <w:rFonts w:hint="eastAsia"/>
+        </w:rPr>
+        <w:t>また</w:t>
+      </w:r>
+      <w:r>
+        <w:t>健康情報に関連するセンシティブ情報の取り扱いが生じる可能性があ</w:t>
+      </w:r>
+      <w:r>
+        <w:rPr>
+          <w:rFonts w:hint="eastAsia"/>
+        </w:rPr>
+        <w:t>る</w:t>
+      </w:r>
+      <w:r>
+        <w:t>。</w:t>
+      </w:r>
+    </w:p>
+    <w:p>
+      <w:pPr>
+        <w:ind w:left="284" w:firstLine="210"/>
+      </w:pPr>
+      <w:r>
+        <w:t>本研究で行う課題は、研究対象者の</w:t>
+      </w:r>
+      <w:r>
+        <w:t>体に傷をつけたり、直接的な危険を及ぼすものでは</w:t>
+      </w:r>
+      <w:r>
+        <w:rPr>
+          <w:rFonts w:hint="eastAsia"/>
+        </w:rPr>
+        <w:t>な</w:t>
+      </w:r>
+      <w:r>
+        <w:rPr>
+          <w:rFonts w:hint="eastAsia"/>
+        </w:rPr>
+        <w:t>く</w:t>
+      </w:r>
+      <w:r>
+        <w:t>、通常の作業の範囲を大きく超えるものではな</w:t>
+      </w:r>
+      <w:r>
+        <w:rPr>
+          <w:rFonts w:hint="eastAsia"/>
+        </w:rPr>
+        <w:t>いと考えら</w:t>
+      </w:r>
+      <w:r>
+        <w:rPr>
+          <w:rFonts w:hint="eastAsia"/>
+        </w:rPr>
+        <w:t>れる</w:t>
+      </w:r>
+      <w:r>
+        <w:rPr>
+          <w:rFonts w:hint="eastAsia"/>
+        </w:rPr>
+        <w:t>が、</w:t>
+      </w:r>
+      <w:r>
+        <w:t>想定されるリスクへの対策として、参加者に対し事前に想定所要時間を明示し、任意で休憩を挟める設計と</w:t>
+      </w:r>
+      <w:r>
+        <w:rPr>
+          <w:rFonts w:hint="eastAsia"/>
+        </w:rPr>
+        <w:t>する</w:t>
+      </w:r>
+      <w:r>
+        <w:t>。</w:t>
+      </w:r>
+      <w:r>
+        <w:rPr>
+          <w:rFonts w:hint="eastAsia"/>
+        </w:rPr>
+        <w:t>また、</w:t>
+      </w:r>
+      <w:r>
+        <w:t>データアクセスは</w:t>
+      </w:r>
+      <w:r>
+        <w:t>実施責任者</w:t>
+      </w:r>
+      <w:r>
+        <w:rPr>
+          <w:rFonts w:hint="eastAsia"/>
+        </w:rPr>
+        <w:t>と実施分担者</w:t>
+      </w:r>
+      <w:r>
+        <w:t>に限定し、匿名化・集計後の公開方針を明示する、</w:t>
+      </w:r>
+      <w:r>
+        <w:rPr>
+          <w:rFonts w:hint="eastAsia"/>
+        </w:rPr>
+        <w:t>情報の取り扱いは</w:t>
+      </w:r>
+      <w:r>
+        <w:t>同意書で取り扱い目的を明確にし、回答は匿名化のうえで集計</w:t>
+      </w:r>
+      <w:r>
+        <w:rPr>
+          <w:rFonts w:hint="eastAsia"/>
+        </w:rPr>
+        <w:t>する</w:t>
+      </w:r>
+      <w:r>
+        <w:t>。疲労、不快感、体調不良を感じた場合には、</w:t>
+      </w:r>
+      <w:r>
+        <w:rPr>
+          <w:rFonts w:hint="eastAsia"/>
+        </w:rPr>
+        <w:t>実験参加者</w:t>
+      </w:r>
+      <w:r>
+        <w:t>自身の判断で直ちに実験を中断または終了でき、途中で取りやめた場合にも不利益を受けることは</w:t>
+      </w:r>
+      <w:r>
+        <w:rPr>
+          <w:rFonts w:hint="eastAsia"/>
+        </w:rPr>
+        <w:t>ない</w:t>
+      </w:r>
+      <w:r>
+        <w:t>。</w:t>
+      </w:r>
+    </w:p>
+    <w:p>
+      <w:pPr>
+        <w:ind w:left="284" w:firstLine="210"/>
+        <w:rPr>
+          <w:rFonts w:ascii="ＭＳ 明朝" w:hAnsi="ＭＳ 明朝"/>
+          <w:szCs w:val="21"/>
+        </w:rPr>
+      </w:pPr>
+      <w:r>
+        <w:t>健康被害の補償：本研究の参加に起因して健康被害が生じた場合には、国立大学法人</w:t>
+      </w:r>
+      <w:r>
+        <w:lastRenderedPageBreak/>
+        <w:t>総合損害保険（国大協保険）により対応する。</w:t>
+      </w:r>
+    </w:p>
+    <w:p>
+      <w:pPr>
+        <w:rPr>
+          <w:rFonts w:ascii="ＭＳ 明朝" w:hAnsi="ＭＳ 明朝"/>
+          <w:szCs w:val="21"/>
+        </w:rPr>
+      </w:pPr>
+    </w:p>
+    <w:p>
+      <w:pPr>
+        <w:ind w:left="284"/>
+        <w:rPr>
+          <w:rFonts w:ascii="ＭＳ 明朝" w:hAnsi="ＭＳ 明朝"/>
+          <w:szCs w:val="21"/>
+        </w:rPr>
+      </w:pPr>
+      <w:r>
+        <w:rPr>
+          <w:rFonts w:ascii="ＭＳ 明朝" w:hAnsi="ＭＳ 明朝" w:hint="eastAsia"/>
+          <w:szCs w:val="21"/>
+        </w:rPr>
+        <w:t>③　個人情報の保護について</w:t>
+      </w:r>
+    </w:p>
+    <w:p>
+      <w:pPr>
+        <w:ind w:leftChars="101" w:left="212"/>
+        <w:outlineLvl w:val="0"/>
+        <w:rPr>
+          <w:rFonts w:ascii="ＭＳ 明朝" w:hAnsi="ＭＳ 明朝"/>
+          <w:szCs w:val="21"/>
+        </w:rPr>
+      </w:pPr>
+      <w:r>
+        <w:rPr>
+          <w:rFonts w:ascii="ＭＳ 明朝" w:hAnsi="ＭＳ 明朝"/>
+          <w:szCs w:val="21"/>
+        </w:rPr>
+        <w:t>(1) データの匿名化について</w:t>
+      </w:r>
+    </w:p>
+    <w:p>
+      <w:pPr>
+        <w:ind w:leftChars="101" w:left="212"/>
+        <w:outlineLvl w:val="0"/>
+        <w:rPr>
+          <w:rFonts w:ascii="ＭＳ 明朝" w:hAnsi="ＭＳ 明朝"/>
+          <w:szCs w:val="21"/>
+        </w:rPr>
+      </w:pPr>
+      <w:r>
+        <w:t>本研究では、参加者から各試行の正誤データ（理解確認、強調語同定等）、各試行の反応時間（</w:t>
+      </w:r>
+      <w:r>
+        <w:t>RT</w:t>
+      </w:r>
+      <w:r>
+        <w:t>）、主観質問（認知負荷尺度、話者意図評価、韻律伝達の主観評価）、インタラクションログ（再生・停止・シーク等の操作履歴）、参加者の基本情報（年齢、母語、聴覚状態の自己申告等）、終了アンケートの自由記述等のデータを取得します。また、謝礼の送付に必要な場合には、電子メールアドレス等の連絡先情報を取得することがあ</w:t>
+      </w:r>
+      <w:r>
+        <w:rPr>
+          <w:rFonts w:hint="eastAsia"/>
+        </w:rPr>
+        <w:t>る。</w:t>
+      </w:r>
+    </w:p>
+    <w:p>
+      <w:pPr>
+        <w:ind w:leftChars="101" w:left="212"/>
+        <w:outlineLvl w:val="0"/>
+        <w:rPr>
+          <w:rFonts w:ascii="ＭＳ 明朝" w:hAnsi="ＭＳ 明朝"/>
+          <w:szCs w:val="21"/>
+        </w:rPr>
+      </w:pPr>
+      <w:r>
+        <w:t>取得したデータには、氏名の代わりに研究用の識別番号を付与</w:t>
+      </w:r>
+      <w:r>
+        <w:rPr>
+          <w:rFonts w:hint="eastAsia"/>
+        </w:rPr>
+        <w:t>する</w:t>
+      </w:r>
+      <w:r>
+        <w:t>。回答内容や実験結果に関するデータと、氏名・連絡先等の個人を特定し得る情報は分けて管理</w:t>
+      </w:r>
+      <w:r>
+        <w:rPr>
+          <w:rFonts w:hint="eastAsia"/>
+        </w:rPr>
+        <w:t>する</w:t>
+      </w:r>
+      <w:r>
+        <w:t>。個人情報と研究データの対応表を作成し、研究データとは別に厳重に保管します。研究成果を論文、学会発表、報告書等で公表する際には、個人が特定される形でデータを公表すること</w:t>
+      </w:r>
+      <w:r>
+        <w:rPr>
+          <w:rFonts w:hint="eastAsia"/>
+        </w:rPr>
+        <w:t>を行わない。</w:t>
+      </w:r>
+    </w:p>
+    <w:p>
+      <w:pPr>
+        <w:ind w:leftChars="101" w:left="212"/>
+        <w:outlineLvl w:val="0"/>
+        <w:rPr>
+          <w:rFonts w:ascii="ＭＳ 明朝" w:hAnsi="ＭＳ 明朝"/>
+          <w:szCs w:val="21"/>
+        </w:rPr>
+      </w:pPr>
+      <w:r>
+        <w:t>取得したデータは、本研究の目的の分析のためにのみ使用</w:t>
+      </w:r>
+      <w:r>
+        <w:rPr>
+          <w:rFonts w:hint="eastAsia"/>
+        </w:rPr>
+        <w:t>する。</w:t>
+      </w:r>
+    </w:p>
+    <w:p>
+      <w:pPr>
+        <w:ind w:left="570"/>
+        <w:rPr>
+          <w:rFonts w:ascii="ＭＳ 明朝" w:hAnsi="ＭＳ 明朝"/>
+          <w:szCs w:val="21"/>
+        </w:rPr>
+      </w:pPr>
+    </w:p>
+    <w:p>
+      <w:pPr>
+        <w:ind w:leftChars="101" w:left="212"/>
+        <w:outlineLvl w:val="0"/>
+        <w:rPr>
+          <w:rFonts w:ascii="ＭＳ 明朝" w:hAnsi="ＭＳ 明朝"/>
+          <w:szCs w:val="21"/>
+        </w:rPr>
+      </w:pPr>
+      <w:r>
+        <w:rPr>
+          <w:rFonts w:ascii="ＭＳ 明朝" w:hAnsi="ＭＳ 明朝"/>
+          <w:szCs w:val="21"/>
+        </w:rPr>
+        <w:t xml:space="preserve"> (2) データの管理方法</w:t>
+      </w:r>
+    </w:p>
+    <w:p>
+      <w:pPr>
+        <w:ind w:left="570"/>
+        <w:rPr>
+          <w:rFonts w:ascii="ＭＳ 明朝" w:hAnsi="ＭＳ 明朝"/>
+          <w:szCs w:val="21"/>
+        </w:rPr>
+      </w:pPr>
+      <w:r>
+        <w:rPr>
+          <w:rFonts w:hint="eastAsia"/>
+        </w:rPr>
+        <w:t>研究データは研究室</w:t>
+      </w:r>
+      <w:r>
+        <w:rPr>
+          <w:rFonts w:hint="eastAsia"/>
+        </w:rPr>
+        <w:t>(3M211)</w:t>
+      </w:r>
+      <w:r>
+        <w:rPr>
+          <w:rFonts w:hint="eastAsia"/>
+        </w:rPr>
+        <w:t>にて管理されたノートパソコンにて善甫啓一が管理します。収集データは研究室管理のノートパソコン上で暗号化・パスワード保護により保存し、解析時はネットワークに接続しない状態で行う。紙媒体の同意書等は鍵付き棚で保管し、アクセスは</w:t>
+      </w:r>
+      <w:r>
+        <w:t>実施責任者</w:t>
+      </w:r>
+      <w:r>
+        <w:rPr>
+          <w:rFonts w:hint="eastAsia"/>
+        </w:rPr>
+        <w:t>と実施分担者</w:t>
+      </w:r>
+      <w:r>
+        <w:rPr>
+          <w:rFonts w:hint="eastAsia"/>
+        </w:rPr>
+        <w:t>に限定する。匿名化・識別子分離の手順を採用し、集計・解析時は匿名化済みデータを用いる。データは当該論文等の発表後</w:t>
+      </w:r>
+      <w:r>
+        <w:rPr>
+          <w:rFonts w:hint="eastAsia"/>
+        </w:rPr>
+        <w:t>10</w:t>
+      </w:r>
+      <w:r>
+        <w:rPr>
+          <w:rFonts w:hint="eastAsia"/>
+        </w:rPr>
+        <w:t>年間保管します。研究対象者からの削除申請があった場合は当該データを速やかに削除する。研究成果発表から</w:t>
+      </w:r>
+      <w:r>
+        <w:rPr>
+          <w:rFonts w:hint="eastAsia"/>
+        </w:rPr>
+        <w:t>10</w:t>
+      </w:r>
+      <w:r>
+        <w:rPr>
+          <w:rFonts w:hint="eastAsia"/>
+        </w:rPr>
+        <w:t>年経過後は保存媒体（</w:t>
+      </w:r>
+      <w:r>
+        <w:rPr>
+          <w:rFonts w:hint="eastAsia"/>
+        </w:rPr>
+        <w:t>SSD</w:t>
+      </w:r>
+      <w:r>
+        <w:rPr>
+          <w:rFonts w:hint="eastAsia"/>
+        </w:rPr>
+        <w:t>等）を初期化してデータ復元ができない状態にして廃棄し、紙媒体はシュレッダー処理後に破棄する。</w:t>
+      </w:r>
+    </w:p>
+    <w:p>
+      <w:pPr>
+        <w:ind w:left="570"/>
+        <w:rPr>
+          <w:rFonts w:ascii="ＭＳ 明朝" w:hAnsi="ＭＳ 明朝"/>
+          <w:szCs w:val="21"/>
+        </w:rPr>
+      </w:pPr>
+    </w:p>
+    <w:p>
+      <w:pPr>
+        <w:tabs>
+          <w:tab w:val="left" w:pos="851"/>
+        </w:tabs>
+        <w:ind w:firstLineChars="100" w:firstLine="210"/>
+        <w:outlineLvl w:val="0"/>
+        <w:rPr>
+          <w:rFonts w:ascii="ＭＳ 明朝" w:hAnsi="ＭＳ 明朝"/>
+          <w:szCs w:val="21"/>
+        </w:rPr>
+      </w:pPr>
+      <w:r>
+        <w:rPr>
+          <w:rFonts w:ascii="ＭＳ 明朝" w:hAnsi="ＭＳ 明朝"/>
+          <w:szCs w:val="21"/>
+        </w:rPr>
+        <w:t>(3</w:t>
+      </w:r>
+      <w:r>
+        <w:rPr>
+          <w:rFonts w:ascii="ＭＳ 明朝" w:hAnsi="ＭＳ 明朝" w:hint="eastAsia"/>
+          <w:szCs w:val="21"/>
+        </w:rPr>
+        <w:t>)</w:t>
+      </w:r>
+      <w:r>
+        <w:rPr>
+          <w:rFonts w:ascii="ＭＳ 明朝" w:hAnsi="ＭＳ 明朝"/>
+          <w:szCs w:val="21"/>
+        </w:rPr>
+        <w:t xml:space="preserve"> </w:t>
+      </w:r>
+      <w:r>
+        <w:rPr>
+          <w:rFonts w:ascii="ＭＳ 明朝" w:hAnsi="ＭＳ 明朝" w:hint="eastAsia"/>
+          <w:szCs w:val="21"/>
+        </w:rPr>
+        <w:t>研究参加の任意性</w:t>
+      </w:r>
+    </w:p>
+    <w:p>
+      <w:pPr>
+        <w:tabs>
+          <w:tab w:val="left" w:pos="851"/>
+        </w:tabs>
+        <w:ind w:leftChars="405" w:left="850"/>
+      </w:pPr>
+      <w:r>
+        <w:rPr>
+          <w:rFonts w:hint="eastAsia"/>
+        </w:rPr>
+        <w:t>研究への参加は任意であり、参加しないことで不利益が生じることは</w:t>
+      </w:r>
+      <w:r>
+        <w:rPr>
+          <w:rFonts w:hint="eastAsia"/>
+        </w:rPr>
+        <w:t>ない</w:t>
+      </w:r>
+      <w:r>
+        <w:rPr>
+          <w:rFonts w:hint="eastAsia"/>
+        </w:rPr>
+        <w:t>。同意書署名の日から</w:t>
+      </w:r>
+      <w:r>
+        <w:rPr>
+          <w:rFonts w:hint="eastAsia"/>
+        </w:rPr>
+        <w:t>90</w:t>
+      </w:r>
+      <w:r>
+        <w:rPr>
+          <w:rFonts w:hint="eastAsia"/>
+        </w:rPr>
+        <w:t>日後までであればデータ提供の同意を撤回でき、破棄の申し出があった場合は直ちに破棄</w:t>
+      </w:r>
+      <w:r>
+        <w:rPr>
+          <w:rFonts w:hint="eastAsia"/>
+        </w:rPr>
+        <w:t>する</w:t>
+      </w:r>
+      <w:r>
+        <w:rPr>
+          <w:rFonts w:hint="eastAsia"/>
+        </w:rPr>
+        <w:t>。実験の途中であっても不利益なく参加を取りやめることが</w:t>
+      </w:r>
+      <w:r>
+        <w:rPr>
+          <w:rFonts w:hint="eastAsia"/>
+        </w:rPr>
+        <w:t>できる</w:t>
+      </w:r>
+      <w:r>
+        <w:rPr>
+          <w:rFonts w:hint="eastAsia"/>
+        </w:rPr>
+        <w:t>。</w:t>
+      </w:r>
+    </w:p>
+    <w:p>
+      <w:pPr>
+        <w:widowControl/>
+        <w:jc w:val="left"/>
+        <w:rPr>
+          <w:rFonts w:ascii="ＭＳ 明朝" w:hAnsi="ＭＳ 明朝"/>
+          <w:szCs w:val="21"/>
         </w:rPr>
       </w:pPr>
     </w:p>
     <w:sectPr>
       <w:headerReference w:type="default" r:id="rId10"/>
+      <w:footerReference w:type="default" r:id="rId11"/>
       <w:pgSz w:w="11906" w:h="16838"/>
       <w:pgMar w:top="1304" w:right="1701" w:bottom="851" w:left="1701" w:header="851" w:footer="210" w:gutter="0"/>
       <w:cols w:space="425"/>
@@ -1968,7 +2658,7 @@
 </file>
 
 <file path=word/endnotes.xml><?xml version="1.0" encoding="utf-8"?>
-<w:endnotes xmlns:wpc="http://schemas.microsoft.com/office/word/2010/wordprocessingCanvas" xmlns:cx="http://schemas.microsoft.com/office/drawing/2014/chartex" xmlns:cx1="http://schemas.microsoft.com/office/drawing/2015/9/8/chartex" xmlns:cx2="http://schemas.microsoft.com/office/drawing/2015/10/21/chartex" xmlns:cx3="http://schemas.microsoft.com/office/drawing/2016/5/9/chartex" xmlns:cx4="http://schemas.microsoft.com/office/drawing/2016/5/10/chartex" xmlns:cx5="http://schemas.microsoft.com/office/drawing/2016/5/11/chartex" xmlns:cx6="http://schemas.microsoft.com/office/drawing/2016/5/12/chartex" xmlns:cx7="http://schemas.microsoft.com/office/drawing/2016/5/13/chartex" xmlns:cx8="http://schemas.microsoft.com/office/drawing/2016/5/14/chartex" xmlns:mc="http://schemas.openxmlformats.org/markup-compatibility/2006" xmlns:aink="http://schemas.microsoft.com/office/drawing/2016/ink" xmlns:am3d="http://schemas.microsoft.com/office/drawing/2017/model3d" xmlns:o="urn:schemas-microsoft-com:office:office" xmlns:oel="http://schemas.microsoft.com/office/2019/extlst" xmlns:r="http://schemas.openxmlformats.org/officeDocument/2006/relationships" xmlns:m="http://schemas.openxmlformats.org/officeDocument/2006/math" xmlns:v="urn:schemas-microsoft-com:vml" xmlns:wp14="http://schemas.microsoft.com/office/word/2010/wordprocessingDrawing" xmlns:wp="http://schemas.openxmlformats.org/drawingml/2006/wordprocessingDrawing" xmlns:w10="urn:schemas-microsoft-com:office:word" xmlns:w="http://schemas.openxmlformats.org/wordprocessingml/2006/main" xmlns:w14="http://schemas.microsoft.com/office/word/2010/wordml" xmlns:w15="http://schemas.microsoft.com/office/word/2012/wordml" xmlns:w16cex="http://schemas.microsoft.com/office/word/2018/wordml/cex" xmlns:w16cid="http://schemas.microsoft.com/office/word/2016/wordml/cid" xmlns:w16="http://schemas.microsoft.com/office/word/2018/wordml" xmlns:w16du="http://schemas.microsoft.com/office/word/2023/wordml/word16du" xmlns:w16sdtdh="http://schemas.microsoft.com/office/word/2020/wordml/sdtdatahash" xmlns:w16sdtfl="http://schemas.microsoft.com/office/word/2024/wordml/sdtformatlock" xmlns:w16se="http://schemas.microsoft.com/office/word/2015/wordml/symex" xmlns:wpg="http://schemas.microsoft.com/office/word/2010/wordprocessingGroup" xmlns:wpi="http://schemas.microsoft.com/office/word/2010/wordprocessingInk" xmlns:wne="http://schemas.microsoft.com/office/word/2006/wordml" xmlns:wps="http://schemas.microsoft.com/office/word/2010/wordprocessingShape" mc:Ignorable="w14 w15 w16se w16cid w16 w16cex w16sdtdh w16sdtfl w16du wp14">
+<w:endnotes xmlns:wpc="http://schemas.microsoft.com/office/word/2010/wordprocessingCanvas" xmlns:cx="http://schemas.microsoft.com/office/drawing/2014/chartex" xmlns:cx1="http://schemas.microsoft.com/office/drawing/2015/9/8/chartex" xmlns:cx2="http://schemas.microsoft.com/office/drawing/2015/10/21/chartex" xmlns:cx3="http://schemas.microsoft.com/office/drawing/2016/5/9/chartex" xmlns:cx4="http://schemas.microsoft.com/office/drawing/2016/5/10/chartex" xmlns:cx5="http://schemas.microsoft.com/office/drawing/2016/5/11/chartex" xmlns:cx6="http://schemas.microsoft.com/office/drawing/2016/5/12/chartex" xmlns:cx7="http://schemas.microsoft.com/office/drawing/2016/5/13/chartex" xmlns:cx8="http://schemas.microsoft.com/office/drawing/2016/5/14/chartex" xmlns:mc="http://schemas.openxmlformats.org/markup-compatibility/2006" xmlns:aink="http://schemas.microsoft.com/office/drawing/2016/ink" xmlns:am3d="http://schemas.microsoft.com/office/drawing/2017/model3d" xmlns:o="urn:schemas-microsoft-com:office:office" xmlns:oel="http://schemas.microsoft.com/office/2019/extlst" xmlns:r="http://schemas.openxmlformats.org/officeDocument/2006/relationships" xmlns:m="http://schemas.openxmlformats.org/officeDocument/2006/math" xmlns:v="urn:schemas-microsoft-com:vml" xmlns:wp14="http://schemas.microsoft.com/office/word/2010/wordprocessingDrawing" xmlns:wp="http://schemas.openxmlformats.org/drawingml/2006/wordprocessingDrawing" xmlns:w10="urn:schemas-microsoft-com:office:word" xmlns:w="http://schemas.openxmlformats.org/wordprocessingml/2006/main" xmlns:w14="http://schemas.microsoft.com/office/word/2010/wordml" xmlns:w15="http://schemas.microsoft.com/office/word/2012/wordml" xmlns:w16cei="http://schemas.microsoft.com/office/word/2026/wordml/cei" xmlns:w16cex="http://schemas.microsoft.com/office/word/2018/wordml/cex" xmlns:w16cid="http://schemas.microsoft.com/office/word/2016/wordml/cid" xmlns:w16="http://schemas.microsoft.com/office/word/2018/wordml" xmlns:w16du="http://schemas.microsoft.com/office/word/2023/wordml/word16du" xmlns:w16sdtdh="http://schemas.microsoft.com/office/word/2020/wordml/sdtdatahash" xmlns:w16sdtfl="http://schemas.microsoft.com/office/word/2024/wordml/sdtformatlock" xmlns:w16se="http://schemas.microsoft.com/office/word/2015/wordml/symex" xmlns:wpg="http://schemas.microsoft.com/office/word/2010/wordprocessingGroup" xmlns:wpi="http://schemas.microsoft.com/office/word/2010/wordprocessingInk" xmlns:wne="http://schemas.microsoft.com/office/word/2006/wordml" xmlns:wps="http://schemas.microsoft.com/office/word/2010/wordprocessingShape" mc:Ignorable="w14 w15 w16se w16cid w16 w16cex w16sdtdh w16sdtfl w16du wp14">
   <w:endnote w:type="separator" w:id="-1">
     <w:p>
       <w:r>
@@ -1986,8 +2676,18 @@
 </w:endnotes>
 </file>
 
+<file path=word/footer1.xml><?xml version="1.0" encoding="utf-8"?>
+<w:ftr xmlns:wpc="http://schemas.microsoft.com/office/word/2010/wordprocessingCanvas" xmlns:cx="http://schemas.microsoft.com/office/drawing/2014/chartex" xmlns:cx1="http://schemas.microsoft.com/office/drawing/2015/9/8/chartex" xmlns:cx2="http://schemas.microsoft.com/office/drawing/2015/10/21/chartex" xmlns:cx3="http://schemas.microsoft.com/office/drawing/2016/5/9/chartex" xmlns:cx4="http://schemas.microsoft.com/office/drawing/2016/5/10/chartex" xmlns:cx5="http://schemas.microsoft.com/office/drawing/2016/5/11/chartex" xmlns:cx6="http://schemas.microsoft.com/office/drawing/2016/5/12/chartex" xmlns:cx7="http://schemas.microsoft.com/office/drawing/2016/5/13/chartex" xmlns:cx8="http://schemas.microsoft.com/office/drawing/2016/5/14/chartex" xmlns:mc="http://schemas.openxmlformats.org/markup-compatibility/2006" xmlns:aink="http://schemas.microsoft.com/office/drawing/2016/ink" xmlns:am3d="http://schemas.microsoft.com/office/drawing/2017/model3d" xmlns:o="urn:schemas-microsoft-com:office:office" xmlns:oel="http://schemas.microsoft.com/office/2019/extlst" xmlns:r="http://schemas.openxmlformats.org/officeDocument/2006/relationships" xmlns:m="http://schemas.openxmlformats.org/officeDocument/2006/math" xmlns:v="urn:schemas-microsoft-com:vml" xmlns:wp14="http://schemas.microsoft.com/office/word/2010/wordprocessingDrawing" xmlns:wp="http://schemas.openxmlformats.org/drawingml/2006/wordprocessingDrawing" xmlns:w10="urn:schemas-microsoft-com:office:word" xmlns:w="http://schemas.openxmlformats.org/wordprocessingml/2006/main" xmlns:w14="http://schemas.microsoft.com/office/word/2010/wordml" xmlns:w15="http://schemas.microsoft.com/office/word/2012/wordml" xmlns:w16cei="http://schemas.microsoft.com/office/word/2026/wordml/cei" xmlns:w16cex="http://schemas.microsoft.com/office/word/2018/wordml/cex" xmlns:w16cid="http://schemas.microsoft.com/office/word/2016/wordml/cid" xmlns:w16="http://schemas.microsoft.com/office/word/2018/wordml" xmlns:w16du="http://schemas.microsoft.com/office/word/2023/wordml/word16du" xmlns:w16sdtdh="http://schemas.microsoft.com/office/word/2020/wordml/sdtdatahash" xmlns:w16sdtfl="http://schemas.microsoft.com/office/word/2024/wordml/sdtformatlock" xmlns:w16se="http://schemas.microsoft.com/office/word/2015/wordml/symex" xmlns:wpg="http://schemas.microsoft.com/office/word/2010/wordprocessingGroup" xmlns:wpi="http://schemas.microsoft.com/office/word/2010/wordprocessingInk" xmlns:wne="http://schemas.microsoft.com/office/word/2006/wordml" xmlns:wps="http://schemas.microsoft.com/office/word/2010/wordprocessingShape" mc:Ignorable="w14 w15 w16se w16cid w16 w16cex w16sdtdh w16sdtfl w16du wp14">
+  <w:p>
+    <w:pPr>
+      <w:pStyle w:val="a4"/>
+    </w:pPr>
+  </w:p>
+</w:ftr>
+</file>
+
 <file path=word/footnotes.xml><?xml version="1.0" encoding="utf-8"?>
-<w:footnotes xmlns:wpc="http://schemas.microsoft.com/office/word/2010/wordprocessingCanvas" xmlns:cx="http://schemas.microsoft.com/office/drawing/2014/chartex" xmlns:cx1="http://schemas.microsoft.com/office/drawing/2015/9/8/chartex" xmlns:cx2="http://schemas.microsoft.com/office/drawing/2015/10/21/chartex" xmlns:cx3="http://schemas.microsoft.com/office/drawing/2016/5/9/chartex" xmlns:cx4="http://schemas.microsoft.com/office/drawing/2016/5/10/chartex" xmlns:cx5="http://schemas.microsoft.com/office/drawing/2016/5/11/chartex" xmlns:cx6="http://schemas.microsoft.com/office/drawing/2016/5/12/chartex" xmlns:cx7="http://schemas.microsoft.com/office/drawing/2016/5/13/chartex" xmlns:cx8="http://schemas.microsoft.com/office/drawing/2016/5/14/chartex" xmlns:mc="http://schemas.openxmlformats.org/markup-compatibility/2006" xmlns:aink="http://schemas.microsoft.com/office/drawing/2016/ink" xmlns:am3d="http://schemas.microsoft.com/office/drawing/2017/model3d" xmlns:o="urn:schemas-microsoft-com:office:office" xmlns:oel="http://schemas.microsoft.com/office/2019/extlst" xmlns:r="http://schemas.openxmlformats.org/officeDocument/2006/relationships" xmlns:m="http://schemas.openxmlformats.org/officeDocument/2006/math" xmlns:v="urn:schemas-microsoft-com:vml" xmlns:wp14="http://schemas.microsoft.com/office/word/2010/wordprocessingDrawing" xmlns:wp="http://schemas.openxmlformats.org/drawingml/2006/wordprocessingDrawing" xmlns:w10="urn:schemas-microsoft-com:office:word" xmlns:w="http://schemas.openxmlformats.org/wordprocessingml/2006/main" xmlns:w14="http://schemas.microsoft.com/office/word/2010/wordml" xmlns:w15="http://schemas.microsoft.com/office/word/2012/wordml" xmlns:w16cex="http://schemas.microsoft.com/office/word/2018/wordml/cex" xmlns:w16cid="http://schemas.microsoft.com/office/word/2016/wordml/cid" xmlns:w16="http://schemas.microsoft.com/office/word/2018/wordml" xmlns:w16du="http://schemas.microsoft.com/office/word/2023/wordml/word16du" xmlns:w16sdtdh="http://schemas.microsoft.com/office/word/2020/wordml/sdtdatahash" xmlns:w16sdtfl="http://schemas.microsoft.com/office/word/2024/wordml/sdtformatlock" xmlns:w16se="http://schemas.microsoft.com/office/word/2015/wordml/symex" xmlns:wpg="http://schemas.microsoft.com/office/word/2010/wordprocessingGroup" xmlns:wpi="http://schemas.microsoft.com/office/word/2010/wordprocessingInk" xmlns:wne="http://schemas.microsoft.com/office/word/2006/wordml" xmlns:wps="http://schemas.microsoft.com/office/word/2010/wordprocessingShape" mc:Ignorable="w14 w15 w16se w16cid w16 w16cex w16sdtdh w16sdtfl w16du wp14">
+<w:footnotes xmlns:wpc="http://schemas.microsoft.com/office/word/2010/wordprocessingCanvas" xmlns:cx="http://schemas.microsoft.com/office/drawing/2014/chartex" xmlns:cx1="http://schemas.microsoft.com/office/drawing/2015/9/8/chartex" xmlns:cx2="http://schemas.microsoft.com/office/drawing/2015/10/21/chartex" xmlns:cx3="http://schemas.microsoft.com/office/drawing/2016/5/9/chartex" xmlns:cx4="http://schemas.microsoft.com/office/drawing/2016/5/10/chartex" xmlns:cx5="http://schemas.microsoft.com/office/drawing/2016/5/11/chartex" xmlns:cx6="http://schemas.microsoft.com/office/drawing/2016/5/12/chartex" xmlns:cx7="http://schemas.microsoft.com/office/drawing/2016/5/13/chartex" xmlns:cx8="http://schemas.microsoft.com/office/drawing/2016/5/14/chartex" xmlns:mc="http://schemas.openxmlformats.org/markup-compatibility/2006" xmlns:aink="http://schemas.microsoft.com/office/drawing/2016/ink" xmlns:am3d="http://schemas.microsoft.com/office/drawing/2017/model3d" xmlns:o="urn:schemas-microsoft-com:office:office" xmlns:oel="http://schemas.microsoft.com/office/2019/extlst" xmlns:r="http://schemas.openxmlformats.org/officeDocument/2006/relationships" xmlns:m="http://schemas.openxmlformats.org/officeDocument/2006/math" xmlns:v="urn:schemas-microsoft-com:vml" xmlns:wp14="http://schemas.microsoft.com/office/word/2010/wordprocessingDrawing" xmlns:wp="http://schemas.openxmlformats.org/drawingml/2006/wordprocessingDrawing" xmlns:w10="urn:schemas-microsoft-com:office:word" xmlns:w="http://schemas.openxmlformats.org/wordprocessingml/2006/main" xmlns:w14="http://schemas.microsoft.com/office/word/2010/wordml" xmlns:w15="http://schemas.microsoft.com/office/word/2012/wordml" xmlns:w16cei="http://schemas.microsoft.com/office/word/2026/wordml/cei" xmlns:w16cex="http://schemas.microsoft.com/office/word/2018/wordml/cex" xmlns:w16cid="http://schemas.microsoft.com/office/word/2016/wordml/cid" xmlns:w16="http://schemas.microsoft.com/office/word/2018/wordml" xmlns:w16du="http://schemas.microsoft.com/office/word/2023/wordml/word16du" xmlns:w16sdtdh="http://schemas.microsoft.com/office/word/2020/wordml/sdtdatahash" xmlns:w16sdtfl="http://schemas.microsoft.com/office/word/2024/wordml/sdtformatlock" xmlns:w16se="http://schemas.microsoft.com/office/word/2015/wordml/symex" xmlns:wpg="http://schemas.microsoft.com/office/word/2010/wordprocessingGroup" xmlns:wpi="http://schemas.microsoft.com/office/word/2010/wordprocessingInk" xmlns:wne="http://schemas.microsoft.com/office/word/2006/wordml" xmlns:wps="http://schemas.microsoft.com/office/word/2010/wordprocessingShape" mc:Ignorable="w14 w15 w16se w16cid w16 w16cex w16sdtdh w16sdtfl w16du wp14">
   <w:footnote w:type="separator" w:id="-1">
     <w:p>
       <w:r>
@@ -2006,7 +2706,7 @@
 </file>
 
 <file path=word/header1.xml><?xml version="1.0" encoding="utf-8"?>
-<w:hdr xmlns:wpc="http://schemas.microsoft.com/office/word/2010/wordprocessingCanvas" xmlns:cx="http://schemas.microsoft.com/office/drawing/2014/chartex" xmlns:cx1="http://schemas.microsoft.com/office/drawing/2015/9/8/chartex" xmlns:cx2="http://schemas.microsoft.com/office/drawing/2015/10/21/chartex" xmlns:cx3="http://schemas.microsoft.com/office/drawing/2016/5/9/chartex" xmlns:cx4="http://schemas.microsoft.com/office/drawing/2016/5/10/chartex" xmlns:cx5="http://schemas.microsoft.com/office/drawing/2016/5/11/chartex" xmlns:cx6="http://schemas.microsoft.com/office/drawing/2016/5/12/chartex" xmlns:cx7="http://schemas.microsoft.com/office/drawing/2016/5/13/chartex" xmlns:cx8="http://schemas.microsoft.com/office/drawing/2016/5/14/chartex" xmlns:mc="http://schemas.openxmlformats.org/markup-compatibility/2006" xmlns:aink="http://schemas.microsoft.com/office/drawing/2016/ink" xmlns:am3d="http://schemas.microsoft.com/office/drawing/2017/model3d" xmlns:o="urn:schemas-microsoft-com:office:office" xmlns:oel="http://schemas.microsoft.com/office/2019/extlst" xmlns:r="http://schemas.openxmlformats.org/officeDocument/2006/relationships" xmlns:m="http://schemas.openxmlformats.org/officeDocument/2006/math" xmlns:v="urn:schemas-microsoft-com:vml" xmlns:wp14="http://schemas.microsoft.com/office/word/2010/wordprocessingDrawing" xmlns:wp="http://schemas.openxmlformats.org/drawingml/2006/wordprocessingDrawing" xmlns:w10="urn:schemas-microsoft-com:office:word" xmlns:w="http://schemas.openxmlformats.org/wordprocessingml/2006/main" xmlns:w14="http://schemas.microsoft.com/office/word/2010/wordml" xmlns:w15="http://schemas.microsoft.com/office/word/2012/wordml" xmlns:w16cex="http://schemas.microsoft.com/office/word/2018/wordml/cex" xmlns:w16cid="http://schemas.microsoft.com/office/word/2016/wordml/cid" xmlns:w16="http://schemas.microsoft.com/office/word/2018/wordml" xmlns:w16du="http://schemas.microsoft.com/office/word/2023/wordml/word16du" xmlns:w16sdtdh="http://schemas.microsoft.com/office/word/2020/wordml/sdtdatahash" xmlns:w16sdtfl="http://schemas.microsoft.com/office/word/2024/wordml/sdtformatlock" xmlns:w16se="http://schemas.microsoft.com/office/word/2015/wordml/symex" xmlns:wpg="http://schemas.microsoft.com/office/word/2010/wordprocessingGroup" xmlns:wpi="http://schemas.microsoft.com/office/word/2010/wordprocessingInk" xmlns:wne="http://schemas.microsoft.com/office/word/2006/wordml" xmlns:wps="http://schemas.microsoft.com/office/word/2010/wordprocessingShape" mc:Ignorable="w14 w15 w16se w16cid w16 w16cex w16sdtdh w16sdtfl w16du wp14">
+<w:hdr xmlns:wpc="http://schemas.microsoft.com/office/word/2010/wordprocessingCanvas" xmlns:cx="http://schemas.microsoft.com/office/drawing/2014/chartex" xmlns:cx1="http://schemas.microsoft.com/office/drawing/2015/9/8/chartex" xmlns:cx2="http://schemas.microsoft.com/office/drawing/2015/10/21/chartex" xmlns:cx3="http://schemas.microsoft.com/office/drawing/2016/5/9/chartex" xmlns:cx4="http://schemas.microsoft.com/office/drawing/2016/5/10/chartex" xmlns:cx5="http://schemas.microsoft.com/office/drawing/2016/5/11/chartex" xmlns:cx6="http://schemas.microsoft.com/office/drawing/2016/5/12/chartex" xmlns:cx7="http://schemas.microsoft.com/office/drawing/2016/5/13/chartex" xmlns:cx8="http://schemas.microsoft.com/office/drawing/2016/5/14/chartex" xmlns:mc="http://schemas.openxmlformats.org/markup-compatibility/2006" xmlns:aink="http://schemas.microsoft.com/office/drawing/2016/ink" xmlns:am3d="http://schemas.microsoft.com/office/drawing/2017/model3d" xmlns:o="urn:schemas-microsoft-com:office:office" xmlns:oel="http://schemas.microsoft.com/office/2019/extlst" xmlns:r="http://schemas.openxmlformats.org/officeDocument/2006/relationships" xmlns:m="http://schemas.openxmlformats.org/officeDocument/2006/math" xmlns:v="urn:schemas-microsoft-com:vml" xmlns:wp14="http://schemas.microsoft.com/office/word/2010/wordprocessingDrawing" xmlns:wp="http://schemas.openxmlformats.org/drawingml/2006/wordprocessingDrawing" xmlns:w10="urn:schemas-microsoft-com:office:word" xmlns:w="http://schemas.openxmlformats.org/wordprocessingml/2006/main" xmlns:w14="http://schemas.microsoft.com/office/word/2010/wordml" xmlns:w15="http://schemas.microsoft.com/office/word/2012/wordml" xmlns:w16cei="http://schemas.microsoft.com/office/word/2026/wordml/cei" xmlns:w16cex="http://schemas.microsoft.com/office/word/2018/wordml/cex" xmlns:w16cid="http://schemas.microsoft.com/office/word/2016/wordml/cid" xmlns:w16="http://schemas.microsoft.com/office/word/2018/wordml" xmlns:w16du="http://schemas.microsoft.com/office/word/2023/wordml/word16du" xmlns:w16sdtdh="http://schemas.microsoft.com/office/word/2020/wordml/sdtdatahash" xmlns:w16sdtfl="http://schemas.microsoft.com/office/word/2024/wordml/sdtformatlock" xmlns:w16se="http://schemas.microsoft.com/office/word/2015/wordml/symex" xmlns:wpg="http://schemas.microsoft.com/office/word/2010/wordprocessingGroup" xmlns:wpi="http://schemas.microsoft.com/office/word/2010/wordprocessingInk" xmlns:wne="http://schemas.microsoft.com/office/word/2006/wordml" xmlns:wps="http://schemas.microsoft.com/office/word/2010/wordprocessingShape" mc:Ignorable="w14 w15 w16se w16cid w16 w16cex w16sdtdh w16sdtfl w16du wp14">
   <w:p>
     <w:pPr>
       <w:pStyle w:val="a3"/>
@@ -2021,97 +2721,8 @@
 </file>
 
 <file path=word/numbering.xml><?xml version="1.0" encoding="utf-8"?>
-<w:numbering xmlns:wpc="http://schemas.microsoft.com/office/word/2010/wordprocessingCanvas" xmlns:cx="http://schemas.microsoft.com/office/drawing/2014/chartex" xmlns:cx1="http://schemas.microsoft.com/office/drawing/2015/9/8/chartex" xmlns:cx2="http://schemas.microsoft.com/office/drawing/2015/10/21/chartex" xmlns:cx3="http://schemas.microsoft.com/office/drawing/2016/5/9/chartex" xmlns:cx4="http://schemas.microsoft.com/office/drawing/2016/5/10/chartex" xmlns:cx5="http://schemas.microsoft.com/office/drawing/2016/5/11/chartex" xmlns:cx6="http://schemas.microsoft.com/office/drawing/2016/5/12/chartex" xmlns:cx7="http://schemas.microsoft.com/office/drawing/2016/5/13/chartex" xmlns:cx8="http://schemas.microsoft.com/office/drawing/2016/5/14/chartex" xmlns:mc="http://schemas.openxmlformats.org/markup-compatibility/2006" xmlns:aink="http://schemas.microsoft.com/office/drawing/2016/ink" xmlns:am3d="http://schemas.microsoft.com/office/drawing/2017/model3d" xmlns:o="urn:schemas-microsoft-com:office:office" xmlns:oel="http://schemas.microsoft.com/office/2019/extlst" xmlns:r="http://schemas.openxmlformats.org/officeDocument/2006/relationships" xmlns:m="http://schemas.openxmlformats.org/officeDocument/2006/math" xmlns:v="urn:schemas-microsoft-com:vml" xmlns:wp14="http://schemas.microsoft.com/office/word/2010/wordprocessingDrawing" xmlns:wp="http://schemas.openxmlformats.org/drawingml/2006/wordprocessingDrawing" xmlns:w10="urn:schemas-microsoft-com:office:word" xmlns:w="http://schemas.openxmlformats.org/wordprocessingml/2006/main" xmlns:w14="http://schemas.microsoft.com/office/word/2010/wordml" xmlns:w15="http://schemas.microsoft.com/office/word/2012/wordml" xmlns:w16cex="http://schemas.microsoft.com/office/word/2018/wordml/cex" xmlns:w16cid="http://schemas.microsoft.com/office/word/2016/wordml/cid" xmlns:w16="http://schemas.microsoft.com/office/word/2018/wordml" xmlns:w16du="http://schemas.microsoft.com/office/word/2023/wordml/word16du" xmlns:w16sdtdh="http://schemas.microsoft.com/office/word/2020/wordml/sdtdatahash" xmlns:w16sdtfl="http://schemas.microsoft.com/office/word/2024/wordml/sdtformatlock" xmlns:w16se="http://schemas.microsoft.com/office/word/2015/wordml/symex" xmlns:wpg="http://schemas.microsoft.com/office/word/2010/wordprocessingGroup" xmlns:wpi="http://schemas.microsoft.com/office/word/2010/wordprocessingInk" xmlns:wne="http://schemas.microsoft.com/office/word/2006/wordml" xmlns:wps="http://schemas.microsoft.com/office/word/2010/wordprocessingShape" mc:Ignorable="w14 w15 w16se w16cid w16 w16cex w16sdtdh w16sdtfl w16du wp14">
+<w:numbering xmlns:wpc="http://schemas.microsoft.com/office/word/2010/wordprocessingCanvas" xmlns:cx="http://schemas.microsoft.com/office/drawing/2014/chartex" xmlns:cx1="http://schemas.microsoft.com/office/drawing/2015/9/8/chartex" xmlns:cx2="http://schemas.microsoft.com/office/drawing/2015/10/21/chartex" xmlns:cx3="http://schemas.microsoft.com/office/drawing/2016/5/9/chartex" xmlns:cx4="http://schemas.microsoft.com/office/drawing/2016/5/10/chartex" xmlns:cx5="http://schemas.microsoft.com/office/drawing/2016/5/11/chartex" xmlns:cx6="http://schemas.microsoft.com/office/drawing/2016/5/12/chartex" xmlns:cx7="http://schemas.microsoft.com/office/drawing/2016/5/13/chartex" xmlns:cx8="http://schemas.microsoft.com/office/drawing/2016/5/14/chartex" xmlns:mc="http://schemas.openxmlformats.org/markup-compatibility/2006" xmlns:aink="http://schemas.microsoft.com/office/drawing/2016/ink" xmlns:am3d="http://schemas.microsoft.com/office/drawing/2017/model3d" xmlns:o="urn:schemas-microsoft-com:office:office" xmlns:oel="http://schemas.microsoft.com/office/2019/extlst" xmlns:r="http://schemas.openxmlformats.org/officeDocument/2006/relationships" xmlns:m="http://schemas.openxmlformats.org/officeDocument/2006/math" xmlns:v="urn:schemas-microsoft-com:vml" xmlns:wp14="http://schemas.microsoft.com/office/word/2010/wordprocessingDrawing" xmlns:wp="http://schemas.openxmlformats.org/drawingml/2006/wordprocessingDrawing" xmlns:w10="urn:schemas-microsoft-com:office:word" xmlns:w="http://schemas.openxmlformats.org/wordprocessingml/2006/main" xmlns:w14="http://schemas.microsoft.com/office/word/2010/wordml" xmlns:w15="http://schemas.microsoft.com/office/word/2012/wordml" xmlns:w16cei="http://schemas.microsoft.com/office/word/2026/wordml/cei" xmlns:w16cex="http://schemas.microsoft.com/office/word/2018/wordml/cex" xmlns:w16cid="http://schemas.microsoft.com/office/word/2016/wordml/cid" xmlns:w16="http://schemas.microsoft.com/office/word/2018/wordml" xmlns:w16du="http://schemas.microsoft.com/office/word/2023/wordml/word16du" xmlns:w16sdtdh="http://schemas.microsoft.com/office/word/2020/wordml/sdtdatahash" xmlns:w16sdtfl="http://schemas.microsoft.com/office/word/2024/wordml/sdtformatlock" xmlns:w16se="http://schemas.microsoft.com/office/word/2015/wordml/symex" xmlns:wpg="http://schemas.microsoft.com/office/word/2010/wordprocessingGroup" xmlns:wpi="http://schemas.microsoft.com/office/word/2010/wordprocessingInk" xmlns:wne="http://schemas.microsoft.com/office/word/2006/wordml" xmlns:wps="http://schemas.microsoft.com/office/word/2010/wordprocessingShape" mc:Ignorable="w14 w15 w16se w16cid w16 w16cex w16sdtdh w16sdtfl w16du wp14">
   <w:abstractNum w:abstractNumId="0" w15:restartNumberingAfterBreak="0">
-    <w:nsid w:val="02965851"/>
-    <w:multiLevelType w:val="hybridMultilevel"/>
-    <w:tmpl w:val="7DC4526C"/>
-    <w:lvl w:ilvl="0" w:tplc="DDAA69E2">
-      <w:start w:val="1"/>
-      <w:numFmt w:val="decimal"/>
-      <w:lvlText w:val="%1."/>
-      <w:lvlJc w:val="left"/>
-      <w:pPr>
-        <w:ind w:left="360" w:hanging="360"/>
-      </w:pPr>
-      <w:rPr>
-        <w:rFonts w:hint="default"/>
-      </w:rPr>
-    </w:lvl>
-    <w:lvl w:ilvl="1" w:tplc="04090017" w:tentative="1">
-      <w:start w:val="1"/>
-      <w:numFmt w:val="aiueoFullWidth"/>
-      <w:lvlText w:val="(%2)"/>
-      <w:lvlJc w:val="left"/>
-      <w:pPr>
-        <w:ind w:left="880" w:hanging="440"/>
-      </w:pPr>
-    </w:lvl>
-    <w:lvl w:ilvl="2" w:tplc="04090011" w:tentative="1">
-      <w:start w:val="1"/>
-      <w:numFmt w:val="decimalEnclosedCircle"/>
-      <w:lvlText w:val="%3"/>
-      <w:lvlJc w:val="left"/>
-      <w:pPr>
-        <w:ind w:left="1320" w:hanging="440"/>
-      </w:pPr>
-    </w:lvl>
-    <w:lvl w:ilvl="3" w:tplc="0409000F" w:tentative="1">
-      <w:start w:val="1"/>
-      <w:numFmt w:val="decimal"/>
-      <w:lvlText w:val="%4."/>
-      <w:lvlJc w:val="left"/>
-      <w:pPr>
-        <w:ind w:left="1760" w:hanging="440"/>
-      </w:pPr>
-    </w:lvl>
-    <w:lvl w:ilvl="4" w:tplc="04090017" w:tentative="1">
-      <w:start w:val="1"/>
-      <w:numFmt w:val="aiueoFullWidth"/>
-      <w:lvlText w:val="(%5)"/>
-      <w:lvlJc w:val="left"/>
-      <w:pPr>
-        <w:ind w:left="2200" w:hanging="440"/>
-      </w:pPr>
-    </w:lvl>
-    <w:lvl w:ilvl="5" w:tplc="04090011" w:tentative="1">
-      <w:start w:val="1"/>
-      <w:numFmt w:val="decimalEnclosedCircle"/>
-      <w:lvlText w:val="%6"/>
-      <w:lvlJc w:val="left"/>
-      <w:pPr>
-        <w:ind w:left="2640" w:hanging="440"/>
-      </w:pPr>
-    </w:lvl>
-    <w:lvl w:ilvl="6" w:tplc="0409000F" w:tentative="1">
-      <w:start w:val="1"/>
-      <w:numFmt w:val="decimal"/>
-      <w:lvlText w:val="%7."/>
-      <w:lvlJc w:val="left"/>
-      <w:pPr>
-        <w:ind w:left="3080" w:hanging="440"/>
-      </w:pPr>
-    </w:lvl>
-    <w:lvl w:ilvl="7" w:tplc="04090017" w:tentative="1">
-      <w:start w:val="1"/>
-      <w:numFmt w:val="aiueoFullWidth"/>
-      <w:lvlText w:val="(%8)"/>
-      <w:lvlJc w:val="left"/>
-      <w:pPr>
-        <w:ind w:left="3520" w:hanging="440"/>
-      </w:pPr>
-    </w:lvl>
-    <w:lvl w:ilvl="8" w:tplc="04090011" w:tentative="1">
-      <w:start w:val="1"/>
-      <w:numFmt w:val="decimalEnclosedCircle"/>
-      <w:lvlText w:val="%9"/>
-      <w:lvlJc w:val="left"/>
-      <w:pPr>
-        <w:ind w:left="3960" w:hanging="440"/>
-      </w:pPr>
-    </w:lvl>
-  </w:abstractNum>
-  <w:abstractNum w:abstractNumId="1" w15:restartNumberingAfterBreak="0">
     <w:nsid w:val="08EB4EBB"/>
     <w:multiLevelType w:val="hybridMultilevel"/>
     <w:tmpl w:val="B99AF2E2"/>
@@ -2228,7 +2839,7 @@
       </w:pPr>
     </w:lvl>
   </w:abstractNum>
-  <w:abstractNum w:abstractNumId="2" w15:restartNumberingAfterBreak="0">
+  <w:abstractNum w:abstractNumId="1" w15:restartNumberingAfterBreak="0">
     <w:nsid w:val="0E185BE1"/>
     <w:multiLevelType w:val="hybridMultilevel"/>
     <w:tmpl w:val="8BBE8194"/>
@@ -2344,7 +2955,7 @@
       </w:pPr>
     </w:lvl>
   </w:abstractNum>
-  <w:abstractNum w:abstractNumId="3" w15:restartNumberingAfterBreak="0">
+  <w:abstractNum w:abstractNumId="2" w15:restartNumberingAfterBreak="0">
     <w:nsid w:val="14275CC2"/>
     <w:multiLevelType w:val="hybridMultilevel"/>
     <w:tmpl w:val="5E20796C"/>
@@ -2460,7 +3071,7 @@
       </w:pPr>
     </w:lvl>
   </w:abstractNum>
-  <w:abstractNum w:abstractNumId="4" w15:restartNumberingAfterBreak="0">
+  <w:abstractNum w:abstractNumId="3" w15:restartNumberingAfterBreak="0">
     <w:nsid w:val="18FE6EE6"/>
     <w:multiLevelType w:val="hybridMultilevel"/>
     <w:tmpl w:val="FCCA9F48"/>
@@ -2576,7 +3187,7 @@
       </w:pPr>
     </w:lvl>
   </w:abstractNum>
-  <w:abstractNum w:abstractNumId="5" w15:restartNumberingAfterBreak="0">
+  <w:abstractNum w:abstractNumId="4" w15:restartNumberingAfterBreak="0">
     <w:nsid w:val="20922C23"/>
     <w:multiLevelType w:val="hybridMultilevel"/>
     <w:tmpl w:val="C4C40CE2"/>
@@ -2692,7 +3303,7 @@
       </w:pPr>
     </w:lvl>
   </w:abstractNum>
-  <w:abstractNum w:abstractNumId="6" w15:restartNumberingAfterBreak="0">
+  <w:abstractNum w:abstractNumId="5" w15:restartNumberingAfterBreak="0">
     <w:nsid w:val="2322189A"/>
     <w:multiLevelType w:val="hybridMultilevel"/>
     <w:tmpl w:val="41C804AE"/>
@@ -2781,7 +3392,7 @@
       </w:pPr>
     </w:lvl>
   </w:abstractNum>
-  <w:abstractNum w:abstractNumId="7" w15:restartNumberingAfterBreak="0">
+  <w:abstractNum w:abstractNumId="6" w15:restartNumberingAfterBreak="0">
     <w:nsid w:val="26387535"/>
     <w:multiLevelType w:val="hybridMultilevel"/>
     <w:tmpl w:val="8B7207B0"/>
@@ -2897,7 +3508,7 @@
       </w:pPr>
     </w:lvl>
   </w:abstractNum>
-  <w:abstractNum w:abstractNumId="8" w15:restartNumberingAfterBreak="0">
+  <w:abstractNum w:abstractNumId="7" w15:restartNumberingAfterBreak="0">
     <w:nsid w:val="2B406C76"/>
     <w:multiLevelType w:val="hybridMultilevel"/>
     <w:tmpl w:val="41C804AE"/>
@@ -2986,7 +3597,7 @@
       </w:pPr>
     </w:lvl>
   </w:abstractNum>
-  <w:abstractNum w:abstractNumId="9" w15:restartNumberingAfterBreak="0">
+  <w:abstractNum w:abstractNumId="8" w15:restartNumberingAfterBreak="0">
     <w:nsid w:val="2C12739E"/>
     <w:multiLevelType w:val="hybridMultilevel"/>
     <w:tmpl w:val="B2E6BBFA"/>
@@ -3102,7 +3713,7 @@
       </w:pPr>
     </w:lvl>
   </w:abstractNum>
-  <w:abstractNum w:abstractNumId="10" w15:restartNumberingAfterBreak="0">
+  <w:abstractNum w:abstractNumId="9" w15:restartNumberingAfterBreak="0">
     <w:nsid w:val="36CD26C1"/>
     <w:multiLevelType w:val="multilevel"/>
     <w:tmpl w:val="B99AF2E2"/>
@@ -3219,7 +3830,7 @@
       </w:pPr>
     </w:lvl>
   </w:abstractNum>
-  <w:abstractNum w:abstractNumId="11" w15:restartNumberingAfterBreak="0">
+  <w:abstractNum w:abstractNumId="10" w15:restartNumberingAfterBreak="0">
     <w:nsid w:val="3A127EE1"/>
     <w:multiLevelType w:val="hybridMultilevel"/>
     <w:tmpl w:val="C0BEDC26"/>
@@ -3335,7 +3946,7 @@
       </w:pPr>
     </w:lvl>
   </w:abstractNum>
-  <w:abstractNum w:abstractNumId="12" w15:restartNumberingAfterBreak="0">
+  <w:abstractNum w:abstractNumId="11" w15:restartNumberingAfterBreak="0">
     <w:nsid w:val="3F48727D"/>
     <w:multiLevelType w:val="hybridMultilevel"/>
     <w:tmpl w:val="442E291C"/>
@@ -3475,7 +4086,7 @@
       </w:rPr>
     </w:lvl>
   </w:abstractNum>
-  <w:abstractNum w:abstractNumId="13" w15:restartNumberingAfterBreak="0">
+  <w:abstractNum w:abstractNumId="12" w15:restartNumberingAfterBreak="0">
     <w:nsid w:val="43F4339B"/>
     <w:multiLevelType w:val="hybridMultilevel"/>
     <w:tmpl w:val="46D6EAD0"/>
@@ -3591,7 +4202,7 @@
       </w:pPr>
     </w:lvl>
   </w:abstractNum>
-  <w:abstractNum w:abstractNumId="14" w15:restartNumberingAfterBreak="0">
+  <w:abstractNum w:abstractNumId="13" w15:restartNumberingAfterBreak="0">
     <w:nsid w:val="4CA33B81"/>
     <w:multiLevelType w:val="hybridMultilevel"/>
     <w:tmpl w:val="E3BC669E"/>
@@ -3707,7 +4318,7 @@
       </w:pPr>
     </w:lvl>
   </w:abstractNum>
-  <w:abstractNum w:abstractNumId="15" w15:restartNumberingAfterBreak="0">
+  <w:abstractNum w:abstractNumId="14" w15:restartNumberingAfterBreak="0">
     <w:nsid w:val="4F245A3E"/>
     <w:multiLevelType w:val="hybridMultilevel"/>
     <w:tmpl w:val="874E4CF8"/>
@@ -3796,7 +4407,7 @@
       </w:pPr>
     </w:lvl>
   </w:abstractNum>
-  <w:abstractNum w:abstractNumId="16" w15:restartNumberingAfterBreak="0">
+  <w:abstractNum w:abstractNumId="15" w15:restartNumberingAfterBreak="0">
     <w:nsid w:val="511E2115"/>
     <w:multiLevelType w:val="hybridMultilevel"/>
     <w:tmpl w:val="866EA5DE"/>
@@ -3912,7 +4523,7 @@
       </w:pPr>
     </w:lvl>
   </w:abstractNum>
-  <w:abstractNum w:abstractNumId="17" w15:restartNumberingAfterBreak="0">
+  <w:abstractNum w:abstractNumId="16" w15:restartNumberingAfterBreak="0">
     <w:nsid w:val="562F0914"/>
     <w:multiLevelType w:val="hybridMultilevel"/>
     <w:tmpl w:val="DFE28E66"/>
@@ -4028,7 +4639,7 @@
       </w:pPr>
     </w:lvl>
   </w:abstractNum>
-  <w:abstractNum w:abstractNumId="18" w15:restartNumberingAfterBreak="0">
+  <w:abstractNum w:abstractNumId="17" w15:restartNumberingAfterBreak="0">
     <w:nsid w:val="5EE0043D"/>
     <w:multiLevelType w:val="hybridMultilevel"/>
     <w:tmpl w:val="794CC502"/>
@@ -4117,7 +4728,7 @@
       </w:pPr>
     </w:lvl>
   </w:abstractNum>
-  <w:abstractNum w:abstractNumId="19" w15:restartNumberingAfterBreak="0">
+  <w:abstractNum w:abstractNumId="18" w15:restartNumberingAfterBreak="0">
     <w:nsid w:val="5F700612"/>
     <w:multiLevelType w:val="hybridMultilevel"/>
     <w:tmpl w:val="002AAF90"/>
@@ -4233,7 +4844,7 @@
       </w:pPr>
     </w:lvl>
   </w:abstractNum>
-  <w:abstractNum w:abstractNumId="20" w15:restartNumberingAfterBreak="0">
+  <w:abstractNum w:abstractNumId="19" w15:restartNumberingAfterBreak="0">
     <w:nsid w:val="62E66DF8"/>
     <w:multiLevelType w:val="hybridMultilevel"/>
     <w:tmpl w:val="7408B230"/>
@@ -4352,7 +4963,7 @@
       </w:pPr>
     </w:lvl>
   </w:abstractNum>
-  <w:abstractNum w:abstractNumId="21" w15:restartNumberingAfterBreak="0">
+  <w:abstractNum w:abstractNumId="20" w15:restartNumberingAfterBreak="0">
     <w:nsid w:val="64DF0ACD"/>
     <w:multiLevelType w:val="hybridMultilevel"/>
     <w:tmpl w:val="8BF471BC"/>
@@ -4468,93 +5079,7 @@
       </w:pPr>
     </w:lvl>
   </w:abstractNum>
-  <w:abstractNum w:abstractNumId="22" w15:restartNumberingAfterBreak="0">
-    <w:nsid w:val="687DE285"/>
-    <w:multiLevelType w:val="hybridMultilevel"/>
-    <w:tmpl w:val="5BEE244C"/>
-    <w:lvl w:ilvl="0" w:tplc="DDD0FC28">
-      <w:start w:val="1"/>
-      <w:numFmt w:val="decimal"/>
-      <w:lvlText w:val="%1."/>
-      <w:lvlJc w:val="left"/>
-      <w:pPr>
-        <w:ind w:left="420" w:hanging="420"/>
-      </w:pPr>
-    </w:lvl>
-    <w:lvl w:ilvl="1" w:tplc="2FFA0CBC">
-      <w:start w:val="1"/>
-      <w:numFmt w:val="lowerLetter"/>
-      <w:lvlText w:val="%2."/>
-      <w:lvlJc w:val="left"/>
-      <w:pPr>
-        <w:ind w:left="840" w:hanging="420"/>
-      </w:pPr>
-    </w:lvl>
-    <w:lvl w:ilvl="2" w:tplc="D1924CAE">
-      <w:start w:val="1"/>
-      <w:numFmt w:val="lowerRoman"/>
-      <w:lvlText w:val="%3."/>
-      <w:lvlJc w:val="right"/>
-      <w:pPr>
-        <w:ind w:left="1260" w:hanging="420"/>
-      </w:pPr>
-    </w:lvl>
-    <w:lvl w:ilvl="3" w:tplc="1FE29E72">
-      <w:start w:val="1"/>
-      <w:numFmt w:val="decimal"/>
-      <w:lvlText w:val="%4."/>
-      <w:lvlJc w:val="left"/>
-      <w:pPr>
-        <w:ind w:left="1680" w:hanging="420"/>
-      </w:pPr>
-    </w:lvl>
-    <w:lvl w:ilvl="4" w:tplc="18F48CE8">
-      <w:start w:val="1"/>
-      <w:numFmt w:val="lowerLetter"/>
-      <w:lvlText w:val="%5."/>
-      <w:lvlJc w:val="left"/>
-      <w:pPr>
-        <w:ind w:left="2100" w:hanging="420"/>
-      </w:pPr>
-    </w:lvl>
-    <w:lvl w:ilvl="5" w:tplc="226CF2F2">
-      <w:start w:val="1"/>
-      <w:numFmt w:val="lowerRoman"/>
-      <w:lvlText w:val="%6."/>
-      <w:lvlJc w:val="right"/>
-      <w:pPr>
-        <w:ind w:left="2520" w:hanging="420"/>
-      </w:pPr>
-    </w:lvl>
-    <w:lvl w:ilvl="6" w:tplc="AE00A76E">
-      <w:start w:val="1"/>
-      <w:numFmt w:val="decimal"/>
-      <w:lvlText w:val="%7."/>
-      <w:lvlJc w:val="left"/>
-      <w:pPr>
-        <w:ind w:left="2940" w:hanging="420"/>
-      </w:pPr>
-    </w:lvl>
-    <w:lvl w:ilvl="7" w:tplc="CE6809CE">
-      <w:start w:val="1"/>
-      <w:numFmt w:val="lowerLetter"/>
-      <w:lvlText w:val="%8."/>
-      <w:lvlJc w:val="left"/>
-      <w:pPr>
-        <w:ind w:left="3360" w:hanging="420"/>
-      </w:pPr>
-    </w:lvl>
-    <w:lvl w:ilvl="8" w:tplc="8C901C1E">
-      <w:start w:val="1"/>
-      <w:numFmt w:val="lowerRoman"/>
-      <w:lvlText w:val="%9."/>
-      <w:lvlJc w:val="right"/>
-      <w:pPr>
-        <w:ind w:left="3780" w:hanging="420"/>
-      </w:pPr>
-    </w:lvl>
-  </w:abstractNum>
-  <w:abstractNum w:abstractNumId="23" w15:restartNumberingAfterBreak="0">
+  <w:abstractNum w:abstractNumId="21" w15:restartNumberingAfterBreak="0">
     <w:nsid w:val="706C3E1C"/>
     <w:multiLevelType w:val="hybridMultilevel"/>
     <w:tmpl w:val="9B127126"/>
@@ -4670,74 +5195,71 @@
       </w:pPr>
     </w:lvl>
   </w:abstractNum>
-  <w:num w:numId="1" w16cid:durableId="1332444006">
-    <w:abstractNumId w:val="22"/>
+  <w:num w:numId="1" w16cid:durableId="51930872">
+    <w:abstractNumId w:val="19"/>
   </w:num>
-  <w:num w:numId="2" w16cid:durableId="51930872">
+  <w:num w:numId="2" w16cid:durableId="1553925237">
+    <w:abstractNumId w:val="15"/>
+  </w:num>
+  <w:num w:numId="3" w16cid:durableId="1086610434">
+    <w:abstractNumId w:val="6"/>
+  </w:num>
+  <w:num w:numId="4" w16cid:durableId="671879151">
+    <w:abstractNumId w:val="11"/>
+  </w:num>
+  <w:num w:numId="5" w16cid:durableId="350955022">
+    <w:abstractNumId w:val="18"/>
+  </w:num>
+  <w:num w:numId="6" w16cid:durableId="114906844">
+    <w:abstractNumId w:val="3"/>
+  </w:num>
+  <w:num w:numId="7" w16cid:durableId="1783838179">
+    <w:abstractNumId w:val="21"/>
+  </w:num>
+  <w:num w:numId="8" w16cid:durableId="1712027822">
+    <w:abstractNumId w:val="10"/>
+  </w:num>
+  <w:num w:numId="9" w16cid:durableId="1735934735">
+    <w:abstractNumId w:val="1"/>
+  </w:num>
+  <w:num w:numId="10" w16cid:durableId="1857159444">
+    <w:abstractNumId w:val="12"/>
+  </w:num>
+  <w:num w:numId="11" w16cid:durableId="1782334636">
+    <w:abstractNumId w:val="0"/>
+  </w:num>
+  <w:num w:numId="12" w16cid:durableId="2013333027">
+    <w:abstractNumId w:val="9"/>
+  </w:num>
+  <w:num w:numId="13" w16cid:durableId="831995027">
+    <w:abstractNumId w:val="4"/>
+  </w:num>
+  <w:num w:numId="14" w16cid:durableId="1754814401">
+    <w:abstractNumId w:val="13"/>
+  </w:num>
+  <w:num w:numId="15" w16cid:durableId="1078864733">
     <w:abstractNumId w:val="20"/>
   </w:num>
-  <w:num w:numId="3" w16cid:durableId="1553925237">
+  <w:num w:numId="16" w16cid:durableId="1458066947">
     <w:abstractNumId w:val="16"/>
   </w:num>
-  <w:num w:numId="4" w16cid:durableId="1086610434">
+  <w:num w:numId="17" w16cid:durableId="390539406">
+    <w:abstractNumId w:val="8"/>
+  </w:num>
+  <w:num w:numId="18" w16cid:durableId="612177284">
+    <w:abstractNumId w:val="2"/>
+  </w:num>
+  <w:num w:numId="19" w16cid:durableId="456683969">
+    <w:abstractNumId w:val="17"/>
+  </w:num>
+  <w:num w:numId="20" w16cid:durableId="637033771">
     <w:abstractNumId w:val="7"/>
   </w:num>
-  <w:num w:numId="5" w16cid:durableId="671879151">
-    <w:abstractNumId w:val="12"/>
-  </w:num>
-  <w:num w:numId="6" w16cid:durableId="350955022">
-    <w:abstractNumId w:val="19"/>
-  </w:num>
-  <w:num w:numId="7" w16cid:durableId="114906844">
-    <w:abstractNumId w:val="4"/>
-  </w:num>
-  <w:num w:numId="8" w16cid:durableId="1783838179">
-    <w:abstractNumId w:val="23"/>
-  </w:num>
-  <w:num w:numId="9" w16cid:durableId="1712027822">
-    <w:abstractNumId w:val="11"/>
-  </w:num>
-  <w:num w:numId="10" w16cid:durableId="1735934735">
-    <w:abstractNumId w:val="2"/>
-  </w:num>
-  <w:num w:numId="11" w16cid:durableId="1857159444">
-    <w:abstractNumId w:val="13"/>
-  </w:num>
-  <w:num w:numId="12" w16cid:durableId="1782334636">
-    <w:abstractNumId w:val="1"/>
-  </w:num>
-  <w:num w:numId="13" w16cid:durableId="2013333027">
-    <w:abstractNumId w:val="10"/>
-  </w:num>
-  <w:num w:numId="14" w16cid:durableId="831995027">
+  <w:num w:numId="21" w16cid:durableId="1202939113">
     <w:abstractNumId w:val="5"/>
   </w:num>
-  <w:num w:numId="15" w16cid:durableId="1754814401">
-    <w:abstractNumId w:val="14"/>
-  </w:num>
-  <w:num w:numId="16" w16cid:durableId="1078864733">
-    <w:abstractNumId w:val="21"/>
-  </w:num>
-  <w:num w:numId="17" w16cid:durableId="1458066947">
+  <w:num w:numId="22" w16cid:durableId="426193508">
     <w:abstractNumId w:val="17"/>
-  </w:num>
-  <w:num w:numId="18" w16cid:durableId="390539406">
-    <w:abstractNumId w:val="9"/>
-  </w:num>
-  <w:num w:numId="19" w16cid:durableId="612177284">
-    <w:abstractNumId w:val="3"/>
-  </w:num>
-  <w:num w:numId="20" w16cid:durableId="456683969">
-    <w:abstractNumId w:val="18"/>
-  </w:num>
-  <w:num w:numId="21" w16cid:durableId="637033771">
-    <w:abstractNumId w:val="8"/>
-  </w:num>
-  <w:num w:numId="22" w16cid:durableId="1202939113">
-    <w:abstractNumId w:val="6"/>
-  </w:num>
-  <w:num w:numId="23" w16cid:durableId="426193508">
-    <w:abstractNumId w:val="18"/>
     <w:lvlOverride w:ilvl="0">
       <w:startOverride w:val="1"/>
     </w:lvlOverride>
@@ -4766,11 +5288,8 @@
       <w:startOverride w:val="1"/>
     </w:lvlOverride>
   </w:num>
-  <w:num w:numId="24" w16cid:durableId="1962415599">
-    <w:abstractNumId w:val="15"/>
-  </w:num>
-  <w:num w:numId="25" w16cid:durableId="473834497">
-    <w:abstractNumId w:val="0"/>
+  <w:num w:numId="23" w16cid:durableId="1962415599">
+    <w:abstractNumId w:val="14"/>
   </w:num>
 </w:numbering>
 </file>
@@ -5356,17 +5875,6 @@
       <w:ind w:leftChars="400" w:left="840"/>
     </w:pPr>
   </w:style>
-  <w:style w:type="paragraph" w:styleId="Web">
-    <w:name w:val="Normal (Web)"/>
-    <w:basedOn w:val="a"/>
-    <w:semiHidden/>
-    <w:unhideWhenUsed/>
-    <w:rsid w:val="009C0C9B"/>
-    <w:rPr>
-      <w:rFonts w:ascii="Times New Roman" w:hAnsi="Times New Roman"/>
-      <w:sz w:val="24"/>
-    </w:rPr>
-  </w:style>
 </w:styles>
 </file>
 
@@ -5663,17 +6171,6 @@
 </file>
 
 <file path=customXml/item2.xml><?xml version="1.0" encoding="utf-8"?>
-<p:properties xmlns:p="http://schemas.microsoft.com/office/2006/metadata/properties" xmlns:xsi="http://www.w3.org/2001/XMLSchema-instance" xmlns:pc="http://schemas.microsoft.com/office/infopath/2007/PartnerControls">
-  <documentManagement>
-    <lcf76f155ced4ddcb4097134ff3c332f xmlns="cebf745d-e51e-41ef-a1f1-27fce0363cfd">
-      <Terms xmlns="http://schemas.microsoft.com/office/infopath/2007/PartnerControls"/>
-    </lcf76f155ced4ddcb4097134ff3c332f>
-    <TaxCatchAll xmlns="741f8599-2caa-4da6-a5b0-7d6ff7a9f30b" xsi:nil="true"/>
-  </documentManagement>
-</p:properties>
-</file>
-
-<file path=customXml/item3.xml><?xml version="1.0" encoding="utf-8"?>
 <ct:contentTypeSchema xmlns:ct="http://schemas.microsoft.com/office/2006/metadata/contentType" xmlns:ma="http://schemas.microsoft.com/office/2006/metadata/properties/metaAttributes" ct:_="" ma:_="" ma:contentTypeName="ドキュメント" ma:contentTypeID="0x0101008F946816FFA87146BE6EDC5DF7A85DF5" ma:contentTypeVersion="19" ma:contentTypeDescription="新しいドキュメントを作成します。" ma:contentTypeScope="" ma:versionID="c9f4c47ddb9a0204b51005df35382510">
   <xsd:schema xmlns:xsd="http://www.w3.org/2001/XMLSchema" xmlns:xs="http://www.w3.org/2001/XMLSchema" xmlns:p="http://schemas.microsoft.com/office/2006/metadata/properties" xmlns:ns2="cebf745d-e51e-41ef-a1f1-27fce0363cfd" xmlns:ns3="741f8599-2caa-4da6-a5b0-7d6ff7a9f30b" targetNamespace="http://schemas.microsoft.com/office/2006/metadata/properties" ma:root="true" ma:fieldsID="b5f38f4bcbf35a02bb1b2cc2046641ea" ns2:_="" ns3:_="">
     <xsd:import namespace="cebf745d-e51e-41ef-a1f1-27fce0363cfd"/>
@@ -5934,8 +6431,19 @@
 </ct:contentTypeSchema>
 </file>
 
+<file path=customXml/item3.xml><?xml version="1.0" encoding="utf-8"?>
+<p:properties xmlns:p="http://schemas.microsoft.com/office/2006/metadata/properties" xmlns:xsi="http://www.w3.org/2001/XMLSchema-instance" xmlns:pc="http://schemas.microsoft.com/office/infopath/2007/PartnerControls">
+  <documentManagement>
+    <lcf76f155ced4ddcb4097134ff3c332f xmlns="cebf745d-e51e-41ef-a1f1-27fce0363cfd">
+      <Terms xmlns="http://schemas.microsoft.com/office/infopath/2007/PartnerControls"/>
+    </lcf76f155ced4ddcb4097134ff3c332f>
+    <TaxCatchAll xmlns="741f8599-2caa-4da6-a5b0-7d6ff7a9f30b" xsi:nil="true"/>
+  </documentManagement>
+</p:properties>
+</file>
+
 <file path=customXml/itemProps1.xml><?xml version="1.0" encoding="utf-8"?>
-<ds:datastoreItem xmlns:ds="http://schemas.openxmlformats.org/officeDocument/2006/customXml" ds:itemID="{D752D5DC-5D7C-4C48-AE9C-6617EAAD374E}">
+<ds:datastoreItem xmlns:ds="http://schemas.openxmlformats.org/officeDocument/2006/customXml" ds:itemID="{577927F7-E172-4B80-863C-023D9EA91FBD}">
   <ds:schemaRefs>
     <ds:schemaRef ds:uri="http://schemas.microsoft.com/sharepoint/v3/contenttype/forms"/>
   </ds:schemaRefs>
@@ -5943,18 +6451,7 @@
 </file>
 
 <file path=customXml/itemProps2.xml><?xml version="1.0" encoding="utf-8"?>
-<ds:datastoreItem xmlns:ds="http://schemas.openxmlformats.org/officeDocument/2006/customXml" ds:itemID="{70DA7696-B5DE-41AB-9C99-4076B8CFA486}">
-  <ds:schemaRefs>
-    <ds:schemaRef ds:uri="http://schemas.microsoft.com/office/2006/metadata/properties"/>
-    <ds:schemaRef ds:uri="http://schemas.microsoft.com/office/infopath/2007/PartnerControls"/>
-    <ds:schemaRef ds:uri="cebf745d-e51e-41ef-a1f1-27fce0363cfd"/>
-    <ds:schemaRef ds:uri="741f8599-2caa-4da6-a5b0-7d6ff7a9f30b"/>
-  </ds:schemaRefs>
-</ds:datastoreItem>
-</file>
-
-<file path=customXml/itemProps3.xml><?xml version="1.0" encoding="utf-8"?>
-<ds:datastoreItem xmlns:ds="http://schemas.openxmlformats.org/officeDocument/2006/customXml" ds:itemID="{629EA61C-0441-49D2-9A7C-DD47EDBCD243}">
+<ds:datastoreItem xmlns:ds="http://schemas.openxmlformats.org/officeDocument/2006/customXml" ds:itemID="{1E549DD9-8C85-4EDE-B3DE-CF730A961758}">
   <ds:schemaRefs>
     <ds:schemaRef ds:uri="http://schemas.microsoft.com/office/2006/metadata/contentType"/>
     <ds:schemaRef ds:uri="http://schemas.microsoft.com/office/2006/metadata/properties/metaAttributes"/>
@@ -5970,4 +6467,15 @@
     <ds:schemaRef ds:uri="http://schemas.microsoft.com/internal/obd"/>
   </ds:schemaRefs>
 </ds:datastoreItem>
+</file>
+
+<file path=customXml/itemProps3.xml><?xml version="1.0" encoding="utf-8"?>
+<ds:datastoreItem xmlns:ds="http://schemas.openxmlformats.org/officeDocument/2006/customXml" ds:itemID="{548FC60E-EB05-4A4A-81F4-055A774B833A}">
+  <ds:schemaRefs>
+    <ds:schemaRef ds:uri="http://schemas.microsoft.com/office/2006/metadata/properties"/>
+    <ds:schemaRef ds:uri="http://schemas.microsoft.com/office/infopath/2007/PartnerControls"/>
+    <ds:schemaRef ds:uri="cebf745d-e51e-41ef-a1f1-27fce0363cfd"/>
+    <ds:schemaRef ds:uri="741f8599-2caa-4da6-a5b0-7d6ff7a9f30b"/>
+  </ds:schemaRefs>
+</ds:datastoreItem>
 </file>
</xml_diff>